<commit_message>
Update project files from Antigravity
</commit_message>
<xml_diff>
--- a/Site Prompts.docx
+++ b/Site Prompts.docx
@@ -1491,10 +1491,18 @@
         <w:t xml:space="preserve"> under the step “</w:t>
       </w:r>
       <w:r>
-        <w:t>Lock Movers &amp; Relocation Logistics</w:t>
-      </w:r>
-      <w:r>
-        <w:t>“, remove the underlining from the following text “</w:t>
+        <w:t xml:space="preserve">Lock Movers &amp; Relocation </w:t>
+      </w:r>
+      <w:proofErr w:type="gramStart"/>
+      <w:r>
+        <w:t>Logistics</w:t>
+      </w:r>
+      <w:r>
+        <w:t>“</w:t>
+      </w:r>
+      <w:proofErr w:type="gramEnd"/>
+      <w:r>
+        <w:t>, remove the underlining from the following text “</w:t>
       </w:r>
       <w:r>
         <w:t>Looking for more information or simply assistance in your visa applications? Bordr and Anchorless offer excellent resources, offering reliable guidance, practical advice, and up-to-date information to help you plan your move with confidence.</w:t>
@@ -1864,10 +1872,18 @@
         <w:t>” section is open, under the step “</w:t>
       </w:r>
       <w:r>
-        <w:t>Lock Movers &amp; Relocation Logistics</w:t>
-      </w:r>
-      <w:r>
-        <w:t>“, except for the text “</w:t>
+        <w:t xml:space="preserve">Lock Movers &amp; Relocation </w:t>
+      </w:r>
+      <w:proofErr w:type="gramStart"/>
+      <w:r>
+        <w:t>Logistics</w:t>
+      </w:r>
+      <w:r>
+        <w:t>“</w:t>
+      </w:r>
+      <w:proofErr w:type="gramEnd"/>
+      <w:r>
+        <w:t>, except for the text “</w:t>
       </w:r>
       <w:r>
         <w:t>Bordr</w:t>
@@ -2160,8 +2176,13 @@
         </w:numPr>
       </w:pPr>
       <w:r>
-        <w:t>Visas and residence permits</w:t>
-      </w:r>
+        <w:t xml:space="preserve">Visas and residence </w:t>
+      </w:r>
+      <w:proofErr w:type="gramStart"/>
+      <w:r>
+        <w:t>permits</w:t>
+      </w:r>
+      <w:proofErr w:type="gramEnd"/>
     </w:p>
     <w:p>
       <w:pPr>
@@ -2403,7 +2424,15 @@
     </w:p>
     <w:p>
       <w:r>
-        <w:t>Some links on the Website may be affiliate links.</w:t>
+        <w:t xml:space="preserve">Some links on the Website may be </w:t>
+      </w:r>
+      <w:proofErr w:type="gramStart"/>
+      <w:r>
+        <w:t>affiliate</w:t>
+      </w:r>
+      <w:proofErr w:type="gramEnd"/>
+      <w:r>
+        <w:t xml:space="preserve"> links.</w:t>
       </w:r>
     </w:p>
     <w:p>
@@ -3029,7 +3058,15 @@
     </w:p>
     <w:p>
       <w:r>
-        <w:t xml:space="preserve">Some links, advertisements, recommendations, or references on this Website may be affiliate links. This means that we may receive a commission or other compensation if </w:t>
+        <w:t xml:space="preserve">Some links, advertisements, recommendations, or references on this Website may be </w:t>
+      </w:r>
+      <w:proofErr w:type="gramStart"/>
+      <w:r>
+        <w:t>affiliate</w:t>
+      </w:r>
+      <w:proofErr w:type="gramEnd"/>
+      <w:r>
+        <w:t xml:space="preserve"> links. This means that we may receive a commission or other compensation if </w:t>
       </w:r>
       <w:r>
         <w:lastRenderedPageBreak/>
@@ -3541,7 +3578,15 @@
     </w:p>
     <w:p>
       <w:r>
-        <w:t xml:space="preserve">Some links on this Website may be affiliate links. If you click an affiliate link and subsequently purchase a product, sign up for a service, submit an application, or </w:t>
+        <w:t xml:space="preserve">Some links on this Website may be </w:t>
+      </w:r>
+      <w:proofErr w:type="gramStart"/>
+      <w:r>
+        <w:t>affiliate</w:t>
+      </w:r>
+      <w:proofErr w:type="gramEnd"/>
+      <w:r>
+        <w:t xml:space="preserve"> links. If you click an affiliate link and subsequently purchase a product, sign up for a service, submit an application, or </w:t>
       </w:r>
       <w:r>
         <w:lastRenderedPageBreak/>
@@ -4155,7 +4200,15 @@
     <w:p>
       <w:r>
         <w:lastRenderedPageBreak/>
-        <w:t xml:space="preserve">Ensure all secondary pages work with the browser's native back button and do not create a custom back button, and do not alter existing </w:t>
+        <w:t xml:space="preserve">Ensure all secondary </w:t>
+      </w:r>
+      <w:proofErr w:type="gramStart"/>
+      <w:r>
+        <w:t>pages</w:t>
+      </w:r>
+      <w:proofErr w:type="gramEnd"/>
+      <w:r>
+        <w:t xml:space="preserve"> work with the browser's native back button and do not create a custom back button, and do not alter existing </w:t>
       </w:r>
       <w:r>
         <w:t>“</w:t>
@@ -4415,136 +4468,248 @@
         <w:t>Update SEO by auditing what's already there. Do not rebuild or remove existing functionality, including page structure, affiliate links, existing FAQs, and disclaimers. Instead, audit first, then optimize titles, meta descriptions, headings, and content for search intent without adding new FAQ sections or overhauling internal links. Use measured keyword research focused on USA to Portugal search intents. Improve technical SEO where needed, and clearly measure results, while leaving the existing website structure intact.</w:t>
       </w:r>
     </w:p>
+    <w:p>
+      <w:r>
+        <w:t>On the primary page,</w:t>
+      </w:r>
+      <w:r>
+        <w:t xml:space="preserve"> </w:t>
+      </w:r>
+      <w:r>
+        <w:t>change the text “</w:t>
+      </w:r>
+      <w:r>
+        <w:t xml:space="preserve">Bypass the chaos of fifty tabs. Estimate your </w:t>
+      </w:r>
+      <w:r>
+        <w:t>Cost of living in Portugal for Americans</w:t>
+      </w:r>
+      <w:r>
+        <w:t xml:space="preserve">, </w:t>
+      </w:r>
+      <w:r>
+        <w:t>shipping, rentals, school costs, and healthcare in one transparent dashboard, and generate your custom D7/Digital Nomad visa roadmap.</w:t>
+      </w:r>
+      <w:r>
+        <w:t>” to “</w:t>
+      </w:r>
+      <w:r>
+        <w:t>“</w:t>
+      </w:r>
+      <w:r>
+        <w:t>Bypass the chaos of fifty tabs. Estimate your shipping, rentals, school costs, and healthcare in one transparent dashboard, and generate your custom D7/Digital Nomad visa roadmap</w:t>
+      </w:r>
+      <w:r>
+        <w:t xml:space="preserve">, providing you with a </w:t>
+      </w:r>
+      <w:r>
+        <w:t>complete guide</w:t>
+      </w:r>
+      <w:r>
+        <w:t xml:space="preserve"> </w:t>
+      </w:r>
+      <w:r>
+        <w:t>for m</w:t>
+      </w:r>
+      <w:r>
+        <w:t>oving from the USA</w:t>
+      </w:r>
+      <w:r>
+        <w:t xml:space="preserve"> </w:t>
+      </w:r>
+      <w:r>
+        <w:t>to Portugal</w:t>
+      </w:r>
+      <w:r>
+        <w:t>.</w:t>
+      </w:r>
+      <w:r>
+        <w:t>”</w:t>
+      </w:r>
+      <w:r>
+        <w:t>, t</w:t>
+      </w:r>
+      <w:r>
+        <w:t xml:space="preserve">hen </w:t>
+      </w:r>
+      <w:r>
+        <w:t>on the button “</w:t>
+      </w:r>
+      <w:r>
+        <w:t>Generate Family Relocation Roadmap</w:t>
+      </w:r>
+      <w:r>
+        <w:t xml:space="preserve">” add in brackets </w:t>
+      </w:r>
+      <w:r>
+        <w:t xml:space="preserve">on the button </w:t>
+      </w:r>
+      <w:r>
+        <w:t>underneath “(</w:t>
+      </w:r>
+      <w:r>
+        <w:t>How to move to Portugal from the US: step by step</w:t>
+      </w:r>
+      <w:r>
+        <w:t xml:space="preserve">)”. Make sure </w:t>
+      </w:r>
+      <w:r>
+        <w:t>the sentence</w:t>
+      </w:r>
+      <w:r>
+        <w:t xml:space="preserve"> is the same length as the text</w:t>
+      </w:r>
+      <w:r>
+        <w:t xml:space="preserve"> “</w:t>
+      </w:r>
+      <w:r>
+        <w:t>Generate Family Relocation Roadmap</w:t>
+      </w:r>
+      <w:r>
+        <w:t>” by reducing the font size accordingly.</w:t>
+      </w:r>
+    </w:p>
     <w:p/>
     <w:p/>
+    <w:p>
+      <w:pPr>
+        <w:pStyle w:val="Heading1"/>
+      </w:pPr>
+      <w:r>
+        <w:t>Private Expat Health Insurance</w:t>
+      </w:r>
+    </w:p>
+    <w:p>
+      <w:r>
+        <w:t xml:space="preserve">When calculating the </w:t>
+      </w:r>
+      <w:r>
+        <w:t xml:space="preserve">Private Expat Health Insurance </w:t>
+      </w:r>
+      <w:r>
+        <w:t xml:space="preserve">amount, display the average of the analysis </w:t>
+      </w:r>
+      <w:r>
+        <w:t xml:space="preserve">of </w:t>
+      </w:r>
+      <w:r>
+        <w:t xml:space="preserve">comprehensive internet research </w:t>
+      </w:r>
+      <w:r>
+        <w:t xml:space="preserve">you have conducted as though you are </w:t>
+      </w:r>
+      <w:r>
+        <w:t>a world-class Portuguese private health insurance consultant and market analyst</w:t>
+      </w:r>
+      <w:r>
+        <w:t xml:space="preserve"> </w:t>
+      </w:r>
+      <w:r>
+        <w:t xml:space="preserve">using live publicly available sources. Start with official insurer websites, then reputable </w:t>
+      </w:r>
+      <w:r>
+        <w:lastRenderedPageBreak/>
+        <w:t>brokers, comparison platforms, regulators, and trusted industry publications. Do not invent, estimate, or assume any details. For every data point, provide source name, page title, direct URL, access date, and publication date. Cross check pricing and coverage against multiple reputable sources, clearly showing conflicts if they exist. Research major insurers such as Medis, Multicare, Fidelidade, Allianz Portugal, Generali Tranquilidade, Lusitania Seguros, and others. For each plan, collect plan name, insurer, official website, monthly premium, annual premium, deductible, co-pay, age eligibility, waiting periods, exclusions, coverage limits, English support, claims process, mobile app availability, renewal terms, and customer or financial ratings. Provide pricing for individuals and families where available. Then produce a comparative analysis with tables, detail strengths and weaknesses, note policy differences, and rank insurers for best budget plans, best value (with explained weighting), best premium plans, and best plans for Americans moving to Portugal. Finally, deliver a professional report including executive summary, methodology, comparison tables, detailed insurer analyses, market insights, rankings, and a full bibliography with direct links. And verify all figures, remove duplicates, flag conflicts, and distinguish verified facts from analysis.</w:t>
+      </w:r>
+      <w:r>
+        <w:t xml:space="preserve"> Then make the </w:t>
+      </w:r>
+      <w:r>
+        <w:t>Private Expat Health Insurance</w:t>
+      </w:r>
+      <w:r>
+        <w:t xml:space="preserve"> heading a link to a new internet tab which contains a report of the analysis conducted.</w:t>
+      </w:r>
+    </w:p>
     <w:p/>
+    <w:p>
+      <w:r>
+        <w:t>In the “</w:t>
+      </w:r>
+      <w:r>
+        <w:t>Portuguese Private Expat Health Insurance</w:t>
+      </w:r>
+      <w:r>
+        <w:t xml:space="preserve">” page, for all text between the characters </w:t>
+      </w:r>
+      <w:r>
+        <w:t>**</w:t>
+      </w:r>
+      <w:r>
+        <w:t xml:space="preserve"> </w:t>
+      </w:r>
+      <w:r>
+        <w:t>**</w:t>
+      </w:r>
+      <w:r>
+        <w:t xml:space="preserve">, change the text to be bold and remove the </w:t>
+      </w:r>
+      <w:r>
+        <w:t>**</w:t>
+      </w:r>
+      <w:r>
+        <w:t xml:space="preserve"> </w:t>
+      </w:r>
+      <w:r>
+        <w:t>**</w:t>
+      </w:r>
+      <w:r>
+        <w:t xml:space="preserve"> characters.</w:t>
+      </w:r>
+    </w:p>
     <w:p/>
     <w:p>
-      <w:pPr>
-        <w:pStyle w:val="Heading1"/>
-      </w:pPr>
-      <w:r>
-        <w:t>Private Expat Health Insurance</w:t>
-      </w:r>
-    </w:p>
-    <w:p>
-      <w:r>
-        <w:t xml:space="preserve">When calculating the </w:t>
-      </w:r>
-      <w:r>
-        <w:t xml:space="preserve">Private Expat Health Insurance </w:t>
-      </w:r>
-      <w:r>
-        <w:t xml:space="preserve">amount, display the average of the analysis </w:t>
-      </w:r>
-      <w:r>
-        <w:t xml:space="preserve">of </w:t>
-      </w:r>
-      <w:r>
-        <w:t xml:space="preserve">comprehensive internet research </w:t>
-      </w:r>
-      <w:r>
-        <w:t xml:space="preserve">you have conducted as though you are </w:t>
-      </w:r>
-      <w:r>
-        <w:t>a world-class Portuguese private health insurance consultant and market analyst</w:t>
+      <w:r>
+        <w:t>In the page “</w:t>
+      </w:r>
+      <w:r>
+        <w:t>Portuguese Private Expat Health Insurance</w:t>
+      </w:r>
+      <w:r>
+        <w:t xml:space="preserve">”, </w:t>
+      </w:r>
+      <w:r>
+        <w:t>under the section “</w:t>
+      </w:r>
+      <w:r>
+        <w:t>Detailed Insurer Profiles</w:t>
+      </w:r>
+      <w:r>
+        <w:t>”, under the heading “</w:t>
+      </w:r>
+      <w:r>
+        <w:t>1. Médis</w:t>
+      </w:r>
+      <w:r>
+        <w:t>”</w:t>
       </w:r>
       <w:r>
         <w:t xml:space="preserve"> </w:t>
       </w:r>
       <w:r>
-        <w:t xml:space="preserve">using live publicly available sources. Start with official insurer websites, then reputable brokers, comparison platforms, regulators, and trusted industry publications. Do not invent, estimate, or assume any details. For every data point, provide source name, page title, direct URL, access date, and publication date. Cross check pricing and coverage against multiple reputable sources, clearly showing conflicts if they exist. Research major insurers such as Medis, Multicare, Fidelidade, Allianz Portugal, Generali Tranquilidade, Lusitania Seguros, and others. For each plan, collect plan name, insurer, official website, monthly premium, annual premium, deductible, co-pay, age eligibility, waiting periods, exclusions, coverage limits, English support, claims process, mobile </w:t>
-      </w:r>
-      <w:r>
-        <w:lastRenderedPageBreak/>
-        <w:t>app availability, renewal terms, and customer or financial ratings. Provide pricing for individuals and families where available. Then produce a comparative analysis with tables, detail strengths and weaknesses, note policy differences, and rank insurers for best budget plans, best value (with explained weighting), best premium plans, and best plans for Americans moving to Portugal. Finally, deliver a professional report including executive summary, methodology, comparison tables, detailed insurer analyses, market insights, rankings, and a full bibliography with direct links. And verify all figures, remove duplicates, flag conflicts, and distinguish verified facts from analysis.</w:t>
-      </w:r>
-      <w:r>
-        <w:t xml:space="preserve"> Then make the </w:t>
-      </w:r>
-      <w:r>
-        <w:t>Private Expat Health Insurance</w:t>
-      </w:r>
-      <w:r>
-        <w:t xml:space="preserve"> heading a link to a new internet tab which contains a report of the analysis conducted.</w:t>
-      </w:r>
-    </w:p>
-    <w:p/>
-    <w:p>
-      <w:r>
-        <w:t>In the “</w:t>
-      </w:r>
-      <w:r>
-        <w:t>Portuguese Private Expat Health Insurance</w:t>
-      </w:r>
-      <w:r>
-        <w:t xml:space="preserve">” page, for all text between the characters </w:t>
-      </w:r>
-      <w:r>
-        <w:t>**</w:t>
-      </w:r>
-      <w:r>
-        <w:t xml:space="preserve"> </w:t>
-      </w:r>
-      <w:r>
-        <w:t>**</w:t>
-      </w:r>
-      <w:r>
-        <w:t xml:space="preserve">, change the text to be bold and remove the </w:t>
-      </w:r>
-      <w:r>
-        <w:t>**</w:t>
-      </w:r>
-      <w:r>
-        <w:t xml:space="preserve"> </w:t>
-      </w:r>
-      <w:r>
-        <w:t>**</w:t>
-      </w:r>
-      <w:r>
-        <w:t xml:space="preserve"> characters.</w:t>
-      </w:r>
-    </w:p>
-    <w:p/>
-    <w:p>
-      <w:r>
-        <w:t>In the page “</w:t>
-      </w:r>
-      <w:r>
-        <w:t>Portuguese Private Expat Health Insurance</w:t>
-      </w:r>
-      <w:r>
-        <w:t xml:space="preserve">”, </w:t>
-      </w:r>
-      <w:r>
-        <w:t>under the section “</w:t>
-      </w:r>
-      <w:r>
-        <w:t>Detailed Insurer Profiles</w:t>
-      </w:r>
-      <w:r>
-        <w:t>”, under the heading “</w:t>
-      </w:r>
-      <w:r>
-        <w:t>1. Médis</w:t>
-      </w:r>
+        <w:t>after the text “</w:t>
+      </w:r>
+      <w:r>
+        <w:t>Médis (operated by the Ageas Group)</w:t>
+      </w:r>
+      <w:proofErr w:type="gramStart"/>
       <w:r>
         <w:t>”</w:t>
       </w:r>
       <w:r>
-        <w:t xml:space="preserve"> </w:t>
-      </w:r>
-      <w:r>
-        <w:t>after the text “</w:t>
-      </w:r>
-      <w:r>
-        <w:t>Médis (operated by the Ageas Group)</w:t>
-      </w:r>
-      <w:r>
-        <w:t>”</w:t>
-      </w:r>
-      <w:r>
-        <w:t xml:space="preserve"> ”, add the text “ (“ then add the link </w:t>
+        <w:t xml:space="preserve"> ”</w:t>
+      </w:r>
+      <w:proofErr w:type="gramEnd"/>
+      <w:r>
+        <w:t xml:space="preserve">, add the text </w:t>
+      </w:r>
+      <w:proofErr w:type="gramStart"/>
+      <w:r>
+        <w:t>“ (“ then</w:t>
+      </w:r>
+      <w:proofErr w:type="gramEnd"/>
+      <w:r>
+        <w:t xml:space="preserve"> add the link </w:t>
       </w:r>
       <w:hyperlink r:id="rId9" w:history="1">
         <w:r>
@@ -4555,7 +4720,11 @@
         </w:r>
       </w:hyperlink>
       <w:r>
-        <w:t xml:space="preserve"> and then add the text “)</w:t>
+        <w:t xml:space="preserve"> and then add the text “</w:t>
+      </w:r>
+      <w:proofErr w:type="gramStart"/>
+      <w:r>
+        <w:t>)</w:t>
       </w:r>
       <w:r>
         <w:t xml:space="preserve"> </w:t>
@@ -4563,6 +4732,7 @@
       <w:r>
         <w:t>”</w:t>
       </w:r>
+      <w:proofErr w:type="gramEnd"/>
       <w:r>
         <w:t>. Then</w:t>
       </w:r>
@@ -4570,13 +4740,21 @@
         <w:t xml:space="preserve"> </w:t>
       </w:r>
       <w:r>
-        <w:t>under the heading “</w:t>
+        <w:t xml:space="preserve">under the heading </w:t>
+      </w:r>
+      <w:proofErr w:type="gramStart"/>
+      <w:r>
+        <w:t>“</w:t>
       </w:r>
       <w:r>
         <w:t xml:space="preserve"> </w:t>
       </w:r>
       <w:r>
-        <w:t>2. Multicare (Fidelidade)</w:t>
+        <w:t>2</w:t>
+      </w:r>
+      <w:proofErr w:type="gramEnd"/>
+      <w:r>
+        <w:t>. Multicare (Fidelidade)</w:t>
       </w:r>
       <w:r>
         <w:t>”</w:t>
@@ -4594,19 +4772,43 @@
         <w:t xml:space="preserve"> </w:t>
       </w:r>
       <w:r>
-        <w:t xml:space="preserve">add the text “ (“ then add the link </w:t>
+        <w:t xml:space="preserve">add the text </w:t>
+      </w:r>
+      <w:proofErr w:type="gramStart"/>
+      <w:r>
+        <w:t>“ (“ then</w:t>
+      </w:r>
+      <w:proofErr w:type="gramEnd"/>
+      <w:r>
+        <w:t xml:space="preserve"> add the link </w:t>
       </w:r>
       <w:r>
         <w:t>https://www.fidelidade.pt/EN/fidelidade/Paginas/Homepage.aspx</w:t>
       </w:r>
       <w:r>
-        <w:t xml:space="preserve"> and then add the text “) ”. Then </w:t>
-      </w:r>
-      <w:r>
-        <w:t xml:space="preserve">under the heading “ </w:t>
-      </w:r>
-      <w:r>
-        <w:t>3. Allianz Portugal</w:t>
+        <w:t xml:space="preserve"> and then add the text “</w:t>
+      </w:r>
+      <w:proofErr w:type="gramStart"/>
+      <w:r>
+        <w:t>) ”</w:t>
+      </w:r>
+      <w:proofErr w:type="gramEnd"/>
+      <w:r>
+        <w:t xml:space="preserve">. Then </w:t>
+      </w:r>
+      <w:r>
+        <w:t xml:space="preserve">under the heading </w:t>
+      </w:r>
+      <w:proofErr w:type="gramStart"/>
+      <w:r>
+        <w:t xml:space="preserve">“ </w:t>
+      </w:r>
+      <w:r>
+        <w:t>3</w:t>
+      </w:r>
+      <w:proofErr w:type="gramEnd"/>
+      <w:r>
+        <w:t>. Allianz Portugal</w:t>
       </w:r>
       <w:r>
         <w:t xml:space="preserve">” </w:t>
@@ -4621,7 +4823,15 @@
         <w:t>offers high-value plans</w:t>
       </w:r>
       <w:r>
-        <w:t xml:space="preserve">” add the text “ (“ then add the link </w:t>
+        <w:t xml:space="preserve">” add the text </w:t>
+      </w:r>
+      <w:proofErr w:type="gramStart"/>
+      <w:r>
+        <w:t>“ (“ then</w:t>
+      </w:r>
+      <w:proofErr w:type="gramEnd"/>
+      <w:r>
+        <w:t xml:space="preserve"> add the link </w:t>
       </w:r>
       <w:hyperlink r:id="rId10" w:history="1">
         <w:r>
@@ -4635,15 +4845,96 @@
         <w:t xml:space="preserve"> </w:t>
       </w:r>
       <w:r>
-        <w:t>and then add the text “) ”</w:t>
-      </w:r>
+        <w:t>and then add the text “</w:t>
+      </w:r>
+      <w:proofErr w:type="gramStart"/>
+      <w:r>
+        <w:t>) ”</w:t>
+      </w:r>
+      <w:proofErr w:type="gramEnd"/>
       <w:r>
         <w:t>.</w:t>
       </w:r>
     </w:p>
     <w:p>
       <w:r>
-        <w:t xml:space="preserve"> the heading “1. Médis” after the text “Médis (operated by the Ageas Group)” ”, add the text “ (“ then add the link https://www.medis.pt/english/ and then add the text “) ”. Then under the heading “ 2. Multicare (Fidelidade)” after the text “brand of Fidelidade” add the text “ (“ then add the link https://www.fidelidade.pt/EN/fidelidade/Paginas/Homepage.aspx and then add the text “) ”. Then under the heading “ 3. Allianz Portugal” before the text “offers high-value plans” add the text “ (“ then add the link https://www.allianz.pt/ and then add the text “) ”.</w:t>
+        <w:t xml:space="preserve"> the heading “1. Médis” after the text “Médis (operated by the Ageas Group)</w:t>
+      </w:r>
+      <w:proofErr w:type="gramStart"/>
+      <w:r>
+        <w:t>” ”</w:t>
+      </w:r>
+      <w:proofErr w:type="gramEnd"/>
+      <w:r>
+        <w:t xml:space="preserve">, add the text </w:t>
+      </w:r>
+      <w:proofErr w:type="gramStart"/>
+      <w:r>
+        <w:t>“ (“ then</w:t>
+      </w:r>
+      <w:proofErr w:type="gramEnd"/>
+      <w:r>
+        <w:t xml:space="preserve"> add the link https://www.medis.pt/english/ and then add the text “</w:t>
+      </w:r>
+      <w:proofErr w:type="gramStart"/>
+      <w:r>
+        <w:t>) ”</w:t>
+      </w:r>
+      <w:proofErr w:type="gramEnd"/>
+      <w:r>
+        <w:t xml:space="preserve">. Then under the heading </w:t>
+      </w:r>
+      <w:proofErr w:type="gramStart"/>
+      <w:r>
+        <w:t>“ 2</w:t>
+      </w:r>
+      <w:proofErr w:type="gramEnd"/>
+      <w:r>
+        <w:t xml:space="preserve">. Multicare (Fidelidade)” after the text “brand of Fidelidade” add the text </w:t>
+      </w:r>
+      <w:proofErr w:type="gramStart"/>
+      <w:r>
+        <w:t>“ (“ then</w:t>
+      </w:r>
+      <w:proofErr w:type="gramEnd"/>
+      <w:r>
+        <w:t xml:space="preserve"> add the link https://www.fidelidade.pt/EN/fidelidade/Paginas/Homepage.aspx and then add the text “</w:t>
+      </w:r>
+      <w:proofErr w:type="gramStart"/>
+      <w:r>
+        <w:t>) ”</w:t>
+      </w:r>
+      <w:proofErr w:type="gramEnd"/>
+      <w:r>
+        <w:t xml:space="preserve">. Then under the heading </w:t>
+      </w:r>
+      <w:proofErr w:type="gramStart"/>
+      <w:r>
+        <w:t>“ 3</w:t>
+      </w:r>
+      <w:proofErr w:type="gramEnd"/>
+      <w:r>
+        <w:t xml:space="preserve">. Allianz Portugal” before the text “offers high-value </w:t>
+      </w:r>
+      <w:r>
+        <w:lastRenderedPageBreak/>
+        <w:t xml:space="preserve">plans” add the text </w:t>
+      </w:r>
+      <w:proofErr w:type="gramStart"/>
+      <w:r>
+        <w:t>“ (“ then</w:t>
+      </w:r>
+      <w:proofErr w:type="gramEnd"/>
+      <w:r>
+        <w:t xml:space="preserve"> add the link https://www.allianz.pt/ and then add the text “</w:t>
+      </w:r>
+      <w:proofErr w:type="gramStart"/>
+      <w:r>
+        <w:t>) ”</w:t>
+      </w:r>
+      <w:proofErr w:type="gramEnd"/>
+      <w:r>
+        <w:t>.</w:t>
       </w:r>
     </w:p>
     <w:p>
@@ -4750,7 +5041,6 @@
     </w:p>
     <w:p>
       <w:r>
-        <w:lastRenderedPageBreak/>
         <w:t>In the page “Portuguese Private Expat Health Insurance”, under the section “</w:t>
       </w:r>
       <w:r>
@@ -4830,11 +5120,16 @@
         <w:t>text “</w:t>
       </w:r>
       <w:r>
-        <w:t>Last Updated:</w:t>
+        <w:t>Last Updated</w:t>
+      </w:r>
+      <w:proofErr w:type="gramStart"/>
+      <w:r>
+        <w:t>:</w:t>
       </w:r>
       <w:r>
         <w:t xml:space="preserve"> ”</w:t>
       </w:r>
+      <w:proofErr w:type="gramEnd"/>
       <w:r>
         <w:t xml:space="preserve"> followed by the last date the page was verified and updated.</w:t>
       </w:r>
@@ -4848,10 +5143,18 @@
         <w:t>“</w:t>
       </w:r>
       <w:r>
-        <w:t>Last Updated:</w:t>
-      </w:r>
-      <w:r>
-        <w:t xml:space="preserve"> ” and date </w:t>
+        <w:t>Last Updated</w:t>
+      </w:r>
+      <w:proofErr w:type="gramStart"/>
+      <w:r>
+        <w:t>:</w:t>
+      </w:r>
+      <w:r>
+        <w:t xml:space="preserve"> ”</w:t>
+      </w:r>
+      <w:proofErr w:type="gramEnd"/>
+      <w:r>
+        <w:t xml:space="preserve"> and date </w:t>
       </w:r>
       <w:r>
         <w:t xml:space="preserve">text font color to the same as the font color </w:t>
@@ -5012,6 +5315,7 @@
           <w:b/>
           <w:bCs/>
         </w:rPr>
+        <w:lastRenderedPageBreak/>
         <w:t>Family (3-4)</w:t>
       </w:r>
       <w:r>
@@ -5067,7 +5371,15 @@
         <w:t xml:space="preserve"> add the text “Basic services </w:t>
       </w:r>
       <w:r>
-        <w:t>for “ then add the “</w:t>
+        <w:t xml:space="preserve">for </w:t>
+      </w:r>
+      <w:proofErr w:type="gramStart"/>
+      <w:r>
+        <w:t>“ then</w:t>
+      </w:r>
+      <w:proofErr w:type="gramEnd"/>
+      <w:r>
+        <w:t xml:space="preserve"> add the “</w:t>
       </w:r>
       <w:r>
         <w:t>3. Relocating Household Size</w:t>
@@ -5079,42 +5391,79 @@
         <w:t>.</w:t>
       </w:r>
     </w:p>
+    <w:p>
+      <w:r>
+        <w:t>On the “</w:t>
+      </w:r>
+      <w:r>
+        <w:t>Portugal Private Health Insurance Guide for US Expats &amp; Visa Applicants</w:t>
+      </w:r>
+      <w:r>
+        <w:t xml:space="preserve">” page, change the text </w:t>
+      </w:r>
+      <w:r>
+        <w:t>“</w:t>
+      </w:r>
+      <w:r>
+        <w:t>A comprehensive comparative market study and consulting analysis mapping the leading international expat health insurance providers for residents in Portugal.</w:t>
+      </w:r>
+      <w:r>
+        <w:t>” to “</w:t>
+      </w:r>
+      <w:r>
+        <w:t xml:space="preserve">A comprehensive comparative market study and consulting analysis mapping the leading international expat health insurance providers for </w:t>
+      </w:r>
+      <w:r>
+        <w:t>h</w:t>
+      </w:r>
+      <w:r>
+        <w:t xml:space="preserve">ealthcare in Portugal for </w:t>
+      </w:r>
+      <w:r>
+        <w:t>American residents</w:t>
+      </w:r>
+      <w:r>
+        <w:t>.</w:t>
+      </w:r>
+      <w:r>
+        <w:t>”</w:t>
+      </w:r>
+    </w:p>
     <w:p/>
-    <w:p/>
     <w:p>
       <w:pPr>
         <w:pStyle w:val="Heading1"/>
       </w:pPr>
       <w:r>
+        <w:t>Shipping &amp; Relocation</w:t>
+      </w:r>
+    </w:p>
+    <w:p>
+      <w:r>
+        <w:t xml:space="preserve">When calculating the </w:t>
+      </w:r>
+      <w:r>
+        <w:t>Shipping &amp; Relocation Setup</w:t>
+      </w:r>
+      <w:r>
+        <w:t>, c</w:t>
+      </w:r>
+      <w:r>
+        <w:t>reate a comprehensive relocation guide that includes current, accurate, and well-sourced information. Please cover the complete process of moving household belongings from the US to Portugal. The five leading international shipping and relocation companies that specialize in US to Portugal moves. For each company, provide services offered, areas served, customer ratings, advantages, disadvantages, and contact info. Shipping cost estimates for a 1-bedroom apartment, a 2 to 3-bedroom home, full 20-foot container, full 40-foot container, and less than container load shipments. Compare sea freight versus air freight, including typical transit times, costs, and when each option is recommended. Explain marine cargo insurance coverage types, typical cost percentage, common exclusions, and whether it's recommended. Describe customs requirements for importing household goods into Portugal, required documentation, duty-free eligibility, restricted or prohibited items, and any taxes or import duties that may apply. Now, list additional relocation expenses. Packing services, storage, customs broker fees, port charges, delivery charges, and visa-related expenses. Give practical tips for reducing costs and avoiding common mistakes, and include a comparison table showing shipping company, services, estimated cost, transit time, insurance options, customer ratings, and website. And, include links to official Portuguese government resources covering customs and importing household goods.</w:t>
+      </w:r>
+      <w:r>
+        <w:t xml:space="preserve"> Then make the </w:t>
+      </w:r>
+      <w:r>
+        <w:t>Shipping &amp; Relocation Setup</w:t>
+      </w:r>
+      <w:r>
+        <w:t xml:space="preserve"> heading a link to a new internet tab which contains a report of the analysis conducted.</w:t>
+      </w:r>
+    </w:p>
+    <w:p>
+      <w:r>
         <w:lastRenderedPageBreak/>
-        <w:t>Shipping &amp; Relocation</w:t>
-      </w:r>
-    </w:p>
-    <w:p>
-      <w:r>
-        <w:t xml:space="preserve">When calculating the </w:t>
-      </w:r>
-      <w:r>
-        <w:t>Shipping &amp; Relocation Setup</w:t>
-      </w:r>
-      <w:r>
-        <w:t>, c</w:t>
-      </w:r>
-      <w:r>
-        <w:t>reate a comprehensive relocation guide that includes current, accurate, and well-sourced information. Please cover the complete process of moving household belongings from the US to Portugal. The five leading international shipping and relocation companies that specialize in US to Portugal moves. For each company, provide services offered, areas served, customer ratings, advantages, disadvantages, and contact info. Shipping cost estimates for a 1-bedroom apartment, a 2 to 3-bedroom home, full 20-foot container, full 40-foot container, and less than container load shipments. Compare sea freight versus air freight, including typical transit times, costs, and when each option is recommended. Explain marine cargo insurance coverage types, typical cost percentage, common exclusions, and whether it's recommended. Describe customs requirements for importing household goods into Portugal, required documentation, duty-free eligibility, restricted or prohibited items, and any taxes or import duties that may apply. Now, list additional relocation expenses. Packing services, storage, customs broker fees, port charges, delivery charges, and visa-related expenses. Give practical tips for reducing costs and avoiding common mistakes, and include a comparison table showing shipping company, services, estimated cost, transit time, insurance options, customer ratings, and website. And, include links to official Portuguese government resources covering customs and importing household goods.</w:t>
-      </w:r>
-      <w:r>
-        <w:t xml:space="preserve"> Then make the </w:t>
-      </w:r>
-      <w:r>
-        <w:t>Shipping &amp; Relocation Setup</w:t>
-      </w:r>
-      <w:r>
-        <w:t xml:space="preserve"> heading a link to a new internet tab which contains a report of the analysis conducted.</w:t>
-      </w:r>
-    </w:p>
-    <w:p>
-      <w:r>
         <w:t>Change the wording “</w:t>
       </w:r>
       <w:r>
@@ -5430,6 +5779,7 @@
           <w:b/>
           <w:bCs/>
         </w:rPr>
+        <w:lastRenderedPageBreak/>
         <w:t>International Van Lines (IVL)</w:t>
       </w:r>
       <w:r>
@@ -5735,6 +6085,7 @@
     <w:p/>
     <w:p>
       <w:r>
+        <w:lastRenderedPageBreak/>
         <w:t>In the “</w:t>
       </w:r>
       <w:r>
@@ -5884,7 +6235,6 @@
           <w:b/>
           <w:bCs/>
         </w:rPr>
-        <w:lastRenderedPageBreak/>
         <w:t>T1/T2</w:t>
       </w:r>
     </w:p>
@@ -6012,11 +6362,16 @@
         <w:t>US to Portugal Shipping &amp; Relocation Guide</w:t>
       </w:r>
       <w:r>
-        <w:t xml:space="preserve">” page under the section </w:t>
+        <w:t xml:space="preserve">” page under the </w:t>
+      </w:r>
+      <w:proofErr w:type="gramStart"/>
+      <w:r>
+        <w:t xml:space="preserve">section </w:t>
       </w:r>
       <w:r>
         <w:t>.</w:t>
       </w:r>
+      <w:proofErr w:type="gramEnd"/>
       <w:r>
         <w:t xml:space="preserve"> </w:t>
       </w:r>
@@ -6068,6 +6423,7 @@
     </w:p>
     <w:p>
       <w:r>
+        <w:lastRenderedPageBreak/>
         <w:t>For example:</w:t>
       </w:r>
     </w:p>
@@ -6134,8 +6490,17 @@
           <w:b/>
           <w:bCs/>
         </w:rPr>
-        <w:t>$X,XXX</w:t>
-      </w:r>
+        <w:t>$</w:t>
+      </w:r>
+      <w:proofErr w:type="gramStart"/>
+      <w:r>
+        <w:rPr>
+          <w:b/>
+          <w:bCs/>
+        </w:rPr>
+        <w:t>X,XXX</w:t>
+      </w:r>
+      <w:proofErr w:type="gramEnd"/>
     </w:p>
     <w:p>
       <w:r>
@@ -6183,7 +6548,6 @@
           <w:b/>
           <w:bCs/>
         </w:rPr>
-        <w:lastRenderedPageBreak/>
         <w:t>$8,000</w:t>
       </w:r>
     </w:p>
@@ -6292,6 +6656,7 @@
     </w:p>
     <w:p>
       <w:r>
+        <w:lastRenderedPageBreak/>
         <w:t>Do not average the costs of different family sizes.</w:t>
       </w:r>
     </w:p>
@@ -6371,765 +6736,831 @@
     <w:p/>
     <w:p>
       <w:r>
+        <w:t>In the “</w:t>
+      </w:r>
+      <w:r>
+        <w:t>US to Portugal Shipping &amp; Relocation Guide</w:t>
+      </w:r>
+      <w:r>
+        <w:t>” page, under the table in the section “</w:t>
+      </w:r>
+      <w:r>
+        <w:t>Cost Estimates &amp; Freight Comparisons</w:t>
+      </w:r>
+      <w:r>
+        <w:t>” under the heading “</w:t>
+      </w:r>
+      <w:r>
+        <w:t>1. Estimated Shipping Costs by Volume</w:t>
+      </w:r>
+      <w:r>
+        <w:t>” add the following text “</w:t>
+      </w:r>
+      <w:r>
+        <w:rPr>
+          <w:i/>
+          <w:iCs/>
+        </w:rPr>
+        <w:t>These are estimated averages</w:t>
+      </w:r>
+      <w:r>
+        <w:rPr>
+          <w:i/>
+          <w:iCs/>
+        </w:rPr>
+        <w:t xml:space="preserve"> based on the figures in the table above. Actual international moving costs will vary and should be confirmed with a professional moving company.</w:t>
+      </w:r>
+      <w:r>
+        <w:rPr>
+          <w:i/>
+          <w:iCs/>
+        </w:rPr>
+        <w:t>”</w:t>
+      </w:r>
+    </w:p>
+    <w:p/>
+    <w:p>
+      <w:r>
+        <w:t>In the “</w:t>
+      </w:r>
+      <w:r>
+        <w:t>US to Portugal Shipping &amp; Relocation Guide</w:t>
+      </w:r>
+      <w:r>
+        <w:t>” page, under the table in the section “</w:t>
+      </w:r>
+      <w:r>
+        <w:t>Cost Estimates &amp; Freight Comparisons</w:t>
+      </w:r>
+      <w:r>
+        <w:t>” under the heading “</w:t>
+      </w:r>
+      <w:r>
+        <w:t>1. Estimated Shipping Costs by Volume</w:t>
+      </w:r>
+      <w:r>
+        <w:t>” change the text “</w:t>
+      </w:r>
+      <w:r>
+        <w:t>These are estimated averages based on the figures in the table above. Actual international moving costs will vary and should be confirmed with a professional moving company.” To</w:t>
+      </w:r>
+      <w:r>
+        <w:t xml:space="preserve"> “Important: </w:t>
+      </w:r>
+      <w:r>
+        <w:t>These are estimated averages based on the figures in the table above. Actual international moving costs will vary and should be confirmed with a professional moving company.”</w:t>
+      </w:r>
+      <w:r>
+        <w:t xml:space="preserve"> and then change the text “Important:” to be bold.</w:t>
+      </w:r>
+    </w:p>
+    <w:p/>
+    <w:p>
+      <w:r>
+        <w:t>In the “</w:t>
+      </w:r>
+      <w:r>
+        <w:t>US to Portugal Shipping &amp; Relocation Guide</w:t>
+      </w:r>
+      <w:r>
+        <w:t>” page, under the table in the section “</w:t>
+      </w:r>
+      <w:r>
+        <w:t>Cost Estimates &amp; Freight Comparisons</w:t>
+      </w:r>
+      <w:r>
+        <w:t>” under the heading “</w:t>
+      </w:r>
+      <w:r>
+        <w:t>1. Estimated Shipping Costs by Volume</w:t>
+      </w:r>
+      <w:r>
+        <w:t>” change the text “</w:t>
+      </w:r>
+      <w:r>
+        <w:t>These are estimated averages based on the figures in the table above. Actual international moving costs will vary and should be confirmed with a professional moving company.” To</w:t>
+      </w:r>
+      <w:r>
+        <w:t xml:space="preserve"> “</w:t>
+      </w:r>
+      <w:r>
+        <w:t xml:space="preserve">These </w:t>
+      </w:r>
+      <w:r>
+        <w:t>costs are</w:t>
+      </w:r>
+      <w:r>
+        <w:t xml:space="preserve"> estimated averages. Actual </w:t>
+      </w:r>
+      <w:r>
+        <w:lastRenderedPageBreak/>
+        <w:t>international moving costs will vary and should be confirmed with a professional moving company.”</w:t>
+      </w:r>
+    </w:p>
+    <w:p/>
+    <w:p>
+      <w:pPr>
+        <w:pStyle w:val="Heading1"/>
+      </w:pPr>
+      <w:r>
+        <w:t>Apartments</w:t>
+      </w:r>
+    </w:p>
+    <w:p>
+      <w:r>
+        <w:t xml:space="preserve">When calculating the </w:t>
+      </w:r>
+      <w:r>
+        <w:t>“</w:t>
+      </w:r>
+      <w:r>
+        <w:t>Estimated Target Monthly Rent</w:t>
+      </w:r>
+      <w:r>
+        <w:t>”</w:t>
+      </w:r>
+      <w:r>
+        <w:t>, create a</w:t>
+      </w:r>
+      <w:r>
+        <w:t>n</w:t>
+      </w:r>
+      <w:r>
+        <w:t xml:space="preserve"> </w:t>
+      </w:r>
+      <w:r>
+        <w:t>e</w:t>
+      </w:r>
+      <w:r>
+        <w:t>stimated Target Monthly Rent</w:t>
+      </w:r>
+      <w:r>
+        <w:t xml:space="preserve">al </w:t>
+      </w:r>
+      <w:r>
+        <w:t xml:space="preserve">page </w:t>
+      </w:r>
+      <w:r>
+        <w:t>estimat</w:t>
+      </w:r>
+      <w:r>
+        <w:t>ing</w:t>
+      </w:r>
+      <w:r>
+        <w:t xml:space="preserve"> monthly rental prices in Portugal for Lisbon, Porto (North), and the Algarve Coast. Include property types T1/T2</w:t>
+      </w:r>
+      <w:r>
+        <w:t xml:space="preserve"> </w:t>
+      </w:r>
+      <w:r>
+        <w:t xml:space="preserve">apartments (one to two bedrooms), T3 family apartments (three bedrooms), and detached villas. Show low, medium, and high estimated monthly rents in </w:t>
+      </w:r>
+      <w:r>
+        <w:t>dollars</w:t>
+      </w:r>
+      <w:r>
+        <w:t>, presented in a clean comparison table. Note that the figures are estimates and can vary by micro-location, property condition, size, amenities, and seasonality. Allow easy updating of rental data via a JSON file or database, not hard-coded. Design the code to be modular, documented, and easy to maintain. Use a modern tech stack (e.g., HTML, CSS, JavaScript or React). Include a last updated date. Optionally support filters like furnished or unfurnished, new build versus older property, city centre versus suburbs, number of bathrooms, balcony or terrace, swimming pool, sea view, parking, and short-term versus long-term rental.</w:t>
+      </w:r>
+      <w:r>
+        <w:t xml:space="preserve"> Then </w:t>
+      </w:r>
+      <w:r>
+        <w:t xml:space="preserve">add a section titled 'Rental Requirements and Legal Information' for each region. For Lisbon, Porto, and the Algarve, display typical security deposit amounts (for example, one or two months' rent if that's customary. Note whether advance rent is commonly required and whether a guarantor (fiador) is typically required and what alternatives are accepted (for example, extra deposit, bank guarantee, proof of income). Include the typical legal or administrative costs involved in preparing a residential tenancy agreement, and indicate who usually pays. Add a brief overview of the standard lease process in Portugal and a disclaimer that requirements can vary with landlord or agency and may change with Portuguese law. Present this information in a clear, easy-to-read format </w:t>
+      </w:r>
+      <w:r>
+        <w:t>with</w:t>
+      </w:r>
+      <w:r>
+        <w:t xml:space="preserve"> the rent estimates.</w:t>
+      </w:r>
+      <w:r>
+        <w:t xml:space="preserve"> </w:t>
+      </w:r>
+      <w:r>
+        <w:t>“</w:t>
+      </w:r>
+      <w:r>
+        <w:t xml:space="preserve">Then make the </w:t>
+      </w:r>
+      <w:r>
+        <w:t>Estimated Target Monthly Rent</w:t>
+      </w:r>
+      <w:r>
+        <w:t>”</w:t>
+      </w:r>
+      <w:r>
+        <w:t xml:space="preserve"> </w:t>
+      </w:r>
+      <w:r>
+        <w:t>heading a link to a new internet tab which contains a report of the analysis conducted.</w:t>
+      </w:r>
+    </w:p>
+    <w:p/>
+    <w:p>
+      <w:r>
+        <w:t>To calculate the displayed “</w:t>
+      </w:r>
+      <w:r>
+        <w:t>Estimated Target Monthly Rent</w:t>
+      </w:r>
+      <w:r>
+        <w:t>” amount, add the 9 lowest “Low Estimate” amount from the 9 ranges, and divide by 9, and then use the calculated amount as the Average Lowest amount. Then</w:t>
+      </w:r>
+      <w:r>
+        <w:t xml:space="preserve"> </w:t>
+      </w:r>
+      <w:r>
+        <w:t>add the 9 high “</w:t>
+      </w:r>
+      <w:r>
+        <w:t xml:space="preserve">High Estimate” </w:t>
+      </w:r>
+      <w:r>
+        <w:t>amount from the 9 ranges, and divide by 9, and use the amount as the Average Highest amount. Then add together the calculated Average Lowest amount and the calculated Average Highest amount and divide the combined amount by 2. Then this calculated amount is displayed as the “</w:t>
+      </w:r>
+      <w:r>
+        <w:t>Shipping &amp; Relocation Setup</w:t>
+      </w:r>
+      <w:r>
+        <w:t xml:space="preserve"> (Average)” amount.</w:t>
+      </w:r>
+    </w:p>
+    <w:p/>
+    <w:p>
+      <w:r>
         <w:lastRenderedPageBreak/>
         <w:t>In the “</w:t>
       </w:r>
       <w:r>
-        <w:t>US to Portugal Shipping &amp; Relocation Guide</w:t>
-      </w:r>
-      <w:r>
-        <w:t>” page, under the table in the section “</w:t>
-      </w:r>
-      <w:r>
-        <w:t>Cost Estimates &amp; Freight Comparisons</w:t>
-      </w:r>
-      <w:r>
-        <w:t>” under the heading “</w:t>
-      </w:r>
-      <w:r>
-        <w:t>1. Estimated Shipping Costs by Volume</w:t>
-      </w:r>
-      <w:r>
-        <w:t>” add the following text “</w:t>
-      </w:r>
-      <w:r>
-        <w:rPr>
-          <w:i/>
-          <w:iCs/>
-        </w:rPr>
-        <w:t>These are estimated averages</w:t>
-      </w:r>
-      <w:r>
-        <w:rPr>
-          <w:i/>
-          <w:iCs/>
-        </w:rPr>
-        <w:t xml:space="preserve"> based on the figures in the table above. Actual international moving costs will vary and should be confirmed with a professional moving company.</w:t>
-      </w:r>
-      <w:r>
-        <w:rPr>
-          <w:i/>
-          <w:iCs/>
-        </w:rPr>
+        <w:t>Portugal Monthly Rental Estimates</w:t>
+      </w:r>
+      <w:r>
+        <w:t xml:space="preserve">” page, for all text between the characters </w:t>
+      </w:r>
+      <w:r>
+        <w:t>**</w:t>
+      </w:r>
+      <w:r>
+        <w:t xml:space="preserve"> </w:t>
+      </w:r>
+      <w:r>
+        <w:t>**</w:t>
+      </w:r>
+      <w:r>
+        <w:t xml:space="preserve">, change the text to be bold and remove the </w:t>
+      </w:r>
+      <w:r>
+        <w:t>**</w:t>
+      </w:r>
+      <w:r>
+        <w:t xml:space="preserve"> </w:t>
+      </w:r>
+      <w:r>
+        <w:t>**</w:t>
+      </w:r>
+      <w:r>
+        <w:t xml:space="preserve"> characters.</w:t>
+      </w:r>
+    </w:p>
+    <w:p>
+      <w:r>
+        <w:t>In the “</w:t>
+      </w:r>
+      <w:r>
+        <w:t>Portugal Monthly Rental Estimates</w:t>
+      </w:r>
+      <w:r>
+        <w:t xml:space="preserve">” page, make all website </w:t>
+      </w:r>
+      <w:r>
+        <w:t>h</w:t>
+      </w:r>
+      <w:r>
+        <w:t>t</w:t>
+      </w:r>
+      <w:r>
+        <w:t>tps</w:t>
+      </w:r>
+      <w:r>
+        <w:t>:</w:t>
+      </w:r>
+      <w:r>
+        <w:t>//</w:t>
+      </w:r>
+      <w:r>
+        <w:t xml:space="preserve">www </w:t>
+      </w:r>
+      <w:r>
+        <w:t xml:space="preserve">references </w:t>
+      </w:r>
+      <w:r>
+        <w:t>into links.</w:t>
+      </w:r>
+      <w:r>
+        <w:t xml:space="preserve"> Then for all text between the characters </w:t>
+      </w:r>
+      <w:r>
+        <w:t>*</w:t>
+      </w:r>
+      <w:r>
+        <w:t xml:space="preserve"> </w:t>
+      </w:r>
+      <w:r>
+        <w:t>*</w:t>
+      </w:r>
+      <w:r>
+        <w:t xml:space="preserve">, change the text to be bold and remove the </w:t>
+      </w:r>
+      <w:r>
+        <w:t>*</w:t>
+      </w:r>
+      <w:r>
+        <w:t xml:space="preserve"> </w:t>
+      </w:r>
+      <w:r>
+        <w:t>*</w:t>
+      </w:r>
+      <w:r>
+        <w:t xml:space="preserve"> characters.</w:t>
+      </w:r>
+    </w:p>
+    <w:p>
+      <w:r>
+        <w:t xml:space="preserve">When calculating the </w:t>
+      </w:r>
+      <w:r>
+        <w:t>“</w:t>
+      </w:r>
+      <w:r>
+        <w:t>Estimated Target Monthly Rent</w:t>
+      </w:r>
+      <w:r>
+        <w:t>”, display th</w:t>
+      </w:r>
+      <w:r>
+        <w:t>e “</w:t>
+      </w:r>
+      <w:r>
+        <w:t>Medium Estimate</w:t>
+      </w:r>
+      <w:r>
+        <w:t xml:space="preserve">” on the </w:t>
+      </w:r>
+      <w:r>
+        <w:t>“</w:t>
+      </w:r>
+      <w:r>
+        <w:t>Portugal Monthly Rental Estimates</w:t>
+      </w:r>
+      <w:r>
+        <w:t xml:space="preserve">” page for the area selected </w:t>
+      </w:r>
+      <w:r>
+        <w:t xml:space="preserve">option under the heading </w:t>
+      </w:r>
+      <w:r>
+        <w:t>“</w:t>
+      </w:r>
+      <w:r>
+        <w:t>2. Target Destination Region (Portugal)</w:t>
+      </w:r>
+      <w:r>
         <w:t>”</w:t>
       </w:r>
+      <w:r>
+        <w:t>, and “</w:t>
+      </w:r>
+      <w:r>
+        <w:t>4. Desired Housing Standard</w:t>
+      </w:r>
+      <w:r>
+        <w:t>”</w:t>
+      </w:r>
+      <w:r>
+        <w:t>.</w:t>
+      </w:r>
     </w:p>
     <w:p/>
     <w:p>
       <w:r>
+        <w:t>Change the text “</w:t>
+      </w:r>
+      <w:r>
+        <w:t>(includes 1 month rent and deposit)</w:t>
+      </w:r>
+      <w:r>
+        <w:t xml:space="preserve">” to </w:t>
+      </w:r>
+      <w:r>
+        <w:t>“</w:t>
+      </w:r>
+      <w:r>
+        <w:t>(</w:t>
+      </w:r>
+      <w:r>
+        <w:t>includes 1 month rent and one month rent deposit – may vary according to contractual agreement)”.</w:t>
+      </w:r>
+    </w:p>
+    <w:p>
+      <w:r>
+        <w:t>On the “</w:t>
+      </w:r>
+      <w:r>
+        <w:t>Renting in Portugal: Long-Term Rental Prices &amp; Expat Tenancy Guide</w:t>
+      </w:r>
+      <w:r>
+        <w:t>” page</w:t>
+      </w:r>
+      <w:r>
+        <w:t xml:space="preserve">, change the text </w:t>
+      </w:r>
+      <w:r>
+        <w:t>“</w:t>
+      </w:r>
+      <w:r>
+        <w:t>An interactive comparative analysis of rental housing cost metrics for Lisbon, Porto (North), and the Algarve Coast.</w:t>
+      </w:r>
+      <w:r>
+        <w:t>” to “</w:t>
+      </w:r>
+      <w:r>
+        <w:t>An interactive comparative analysis of rental housing cost metrics for Lisbon, Porto (North), and the Algarve Coast</w:t>
+      </w:r>
+      <w:r>
+        <w:t xml:space="preserve"> to determine the b</w:t>
+      </w:r>
+      <w:r>
+        <w:t>est places to live in Portugal for Americans.</w:t>
+      </w:r>
+      <w:r>
+        <w:t>”</w:t>
+      </w:r>
+    </w:p>
+    <w:p/>
+    <w:p>
+      <w:pPr>
+        <w:pStyle w:val="Heading2"/>
+      </w:pPr>
+      <w:r>
+        <w:t>A</w:t>
+      </w:r>
+      <w:r>
+        <w:t>dd</w:t>
+      </w:r>
+    </w:p>
+    <w:p>
+      <w:r>
+        <w:t>National rental companies.</w:t>
+      </w:r>
+    </w:p>
+    <w:p/>
+    <w:p/>
+    <w:p/>
+    <w:p>
+      <w:pPr>
+        <w:pStyle w:val="Heading1"/>
+      </w:pPr>
+      <w:r>
+        <w:t>Visa Processing &amp; NIF Setups</w:t>
+      </w:r>
+    </w:p>
+    <w:p>
+      <w:r>
+        <w:t xml:space="preserve">When calculating the “Visa Processing &amp; NIF Setups”, </w:t>
+      </w:r>
+      <w:r>
+        <w:t xml:space="preserve">add information to a separate </w:t>
+      </w:r>
+      <w:r>
+        <w:t xml:space="preserve">page with a link from the </w:t>
+      </w:r>
+      <w:r>
+        <w:t>“Visa Processing &amp; NIF Setups”</w:t>
+      </w:r>
+      <w:r>
+        <w:t xml:space="preserve"> heading</w:t>
+      </w:r>
+      <w:r>
+        <w:t xml:space="preserve">. The information must include information </w:t>
+      </w:r>
+      <w:r>
+        <w:t>that</w:t>
+      </w:r>
+      <w:r>
+        <w:t xml:space="preserve"> walks a US citizen through each step to becoming a legal resident in Portugal. Include visa eligibility, a step-by-step process, document checklists, how to obtain the NIF number, opening a bank account, accommodation requirements, health insurance </w:t>
+      </w:r>
+      <w:r>
+        <w:t>requirements</w:t>
+      </w:r>
+      <w:r>
+        <w:t>, financial requirements, whether applications must be made before arrival versus after, whether legal representation is recommended or required, estimated processing times, costs, interactive calculators, frequently asked questions, official Portuguese government resources, and a disclaimer about laws changing. Make it easy to keep updated, with data stored separately from code.</w:t>
+      </w:r>
+    </w:p>
+    <w:p>
+      <w:r>
+        <w:lastRenderedPageBreak/>
         <w:t>In the “</w:t>
       </w:r>
       <w:r>
-        <w:t>US to Portugal Shipping &amp; Relocation Guide</w:t>
-      </w:r>
-      <w:r>
-        <w:t>” page, under the table in the section “</w:t>
-      </w:r>
-      <w:r>
-        <w:t>Cost Estimates &amp; Freight Comparisons</w:t>
-      </w:r>
-      <w:r>
-        <w:t>” under the heading “</w:t>
-      </w:r>
-      <w:r>
-        <w:t>1. Estimated Shipping Costs by Volume</w:t>
-      </w:r>
-      <w:r>
-        <w:t>” change the text “</w:t>
-      </w:r>
-      <w:r>
-        <w:t>These are estimated averages based on the figures in the table above. Actual international moving costs will vary and should be confirmed with a professional moving company.” To</w:t>
-      </w:r>
-      <w:r>
-        <w:t xml:space="preserve"> “Important: </w:t>
-      </w:r>
-      <w:r>
-        <w:t>These are estimated averages based on the figures in the table above. Actual international moving costs will vary and should be confirmed with a professional moving company.”</w:t>
-      </w:r>
-      <w:r>
-        <w:t xml:space="preserve"> and then change the text “Important:” to be bold.</w:t>
-      </w:r>
-    </w:p>
-    <w:p/>
+        <w:t>US Citizen Residency &amp; Visa Guide</w:t>
+      </w:r>
+      <w:r>
+        <w:t>” page, for</w:t>
+      </w:r>
+      <w:r>
+        <w:t xml:space="preserve"> all text between the characters </w:t>
+      </w:r>
+      <w:r>
+        <w:t>**</w:t>
+      </w:r>
+      <w:r>
+        <w:t xml:space="preserve"> </w:t>
+      </w:r>
+      <w:r>
+        <w:t>**</w:t>
+      </w:r>
+      <w:r>
+        <w:t>, change the text</w:t>
+      </w:r>
+      <w:r>
+        <w:t xml:space="preserve"> to be bold and remove the </w:t>
+      </w:r>
+      <w:r>
+        <w:t>**</w:t>
+      </w:r>
+      <w:r>
+        <w:t xml:space="preserve"> </w:t>
+      </w:r>
+      <w:r>
+        <w:t>**</w:t>
+      </w:r>
+      <w:r>
+        <w:t xml:space="preserve"> characters.</w:t>
+      </w:r>
+    </w:p>
     <w:p>
       <w:r>
         <w:t>In the “</w:t>
       </w:r>
       <w:r>
-        <w:t>US to Portugal Shipping &amp; Relocation Guide</w:t>
-      </w:r>
-      <w:r>
-        <w:t>” page, under the table in the section “</w:t>
-      </w:r>
-      <w:r>
-        <w:t>Cost Estimates &amp; Freight Comparisons</w:t>
-      </w:r>
-      <w:r>
-        <w:t>” under the heading “</w:t>
-      </w:r>
-      <w:r>
-        <w:t>1. Estimated Shipping Costs by Volume</w:t>
-      </w:r>
-      <w:r>
-        <w:t>” change the text “</w:t>
-      </w:r>
-      <w:r>
-        <w:t>These are estimated averages based on the figures in the table above. Actual international moving costs will vary and should be confirmed with a professional moving company.” To</w:t>
-      </w:r>
-      <w:r>
-        <w:t xml:space="preserve"> “</w:t>
-      </w:r>
-      <w:r>
-        <w:t xml:space="preserve">These </w:t>
-      </w:r>
-      <w:r>
-        <w:t>costs are</w:t>
-      </w:r>
-      <w:r>
-        <w:t xml:space="preserve"> estimated averages. Actual international moving costs will vary and should be confirmed with a professional moving company.”</w:t>
-      </w:r>
-    </w:p>
-    <w:p/>
-    <w:p>
-      <w:pPr>
-        <w:pStyle w:val="Heading1"/>
-      </w:pPr>
-      <w:r>
-        <w:t>Apartments</w:t>
-      </w:r>
-    </w:p>
-    <w:p>
-      <w:r>
-        <w:t xml:space="preserve">When calculating the </w:t>
+        <w:t>US Citizen Residency &amp; Visa Guide</w:t>
+      </w:r>
+      <w:r>
+        <w:t>” page, c</w:t>
+      </w:r>
+      <w:r>
+        <w:t xml:space="preserve">hange the text </w:t>
       </w:r>
       <w:r>
         <w:t>“</w:t>
       </w:r>
       <w:r>
-        <w:t>Estimated Target Monthly Rent</w:t>
+        <w:t>*Atestado de Residência*</w:t>
       </w:r>
       <w:r>
         <w:t>”</w:t>
       </w:r>
       <w:r>
-        <w:t>, create a</w:t>
-      </w:r>
-      <w:r>
-        <w:t>n</w:t>
+        <w:t xml:space="preserve"> to </w:t>
+      </w:r>
+      <w:r>
+        <w:t>“</w:t>
+      </w:r>
+      <w:r>
+        <w:t>Atestado de Residência</w:t>
+      </w:r>
+      <w:r>
+        <w:t>” and make the font bold</w:t>
+      </w:r>
+      <w:r>
+        <w:t>, then change the text “</w:t>
+      </w:r>
+      <w:r>
+        <w:t>*</w:t>
+      </w:r>
+      <w:r>
+        <w:t xml:space="preserve">AIMA </w:t>
+      </w:r>
+      <w:r>
+        <w:t>*</w:t>
+      </w:r>
+      <w:r>
+        <w:t>” to “</w:t>
+      </w:r>
+      <w:r>
+        <w:t>AIMA</w:t>
+      </w:r>
+      <w:r>
+        <w:t>” and make the font bold</w:t>
+      </w:r>
+      <w:r>
+        <w:t>. Then under the heading “</w:t>
+      </w:r>
+      <w:r>
+        <w:t>Visa &amp; NIF Requirements Details</w:t>
+      </w:r>
+      <w:r>
+        <w:t xml:space="preserve">”, </w:t>
+      </w:r>
+      <w:r>
+        <w:t>under “</w:t>
+      </w:r>
+      <w:r>
+        <w:t>1. Visa Eligibility &amp; Paths</w:t>
+      </w:r>
+      <w:r>
+        <w:t>”, the sentence “</w:t>
+      </w:r>
+      <w:r>
+        <w:t>* D8 Digital Nomad Visa: Intended for active remote workers, freelancers, or business owners. Requires proof of monthly remote wages equal to at least 4x the current Portuguese minimum wage.</w:t>
+      </w:r>
+      <w:r>
+        <w:t xml:space="preserve">” </w:t>
+      </w:r>
+      <w:r>
+        <w:t xml:space="preserve">must be </w:t>
+      </w:r>
+      <w:proofErr w:type="gramStart"/>
+      <w:r>
+        <w:t>it’s</w:t>
+      </w:r>
+      <w:proofErr w:type="gramEnd"/>
+      <w:r>
+        <w:t xml:space="preserve"> own paragra</w:t>
+      </w:r>
+      <w:r>
+        <w:t xml:space="preserve">ph, not part of the paragraph </w:t>
+      </w:r>
+      <w:r>
+        <w:t>“</w:t>
+      </w:r>
+      <w:r>
+        <w:t xml:space="preserve">* D7 Visa: Intended for retirees, passive income earners, and self-sufficient individuals. Income must be passive (e.g. social security, rental income, investments). </w:t>
+      </w:r>
+      <w:r>
+        <w:t>*.</w:t>
       </w:r>
       <w:r>
         <w:t xml:space="preserve"> </w:t>
       </w:r>
       <w:r>
-        <w:t>e</w:t>
-      </w:r>
-      <w:r>
-        <w:t>stimated Target Monthly Rent</w:t>
-      </w:r>
-      <w:r>
-        <w:t xml:space="preserve">al </w:t>
-      </w:r>
-      <w:r>
-        <w:t xml:space="preserve">page </w:t>
-      </w:r>
-      <w:r>
-        <w:t>estimat</w:t>
-      </w:r>
-      <w:r>
-        <w:t>ing</w:t>
-      </w:r>
-      <w:r>
-        <w:t xml:space="preserve"> monthly rental prices in Portugal for Lisbon, Porto (North), and the Algarve Coast. Include property types T1/T2</w:t>
+        <w:t>Then under the heading “</w:t>
+      </w:r>
+      <w:r>
+        <w:t>Visa &amp; NIF Requirements Details</w:t>
+      </w:r>
+      <w:r>
+        <w:t xml:space="preserve">”, under </w:t>
+      </w:r>
+      <w:r>
+        <w:t xml:space="preserve">the </w:t>
+      </w:r>
+      <w:r>
+        <w:t>heading “</w:t>
+      </w:r>
+      <w:r>
+        <w:t>2. Obtaining a NIF (Tax Number) &amp; Bank Account</w:t>
+      </w:r>
+      <w:r>
+        <w:t xml:space="preserve">”, </w:t>
+      </w:r>
+      <w:r>
+        <w:t>“</w:t>
+      </w:r>
+      <w:r>
+        <w:t xml:space="preserve">* </w:t>
+      </w:r>
+      <w:r>
+        <w:t>the sentence</w:t>
       </w:r>
       <w:r>
         <w:t xml:space="preserve"> </w:t>
       </w:r>
       <w:r>
-        <w:t xml:space="preserve">apartments (one to two bedrooms), T3 family apartments (three bedrooms), and detached villas. Show low, medium, and high estimated monthly rents in </w:t>
-      </w:r>
-      <w:r>
-        <w:t>dollars</w:t>
-      </w:r>
-      <w:r>
-        <w:t xml:space="preserve">, presented in a clean comparison table. Note that the figures are estimates and can vary by micro-location, property condition, size, amenities, and seasonality. Allow easy updating of rental data via a JSON file or database, not hard-coded. Design the code to be modular, documented, and easy to maintain. Use a modern tech stack (e.g., HTML, CSS, JavaScript or React). Include a last updated date. Optionally support filters like furnished or unfurnished, new build versus older property, city centre versus suburbs, number of bathrooms, balcony or terrace, swimming pool, sea view, parking, and short-term versus long-term </w:t>
-      </w:r>
-      <w:r>
-        <w:lastRenderedPageBreak/>
-        <w:t>rental.</w:t>
-      </w:r>
-      <w:r>
-        <w:t xml:space="preserve"> Then </w:t>
-      </w:r>
-      <w:r>
-        <w:t xml:space="preserve">add a section titled 'Rental Requirements and Legal Information' for each region. For Lisbon, Porto, and the Algarve, display typical security deposit amounts (for example, one or two months' rent if that's customary. Note whether advance rent is commonly required and whether a guarantor (fiador) is typically required and what alternatives are accepted (for example, extra deposit, bank guarantee, proof of income). Include the typical legal or administrative costs involved in preparing a residential tenancy agreement, and indicate who usually pays. Add a brief overview of the standard lease process in Portugal and a disclaimer that requirements can vary with landlord or agency and may change with Portuguese law. Present this information in a clear, easy-to-read format </w:t>
-      </w:r>
-      <w:r>
-        <w:t>with</w:t>
-      </w:r>
-      <w:r>
-        <w:t xml:space="preserve"> the rent estimates.</w:t>
+        <w:t>“</w:t>
+      </w:r>
+      <w:r>
+        <w:t>* Bank Account: You must open a Portuguese bank account (such as Millennium BCP, Novo Banco, or ActivoBank) to deposit visa qualification savings. This requires a NIF, proof of US employment, and physical identification.</w:t>
+      </w:r>
+      <w:r>
+        <w:t xml:space="preserve">” must be </w:t>
+      </w:r>
+      <w:proofErr w:type="gramStart"/>
+      <w:r>
+        <w:t>it’s</w:t>
+      </w:r>
+      <w:proofErr w:type="gramEnd"/>
+      <w:r>
+        <w:t xml:space="preserve"> own paragraph, not part of the paragraph </w:t>
+      </w:r>
+      <w:r>
+        <w:t xml:space="preserve">* NIF: Your *Número de Identificação Fiscal* is required for all legal actions. US citizens can obtain it online using virtual legal proxy services (like Bordr or ReloPlan legal partners) for approx. $80–$150. </w:t>
+      </w:r>
+      <w:r>
+        <w:t>*</w:t>
+      </w:r>
+      <w:r>
+        <w:t>.</w:t>
       </w:r>
       <w:r>
         <w:t xml:space="preserve"> </w:t>
       </w:r>
       <w:r>
-        <w:t>“</w:t>
-      </w:r>
-      <w:r>
-        <w:t xml:space="preserve">Then make the </w:t>
-      </w:r>
-      <w:r>
-        <w:t>Estimated Target Monthly Rent</w:t>
-      </w:r>
-      <w:r>
-        <w:t>”</w:t>
+        <w:t>Then under the heading “</w:t>
+      </w:r>
+      <w:r>
+        <w:t>Visa &amp; NIF Requirements Details</w:t>
+      </w:r>
+      <w:r>
+        <w:t>”, under the heading “</w:t>
+      </w:r>
+      <w:r>
+        <w:t>3. Accommodation &amp; Insurance Requirements</w:t>
+      </w:r>
+      <w:r>
+        <w:t>”, “</w:t>
+      </w:r>
+      <w:r>
+        <w:t xml:space="preserve">* </w:t>
+      </w:r>
+      <w:r>
+        <w:t xml:space="preserve">the sentence </w:t>
+      </w:r>
+      <w:r>
+        <w:t>* Health Insurance: Must cover repatriation, emergency care, and have €0 deductibles. Coverage must begin before consulate filing</w:t>
+      </w:r>
+      <w:r>
+        <w:t>.</w:t>
+      </w:r>
+      <w:r>
+        <w:t xml:space="preserve">” must be </w:t>
+      </w:r>
+      <w:proofErr w:type="gramStart"/>
+      <w:r>
+        <w:t>it’s</w:t>
+      </w:r>
+      <w:proofErr w:type="gramEnd"/>
+      <w:r>
+        <w:t xml:space="preserve"> own paragraph, not part of the paragraph </w:t>
+      </w:r>
+      <w:r>
+        <w:t>*</w:t>
       </w:r>
       <w:r>
         <w:t xml:space="preserve"> </w:t>
       </w:r>
       <w:r>
-        <w:t>heading a link to a new internet tab which contains a report of the analysis conducted.</w:t>
-      </w:r>
-    </w:p>
-    <w:p/>
-    <w:p>
-      <w:r>
-        <w:t>To calculate the displayed “</w:t>
-      </w:r>
-      <w:r>
-        <w:t>Estimated Target Monthly Rent</w:t>
-      </w:r>
-      <w:r>
-        <w:t>” amount, add the 9 lowest “Low Estimate” amount from the 9 ranges, and divide by 9, and then use the calculated amount as the Average Lowest amount. Then</w:t>
+        <w:t xml:space="preserve">Lease Length: Portuguese consulates in the US require a registered lease contract of at least 12 months or a deed showing home ownership. Shared apartments or short-term sublets are generally rejected. </w:t>
+      </w:r>
+      <w:r>
+        <w:t>*</w:t>
+      </w:r>
+      <w:r>
+        <w:t>.</w:t>
       </w:r>
       <w:r>
         <w:t xml:space="preserve"> </w:t>
       </w:r>
       <w:r>
-        <w:t>add the 9 high “</w:t>
-      </w:r>
-      <w:r>
-        <w:t xml:space="preserve">High Estimate” </w:t>
-      </w:r>
-      <w:r>
-        <w:t>amount from the 9 ranges, and divide by 9, and use the amount as the Average Highest amount. Then add together the calculated Average Lowest amount and the calculated Average Highest amount and divide the combined amount by 2. Then this calculated amount is displayed as the “</w:t>
-      </w:r>
-      <w:r>
-        <w:t>Shipping &amp; Relocation Setup</w:t>
-      </w:r>
-      <w:r>
-        <w:t xml:space="preserve"> (Average)” amount.</w:t>
-      </w:r>
-    </w:p>
-    <w:p/>
-    <w:p>
-      <w:r>
-        <w:t>In the “</w:t>
-      </w:r>
-      <w:r>
-        <w:t>Portugal Monthly Rental Estimates</w:t>
-      </w:r>
-      <w:r>
-        <w:t xml:space="preserve">” page, for all text between the characters </w:t>
-      </w:r>
-      <w:r>
-        <w:t>**</w:t>
-      </w:r>
-      <w:r>
-        <w:t xml:space="preserve"> </w:t>
-      </w:r>
-      <w:r>
-        <w:t>**</w:t>
-      </w:r>
-      <w:r>
-        <w:t xml:space="preserve">, change the text to be bold and remove the </w:t>
-      </w:r>
-      <w:r>
-        <w:t>**</w:t>
-      </w:r>
-      <w:r>
-        <w:t xml:space="preserve"> </w:t>
-      </w:r>
-      <w:r>
-        <w:t>**</w:t>
-      </w:r>
-      <w:r>
-        <w:t xml:space="preserve"> characters.</w:t>
-      </w:r>
-    </w:p>
-    <w:p>
-      <w:r>
-        <w:t>In the “</w:t>
-      </w:r>
-      <w:r>
-        <w:t>Portugal Monthly Rental Estimates</w:t>
-      </w:r>
-      <w:r>
-        <w:t xml:space="preserve">” page, make all website </w:t>
-      </w:r>
-      <w:r>
-        <w:t>h</w:t>
-      </w:r>
-      <w:r>
-        <w:t>t</w:t>
-      </w:r>
-      <w:r>
-        <w:t>tps</w:t>
-      </w:r>
-      <w:r>
-        <w:t>:</w:t>
-      </w:r>
-      <w:r>
-        <w:t>//</w:t>
-      </w:r>
-      <w:r>
-        <w:t xml:space="preserve">www </w:t>
-      </w:r>
-      <w:r>
-        <w:t xml:space="preserve">references </w:t>
-      </w:r>
-      <w:r>
-        <w:t>into links.</w:t>
-      </w:r>
-      <w:r>
-        <w:t xml:space="preserve"> Then for all text between the characters </w:t>
-      </w:r>
-      <w:r>
-        <w:t>*</w:t>
-      </w:r>
-      <w:r>
-        <w:t xml:space="preserve"> </w:t>
-      </w:r>
-      <w:r>
-        <w:t>*</w:t>
-      </w:r>
-      <w:r>
-        <w:t xml:space="preserve">, change the text to be bold and remove the </w:t>
-      </w:r>
-      <w:r>
-        <w:t>*</w:t>
-      </w:r>
-      <w:r>
-        <w:t xml:space="preserve"> </w:t>
-      </w:r>
-      <w:r>
-        <w:t>*</w:t>
-      </w:r>
-      <w:r>
-        <w:t xml:space="preserve"> characters.</w:t>
-      </w:r>
-    </w:p>
-    <w:p>
-      <w:r>
-        <w:t xml:space="preserve">When calculating the </w:t>
-      </w:r>
-      <w:r>
-        <w:t>“</w:t>
-      </w:r>
-      <w:r>
-        <w:t>Estimated Target Monthly Rent</w:t>
-      </w:r>
-      <w:r>
-        <w:t>”, display th</w:t>
-      </w:r>
-      <w:r>
-        <w:t>e “</w:t>
-      </w:r>
-      <w:r>
-        <w:t>Medium Estimate</w:t>
-      </w:r>
-      <w:r>
-        <w:t xml:space="preserve">” on the </w:t>
-      </w:r>
-      <w:r>
-        <w:t>“</w:t>
-      </w:r>
-      <w:r>
-        <w:t>Portugal Monthly Rental Estimates</w:t>
-      </w:r>
-      <w:r>
-        <w:t xml:space="preserve">” page for the area selected </w:t>
-      </w:r>
-      <w:r>
-        <w:t xml:space="preserve">option under the heading </w:t>
-      </w:r>
-      <w:r>
-        <w:t>“</w:t>
-      </w:r>
-      <w:r>
-        <w:t>2. Target Destination Region (Portugal)</w:t>
-      </w:r>
-      <w:r>
-        <w:t>”</w:t>
-      </w:r>
-      <w:r>
-        <w:t>, and “</w:t>
-      </w:r>
-      <w:r>
-        <w:t>4. Desired Housing Standard</w:t>
-      </w:r>
-      <w:r>
-        <w:t>”</w:t>
+        <w:t>Then under the heading “</w:t>
+      </w:r>
+      <w:r>
+        <w:t>Visa &amp; NIF Requirements Details</w:t>
+      </w:r>
+      <w:r>
+        <w:t>”, under the heading “</w:t>
+      </w:r>
+      <w:r>
+        <w:t>4. Legal Counsel &amp; Processing Costs</w:t>
+      </w:r>
+      <w:r>
+        <w:t>”, “</w:t>
+      </w:r>
+      <w:r>
+        <w:t xml:space="preserve">* </w:t>
+      </w:r>
+      <w:r>
+        <w:t xml:space="preserve">the sentence </w:t>
+      </w:r>
+      <w:r>
+        <w:t xml:space="preserve">* </w:t>
+      </w:r>
+      <w:r>
+        <w:t>* Processing Times: Consulate phase: 60 to 90 days. Biometrics bi-annual scheduling phase: 60 to 120 days</w:t>
       </w:r>
       <w:r>
         <w:t>.</w:t>
       </w:r>
-    </w:p>
-    <w:p/>
-    <w:p>
-      <w:r>
-        <w:t>Change the text “</w:t>
-      </w:r>
-      <w:r>
-        <w:t>(includes 1 month rent and deposit)</w:t>
-      </w:r>
-      <w:r>
-        <w:t xml:space="preserve">” to </w:t>
-      </w:r>
-      <w:r>
-        <w:t>“</w:t>
-      </w:r>
-      <w:r>
-        <w:t>(</w:t>
-      </w:r>
-      <w:r>
-        <w:t>includes 1 month rent and one month rent deposit – may vary according to contractual agreement)”.</w:t>
-      </w:r>
-    </w:p>
-    <w:p/>
-    <w:p>
-      <w:pPr>
-        <w:pStyle w:val="Heading2"/>
-      </w:pPr>
-      <w:r>
-        <w:t>A</w:t>
-      </w:r>
-      <w:r>
-        <w:t>dd</w:t>
-      </w:r>
-    </w:p>
-    <w:p>
-      <w:r>
-        <w:t>National rental companies.</w:t>
-      </w:r>
-    </w:p>
-    <w:p>
-      <w:pPr>
-        <w:pStyle w:val="Heading1"/>
-      </w:pPr>
-      <w:r>
-        <w:lastRenderedPageBreak/>
-        <w:t>Visa Processing &amp; NIF Setups</w:t>
-      </w:r>
-    </w:p>
-    <w:p>
-      <w:r>
-        <w:t xml:space="preserve">When calculating the “Visa Processing &amp; NIF Setups”, </w:t>
-      </w:r>
-      <w:r>
-        <w:t xml:space="preserve">add information to a separate </w:t>
-      </w:r>
-      <w:r>
-        <w:t xml:space="preserve">page with a link from the </w:t>
-      </w:r>
-      <w:r>
-        <w:t>“Visa Processing &amp; NIF Setups”</w:t>
-      </w:r>
-      <w:r>
-        <w:t xml:space="preserve"> heading</w:t>
-      </w:r>
-      <w:r>
-        <w:t xml:space="preserve">. The information must include information </w:t>
-      </w:r>
-      <w:r>
-        <w:t>that</w:t>
-      </w:r>
-      <w:r>
-        <w:t xml:space="preserve"> walks a US citizen through each step to becoming a legal resident in Portugal. Include visa eligibility, a step-by-step process, document checklists, how to obtain the NIF number, opening a bank account, accommodation requirements, health insurance </w:t>
-      </w:r>
-      <w:r>
-        <w:t>requirements</w:t>
-      </w:r>
-      <w:r>
-        <w:t>, financial requirements, whether applications must be made before arrival versus after, whether legal representation is recommended or required, estimated processing times, costs, interactive calculators, frequently asked questions, official Portuguese government resources, and a disclaimer about laws changing. Make it easy to keep updated, with data stored separately from code.</w:t>
-      </w:r>
-    </w:p>
-    <w:p>
-      <w:r>
-        <w:t>In the “</w:t>
-      </w:r>
-      <w:r>
-        <w:t>US Citizen Residency &amp; Visa Guide</w:t>
-      </w:r>
-      <w:r>
-        <w:t>” page, for</w:t>
-      </w:r>
-      <w:r>
-        <w:t xml:space="preserve"> all text between the characters </w:t>
-      </w:r>
-      <w:r>
-        <w:t>**</w:t>
-      </w:r>
-      <w:r>
-        <w:t xml:space="preserve"> </w:t>
-      </w:r>
-      <w:r>
-        <w:t>**</w:t>
-      </w:r>
-      <w:r>
-        <w:t>, change the text</w:t>
-      </w:r>
-      <w:r>
-        <w:t xml:space="preserve"> to be bold and remove the </w:t>
-      </w:r>
-      <w:r>
-        <w:t>**</w:t>
-      </w:r>
-      <w:r>
-        <w:t xml:space="preserve"> </w:t>
-      </w:r>
-      <w:r>
-        <w:t>**</w:t>
-      </w:r>
-      <w:r>
-        <w:t xml:space="preserve"> characters.</w:t>
-      </w:r>
-    </w:p>
-    <w:p>
-      <w:r>
-        <w:t>In the “</w:t>
-      </w:r>
-      <w:r>
-        <w:t>US Citizen Residency &amp; Visa Guide</w:t>
-      </w:r>
-      <w:r>
-        <w:t>” page, c</w:t>
-      </w:r>
-      <w:r>
-        <w:t xml:space="preserve">hange the text </w:t>
-      </w:r>
-      <w:r>
-        <w:t>“</w:t>
-      </w:r>
-      <w:r>
-        <w:t>*Atestado de Residência*</w:t>
-      </w:r>
-      <w:r>
-        <w:t>”</w:t>
-      </w:r>
-      <w:r>
-        <w:t xml:space="preserve"> to </w:t>
-      </w:r>
-      <w:r>
-        <w:t>“</w:t>
-      </w:r>
-      <w:r>
-        <w:t>Atestado de Residência</w:t>
-      </w:r>
-      <w:r>
-        <w:t>” and make the font bold</w:t>
-      </w:r>
-      <w:r>
-        <w:t>, then change the text “</w:t>
-      </w:r>
-      <w:r>
-        <w:t>*</w:t>
-      </w:r>
-      <w:r>
-        <w:t xml:space="preserve">AIMA </w:t>
-      </w:r>
-      <w:r>
-        <w:t>*</w:t>
-      </w:r>
-      <w:r>
-        <w:t>” to “</w:t>
-      </w:r>
-      <w:r>
-        <w:t>AIMA</w:t>
-      </w:r>
-      <w:r>
-        <w:t>” and make the font bold</w:t>
-      </w:r>
-      <w:r>
-        <w:t>. Then under the heading “</w:t>
-      </w:r>
-      <w:r>
-        <w:t>Visa &amp; NIF Requirements Details</w:t>
-      </w:r>
-      <w:r>
-        <w:t xml:space="preserve">”, </w:t>
-      </w:r>
-      <w:r>
-        <w:t>under “</w:t>
-      </w:r>
-      <w:r>
-        <w:t>1. Visa Eligibility &amp; Paths</w:t>
-      </w:r>
-      <w:r>
-        <w:t>”, the sentence “</w:t>
-      </w:r>
-      <w:r>
-        <w:t>* D8 Digital Nomad Visa: Intended for active remote workers, freelancers, or business owners. Requires proof of monthly remote wages equal to at least 4x the current Portuguese minimum wage.</w:t>
-      </w:r>
-      <w:r>
-        <w:t xml:space="preserve">” </w:t>
-      </w:r>
-      <w:r>
-        <w:t>must be it’s own paragra</w:t>
-      </w:r>
-      <w:r>
-        <w:t xml:space="preserve">ph, not part of the paragraph </w:t>
-      </w:r>
-      <w:r>
-        <w:t>“</w:t>
-      </w:r>
-      <w:r>
-        <w:t xml:space="preserve">* D7 Visa: Intended for retirees, passive income earners, and self-sufficient individuals. Income must be passive (e.g. social security, rental income, investments). </w:t>
-      </w:r>
-      <w:r>
-        <w:t>*.</w:t>
-      </w:r>
-      <w:r>
-        <w:t xml:space="preserve"> </w:t>
-      </w:r>
-      <w:r>
-        <w:t>Then under the heading “</w:t>
-      </w:r>
-      <w:r>
-        <w:t>Visa &amp; NIF Requirements Details</w:t>
-      </w:r>
-      <w:r>
-        <w:t xml:space="preserve">”, under </w:t>
-      </w:r>
-      <w:r>
-        <w:t xml:space="preserve">the </w:t>
-      </w:r>
-      <w:r>
-        <w:t>heading “</w:t>
-      </w:r>
-      <w:r>
-        <w:t>2. Obtaining a NIF (Tax Number) &amp; Bank Account</w:t>
-      </w:r>
-      <w:r>
-        <w:t xml:space="preserve">”, </w:t>
-      </w:r>
-      <w:r>
-        <w:t>“</w:t>
-      </w:r>
-      <w:r>
-        <w:t xml:space="preserve">* </w:t>
-      </w:r>
-      <w:r>
-        <w:t>the sentence</w:t>
-      </w:r>
-      <w:r>
-        <w:t xml:space="preserve"> </w:t>
-      </w:r>
-      <w:r>
-        <w:t>“</w:t>
-      </w:r>
-      <w:r>
-        <w:t>* Bank Account: You must open a Portuguese bank account (such as Millennium BCP, Novo Banco, or ActivoBank) to deposit visa qualification savings. This requires a NIF, proof of US employment, and physical identification.</w:t>
-      </w:r>
-      <w:r>
-        <w:t xml:space="preserve">” must be it’s own paragraph, not part of the paragraph </w:t>
-      </w:r>
-      <w:r>
-        <w:t xml:space="preserve">* NIF: Your *Número de Identificação Fiscal* is required for all legal actions. US citizens can obtain it online using virtual legal proxy services (like Bordr or ReloPlan legal partners) for approx. $80–$150. </w:t>
-      </w:r>
-      <w:r>
-        <w:t>*</w:t>
-      </w:r>
-      <w:r>
-        <w:t>.</w:t>
-      </w:r>
-      <w:r>
-        <w:t xml:space="preserve"> </w:t>
-      </w:r>
-      <w:r>
-        <w:t>Then under the heading “</w:t>
-      </w:r>
-      <w:r>
-        <w:t>Visa &amp; NIF Requirements Details</w:t>
-      </w:r>
-      <w:r>
-        <w:t>”, under the heading “</w:t>
-      </w:r>
-      <w:r>
-        <w:t>3. Accommodation &amp; Insurance Requirements</w:t>
-      </w:r>
-      <w:r>
-        <w:t>”, “</w:t>
-      </w:r>
-      <w:r>
-        <w:t xml:space="preserve">* </w:t>
-      </w:r>
-      <w:r>
-        <w:t xml:space="preserve">the sentence </w:t>
-      </w:r>
-      <w:r>
-        <w:t>* Health Insurance: Must cover repatriation, emergency care, and have €0 deductibles. Coverage must begin before consulate filing</w:t>
-      </w:r>
-      <w:r>
-        <w:t>.</w:t>
-      </w:r>
-      <w:r>
-        <w:t xml:space="preserve">” must be it’s own paragraph, not part of the paragraph </w:t>
-      </w:r>
-      <w:r>
-        <w:t>*</w:t>
-      </w:r>
-      <w:r>
-        <w:t xml:space="preserve"> </w:t>
-      </w:r>
-      <w:r>
-        <w:t xml:space="preserve">Lease Length: Portuguese consulates in the US require a registered lease contract of at least 12 months or a deed showing home ownership. Shared apartments or short-term sublets are generally rejected. </w:t>
-      </w:r>
-      <w:r>
-        <w:t>*</w:t>
-      </w:r>
-      <w:r>
-        <w:t>.</w:t>
-      </w:r>
-      <w:r>
-        <w:t xml:space="preserve"> </w:t>
-      </w:r>
-      <w:r>
-        <w:t>Then under the heading “</w:t>
-      </w:r>
-      <w:r>
-        <w:t>Visa &amp; NIF Requirements Details</w:t>
-      </w:r>
-      <w:r>
-        <w:t>”, under the heading “</w:t>
-      </w:r>
-      <w:r>
-        <w:t>4. Legal Counsel &amp; Processing Costs</w:t>
-      </w:r>
-      <w:r>
-        <w:t>”, “</w:t>
-      </w:r>
-      <w:r>
-        <w:t xml:space="preserve">* </w:t>
-      </w:r>
-      <w:r>
-        <w:t xml:space="preserve">the sentence </w:t>
-      </w:r>
-      <w:r>
-        <w:t xml:space="preserve">* </w:t>
-      </w:r>
-      <w:r>
-        <w:t>* Processing Times: Consulate phase: 60 to 90 days. Biometrics bi-</w:t>
-      </w:r>
-      <w:r>
-        <w:lastRenderedPageBreak/>
-        <w:t>annual scheduling phase: 60 to 120 days</w:t>
-      </w:r>
-      <w:r>
-        <w:t>.</w:t>
-      </w:r>
-      <w:r>
-        <w:t xml:space="preserve">” must be it’s own paragraph, not part of the paragraph </w:t>
+      <w:r>
+        <w:t xml:space="preserve">” must be </w:t>
+      </w:r>
+      <w:proofErr w:type="gramStart"/>
+      <w:r>
+        <w:t>it’s</w:t>
+      </w:r>
+      <w:proofErr w:type="gramEnd"/>
+      <w:r>
+        <w:t xml:space="preserve"> own paragraph, not part of the paragraph </w:t>
       </w:r>
       <w:r>
         <w:t>*</w:t>
@@ -7287,7 +7718,11 @@
         <w:t>”, and “</w:t>
       </w:r>
       <w:r>
-        <w:t>3. Accommodation &amp; Insurance Requirements</w:t>
+        <w:t xml:space="preserve">3. </w:t>
+      </w:r>
+      <w:r>
+        <w:lastRenderedPageBreak/>
+        <w:t>Accommodation &amp; Insurance Requirements</w:t>
       </w:r>
       <w:r>
         <w:t>”, and “</w:t>
@@ -7558,26 +7993,825 @@
         <w:t>” change the text “</w:t>
       </w:r>
       <w:r>
-        <w:t xml:space="preserve">No Incomplete Files: Portugal's immigration authority </w:t>
-      </w:r>
+        <w:t>No Incomplete Files: Portugal's immigration authority (AIMA) requires all applications and renewals to be complete at the time of submission. Missing documents lead to immediate rejection rather than a chance to update later.</w:t>
+      </w:r>
+      <w:r>
+        <w:t>” to “</w:t>
+      </w:r>
+      <w:r>
+        <w:t>Incomplete Files: Portugal's immigration authority (AIMA) requires all applications and renewals to be complete at the time of submission. Missing documents</w:t>
+      </w:r>
+      <w:r>
+        <w:t xml:space="preserve"> can</w:t>
+      </w:r>
+      <w:r>
+        <w:t xml:space="preserve"> lead to immediate rejection rather than a chance to update later.</w:t>
+      </w:r>
+      <w:r>
+        <w:t>”,</w:t>
+      </w:r>
+    </w:p>
+    <w:p/>
+    <w:p>
+      <w:r>
+        <w:t>Then, in the section “</w:t>
+      </w:r>
+      <w:r>
+        <w:t>Visa &amp; NIF Requirements Details</w:t>
+      </w:r>
+      <w:r>
+        <w:t>”</w:t>
+      </w:r>
+      <w:r>
+        <w:t>, under the heading “</w:t>
+      </w:r>
+      <w:r>
+        <w:t>1. Visa Eligibility &amp; Paths</w:t>
+      </w:r>
+      <w:r>
+        <w:t>”, add the following bullets</w:t>
+      </w:r>
+      <w:r>
+        <w:t xml:space="preserve"> using the same formatting and the first two bullets, </w:t>
+      </w:r>
+    </w:p>
+    <w:p>
+      <w:pPr>
+        <w:pStyle w:val="ListParagraph"/>
+        <w:numPr>
+          <w:ilvl w:val="0"/>
+          <w:numId w:val="9"/>
+        </w:numPr>
+        <w:ind w:left="360"/>
+      </w:pPr>
       <w:r>
         <w:lastRenderedPageBreak/>
-        <w:t>(AIMA) requires all applications and renewals to be complete at the time of submission. Missing documents lead to immediate rejection rather than a chance to update later.</w:t>
+        <w:t xml:space="preserve">D2 Visa (Entrepreneur &amp; Freelancer): </w:t>
+      </w:r>
+      <w:r>
+        <w:t xml:space="preserve">Intended for </w:t>
+      </w:r>
+      <w:r>
+        <w:t>Americans</w:t>
+      </w:r>
+      <w:r>
+        <w:t xml:space="preserve"> looking to launch a business, expand a company, or work independently in Portugal. Require</w:t>
+      </w:r>
+      <w:r>
+        <w:t>s a</w:t>
+      </w:r>
+      <w:r>
+        <w:t xml:space="preserve"> comprehensive, viable business plan or proof of existing independent operations.</w:t>
+      </w:r>
+    </w:p>
+    <w:p>
+      <w:pPr>
+        <w:pStyle w:val="ListParagraph"/>
+        <w:numPr>
+          <w:ilvl w:val="0"/>
+          <w:numId w:val="9"/>
+        </w:numPr>
+        <w:ind w:left="360"/>
+      </w:pPr>
+      <w:r>
+        <w:t>D1 &amp; D3 Visas (Work Visas)</w:t>
+      </w:r>
+    </w:p>
+    <w:p>
+      <w:pPr>
+        <w:pStyle w:val="ListParagraph"/>
+        <w:numPr>
+          <w:ilvl w:val="1"/>
+          <w:numId w:val="9"/>
+        </w:numPr>
+        <w:ind w:left="720"/>
+      </w:pPr>
+      <w:r>
+        <w:t>D1: Standard work visa requiring a formal job contract with a local Portuguese company.</w:t>
+      </w:r>
+    </w:p>
+    <w:p>
+      <w:pPr>
+        <w:pStyle w:val="ListParagraph"/>
+        <w:numPr>
+          <w:ilvl w:val="1"/>
+          <w:numId w:val="9"/>
+        </w:numPr>
+        <w:ind w:left="720"/>
+      </w:pPr>
+      <w:r>
+        <w:t>D3: Highly qualified professional visa for specialized roles</w:t>
+      </w:r>
+      <w:r>
+        <w:t>. R</w:t>
+      </w:r>
+      <w:r>
+        <w:t>equir</w:t>
+      </w:r>
+      <w:r>
+        <w:t>es an</w:t>
+      </w:r>
+      <w:r>
+        <w:t xml:space="preserve"> advanced </w:t>
+      </w:r>
+      <w:r>
+        <w:t>degree or specialized skill set</w:t>
+      </w:r>
+      <w:r>
+        <w:t xml:space="preserve"> and meeting threshold salary requirements.</w:t>
+      </w:r>
+    </w:p>
+    <w:p>
+      <w:pPr>
+        <w:pStyle w:val="ListParagraph"/>
+        <w:numPr>
+          <w:ilvl w:val="0"/>
+          <w:numId w:val="9"/>
+        </w:numPr>
+        <w:ind w:left="360"/>
+      </w:pPr>
+      <w:r>
+        <w:t>Golden Visa (ARI): An investment-based residency route that does not require full-time physical residence (only 7 days per year). Require</w:t>
+      </w:r>
+      <w:r>
+        <w:t>s a</w:t>
+      </w:r>
+      <w:r>
+        <w:t xml:space="preserve"> qualifying non-real estate investment, such as €500,000 into regulated Portuguese investment funds.</w:t>
+      </w:r>
+    </w:p>
+    <w:p>
+      <w:r>
+        <w:t>then in section “</w:t>
+      </w:r>
+      <w:r>
+        <w:t>Document Dossier Checklist</w:t>
+      </w:r>
+      <w:r>
+        <w:t>” add a button to print the items in the list.</w:t>
+      </w:r>
+    </w:p>
+    <w:p/>
+    <w:p>
+      <w:r>
+        <w:t xml:space="preserve">On the “US Citizen Portugal Residency &amp; Visa Guide (D7, D8, NIF)” page, </w:t>
+      </w:r>
+      <w:r>
+        <w:t xml:space="preserve">move the </w:t>
+      </w:r>
+      <w:r>
+        <w:t xml:space="preserve">section “Visa &amp; NIF Requirements Details” to the top </w:t>
+      </w:r>
+      <w:r>
+        <w:t xml:space="preserve">of the page </w:t>
+      </w:r>
+      <w:r>
+        <w:t>above the section “Step-by-Step Residency Walkthrough”</w:t>
+      </w:r>
+      <w:r>
+        <w:t>, t</w:t>
+      </w:r>
+      <w:r>
+        <w:t>hen, in the section “</w:t>
+      </w:r>
+      <w:r>
+        <w:t>Document Dossier Checklist</w:t>
+      </w:r>
+      <w:r>
+        <w:t xml:space="preserve">”, </w:t>
+      </w:r>
+      <w:r>
+        <w:t xml:space="preserve">the </w:t>
+      </w:r>
+      <w:r>
+        <w:t>“</w:t>
+      </w:r>
+      <w:r>
+        <w:t xml:space="preserve">Print </w:t>
+      </w:r>
+      <w:r>
+        <w:t xml:space="preserve">Checklist” button only prints the </w:t>
+      </w:r>
+      <w:r>
+        <w:t>“Document Dossier Checklist”</w:t>
+      </w:r>
+      <w:r>
+        <w:t xml:space="preserve"> section, not the whole page.</w:t>
+      </w:r>
+    </w:p>
+    <w:p>
+      <w:r>
+        <w:t>On the “US Citizen Portugal Residency &amp; Visa Guide (D7, D8, NIF)”</w:t>
+      </w:r>
+      <w:r>
+        <w:t>, change the text “</w:t>
+      </w:r>
+      <w:r>
+        <w:t>A comprehensive checklist and chronological guide to obtaining a NIF, opening a bank account, and securing a residency visa (D7/D8) for Portugal.</w:t>
       </w:r>
       <w:r>
         <w:t>” to “</w:t>
       </w:r>
       <w:r>
-        <w:t>Incomplete Files: Portugal's immigration authority (AIMA) requires all applications and renewals to be complete at the time of submission. Missing documents</w:t>
-      </w:r>
-      <w:r>
-        <w:t xml:space="preserve"> can</w:t>
-      </w:r>
-      <w:r>
-        <w:t xml:space="preserve"> lead to immediate rejection rather than a chance to update later.</w:t>
-      </w:r>
-      <w:r>
-        <w:t>”,</w:t>
+        <w:t xml:space="preserve">A comprehensive checklist and chronological guide to obtaining a NIF, opening a bank account, </w:t>
+      </w:r>
+      <w:r>
+        <w:t xml:space="preserve">a </w:t>
+      </w:r>
+      <w:r>
+        <w:t>Portuguese</w:t>
+      </w:r>
+      <w:r>
+        <w:t xml:space="preserve"> work visa</w:t>
+      </w:r>
+      <w:r>
+        <w:t xml:space="preserve">, or </w:t>
+      </w:r>
+      <w:r>
+        <w:t>securing a Portugal residency for Americans</w:t>
+      </w:r>
+      <w:r>
+        <w:t xml:space="preserve"> </w:t>
+      </w:r>
+      <w:r>
+        <w:t>visa (D7/D8)</w:t>
+      </w:r>
+      <w:r>
+        <w:t xml:space="preserve"> as well as </w:t>
+      </w:r>
+      <w:r>
+        <w:t xml:space="preserve">an </w:t>
+      </w:r>
+      <w:r>
+        <w:t xml:space="preserve">overview </w:t>
+      </w:r>
+      <w:r>
+        <w:t>of other</w:t>
+      </w:r>
+      <w:r>
+        <w:t xml:space="preserve"> </w:t>
+      </w:r>
+      <w:r>
+        <w:t>Portugal visa types for US citizens</w:t>
+      </w:r>
+      <w:r>
+        <w:t>.</w:t>
+      </w:r>
+      <w:r>
+        <w:t>”</w:t>
+      </w:r>
+    </w:p>
+    <w:p/>
+    <w:p>
+      <w:pPr>
+        <w:pStyle w:val="Heading1"/>
+      </w:pPr>
+      <w:r>
+        <w:t>Education</w:t>
+      </w:r>
+    </w:p>
+    <w:p>
+      <w:r>
+        <w:t>Under the section “</w:t>
+      </w:r>
+      <w:r>
+        <w:t>Move Budget Breakdown</w:t>
+      </w:r>
+      <w:r>
+        <w:t xml:space="preserve">” add </w:t>
+      </w:r>
+      <w:r>
+        <w:t>a category called “Education”.</w:t>
+      </w:r>
+      <w:r>
+        <w:t xml:space="preserve"> </w:t>
+      </w:r>
+      <w:r>
+        <w:t>Then make it a link to a separate page which will contain</w:t>
+      </w:r>
+      <w:r>
+        <w:t xml:space="preserve"> </w:t>
+      </w:r>
+      <w:r>
+        <w:t>an</w:t>
+      </w:r>
+      <w:r>
+        <w:t xml:space="preserve"> introduction </w:t>
+      </w:r>
+      <w:r>
+        <w:t xml:space="preserve">to the Portuguese </w:t>
+      </w:r>
+      <w:r>
+        <w:t xml:space="preserve">education system. </w:t>
+      </w:r>
+      <w:r>
+        <w:t xml:space="preserve">Then for the three areas already covered in the site, </w:t>
+      </w:r>
+      <w:r>
+        <w:t>Lisbon, Porto, and the Algarve regions</w:t>
+      </w:r>
+      <w:r>
+        <w:t>, e</w:t>
+      </w:r>
+      <w:r>
+        <w:t>xplain school types, public, private, international, bilingual</w:t>
+      </w:r>
+      <w:r>
+        <w:t xml:space="preserve"> requirements</w:t>
+      </w:r>
+      <w:r>
+        <w:t xml:space="preserve">, and boarding including language, curriculum, fees, admissions, and pros and cons. Include education levels from kindergarten through universities, entry ages, durations, and qualifications received. Detail residency and enrollment requirements, visa considerations, registration timelines, and zoning. Provide document checklists including translations and apostilles where needed. Outline costs, tuition, uh, </w:t>
+      </w:r>
+      <w:r>
+        <w:lastRenderedPageBreak/>
+        <w:t>registration fees, uniforms, books, and estimated annual totals. Add interactive features like cost calculators and school comparison filters. And add official resources like the Portuguese Ministry of Education and an important disclaimer about rules changing.</w:t>
+      </w:r>
+    </w:p>
+    <w:p/>
+    <w:p>
+      <w:r>
+        <w:t>In the “</w:t>
+      </w:r>
+      <w:r>
+        <w:t>Portuguese Education System &amp; Schooling Guide</w:t>
+      </w:r>
+      <w:r>
+        <w:t xml:space="preserve">” page, for all text between the characters </w:t>
+      </w:r>
+      <w:r>
+        <w:t>**</w:t>
+      </w:r>
+      <w:r>
+        <w:t xml:space="preserve"> </w:t>
+      </w:r>
+      <w:r>
+        <w:t>**</w:t>
+      </w:r>
+      <w:r>
+        <w:t xml:space="preserve">, change the text to be bold and remove the </w:t>
+      </w:r>
+      <w:r>
+        <w:t>**</w:t>
+      </w:r>
+      <w:r>
+        <w:t xml:space="preserve"> </w:t>
+      </w:r>
+      <w:r>
+        <w:t>**</w:t>
+      </w:r>
+      <w:r>
+        <w:t xml:space="preserve"> characters. Then, make all website https://www references into links.</w:t>
+      </w:r>
+    </w:p>
+    <w:p/>
+    <w:p>
+      <w:r>
+        <w:t>Under the “</w:t>
+      </w:r>
+      <w:r>
+        <w:t>Move Budget Breakdown</w:t>
+      </w:r>
+      <w:r>
+        <w:t>”, add under the text “</w:t>
+      </w:r>
+      <w:r>
+        <w:t>Estimated Initial Move Budget</w:t>
+      </w:r>
+      <w:r>
+        <w:t>” the following text “(includes 1 month rent and deposit).</w:t>
+      </w:r>
+      <w:r>
+        <w:t xml:space="preserve"> Then, </w:t>
+      </w:r>
+      <w:r>
+        <w:t>Under the section “</w:t>
+      </w:r>
+      <w:r>
+        <w:t>Move Budget Breakdown</w:t>
+      </w:r>
+      <w:r>
+        <w:t xml:space="preserve">” </w:t>
+      </w:r>
+      <w:r>
+        <w:t>change the text</w:t>
+      </w:r>
+      <w:r>
+        <w:t xml:space="preserve"> “Education”</w:t>
+      </w:r>
+      <w:r>
+        <w:t xml:space="preserve">, to </w:t>
+      </w:r>
+      <w:r>
+        <w:t>“</w:t>
+      </w:r>
+      <w:r>
+        <w:t>Education (</w:t>
+      </w:r>
+      <w:r>
+        <w:t>e.g.</w:t>
+      </w:r>
+      <w:r>
+        <w:t xml:space="preserve">: 1 </w:t>
+      </w:r>
+      <w:r>
+        <w:t>child at a Private School</w:t>
+      </w:r>
+      <w:r>
+        <w:t>)</w:t>
+      </w:r>
+      <w:r>
+        <w:t>”</w:t>
+      </w:r>
+      <w:r>
+        <w:t xml:space="preserve">, then </w:t>
+      </w:r>
+      <w:r>
+        <w:t>to calculate</w:t>
+      </w:r>
+      <w:r>
+        <w:t xml:space="preserve"> the amount </w:t>
+      </w:r>
+      <w:r>
+        <w:t>to display</w:t>
+      </w:r>
+      <w:r>
+        <w:t>,</w:t>
+      </w:r>
+      <w:r>
+        <w:t xml:space="preserve"> under the heading “</w:t>
+      </w:r>
+      <w:r>
+        <w:t>2. Private Schools (Escolas Privadas)</w:t>
+      </w:r>
+      <w:r>
+        <w:t xml:space="preserve">”, </w:t>
+      </w:r>
+      <w:r>
+        <w:t>add the upper and lower</w:t>
+      </w:r>
+      <w:r>
+        <w:t xml:space="preserve"> amounts displayed in the paragraph </w:t>
+      </w:r>
+      <w:r>
+        <w:t>“</w:t>
+      </w:r>
+      <w:r>
+        <w:t>Fees &amp; Costs:</w:t>
+      </w:r>
+      <w:r>
+        <w:t>”, then divide it by 2</w:t>
+      </w:r>
+      <w:r>
+        <w:t xml:space="preserve">. For the </w:t>
+      </w:r>
+      <w:r>
+        <w:t>“</w:t>
+      </w:r>
+      <w:r>
+        <w:t>Estimated Local Monthly Expenses:</w:t>
+      </w:r>
+      <w:r>
+        <w:t>”</w:t>
+      </w:r>
+      <w:r>
+        <w:t>,</w:t>
+      </w:r>
+      <w:r>
+        <w:t xml:space="preserve"> </w:t>
+      </w:r>
+      <w:r>
+        <w:t xml:space="preserve">take the calculated amount and </w:t>
+      </w:r>
+      <w:r>
+        <w:t>divide it by 12</w:t>
+      </w:r>
+      <w:r>
+        <w:t xml:space="preserve"> and add it to the monthly amount</w:t>
+      </w:r>
+      <w:r>
+        <w:t>.</w:t>
+      </w:r>
+      <w:r>
+        <w:t xml:space="preserve"> </w:t>
+      </w:r>
+    </w:p>
+    <w:p/>
+    <w:p>
+      <w:r>
+        <w:t>In the “</w:t>
+      </w:r>
+      <w:r>
+        <w:t>Portuguese Education System &amp; Schooling Guide</w:t>
+      </w:r>
+      <w:r>
+        <w:t xml:space="preserve">” page, for all text between the characters </w:t>
+      </w:r>
+      <w:r>
+        <w:t>*</w:t>
+      </w:r>
+      <w:r>
+        <w:t xml:space="preserve"> </w:t>
+      </w:r>
+      <w:r>
+        <w:t>*</w:t>
+      </w:r>
+      <w:r>
+        <w:t xml:space="preserve">, change the text to be underlined and remove the </w:t>
+      </w:r>
+      <w:r>
+        <w:t>*</w:t>
+      </w:r>
+      <w:r>
+        <w:t xml:space="preserve"> </w:t>
+      </w:r>
+      <w:r>
+        <w:t>*</w:t>
+      </w:r>
+      <w:r>
+        <w:t xml:space="preserve"> characters.</w:t>
+      </w:r>
+    </w:p>
+    <w:p>
+      <w:r>
+        <w:t>Under the “</w:t>
+      </w:r>
+      <w:r>
+        <w:t>Move Budget Breakdown</w:t>
+      </w:r>
+      <w:r>
+        <w:t xml:space="preserve">”, </w:t>
+      </w:r>
+      <w:r>
+        <w:t>change the text</w:t>
+      </w:r>
+      <w:r>
+        <w:t xml:space="preserve"> </w:t>
+      </w:r>
+      <w:r>
+        <w:t xml:space="preserve">“Education (e.g.: 1 child at a Private School)” </w:t>
+      </w:r>
+      <w:r>
+        <w:t xml:space="preserve">to </w:t>
+      </w:r>
+      <w:r>
+        <w:t>“Education (1 child at a Private School)”, then to calculate the amount to display, under the heading “</w:t>
+      </w:r>
+      <w:r>
+        <w:t>2. Private Schools (Escolas Privadas)</w:t>
+      </w:r>
+      <w:r>
+        <w:t>”, add the upper and lower amounts displayed in the paragraph “</w:t>
+      </w:r>
+      <w:r>
+        <w:t>Fees &amp; Costs:</w:t>
+      </w:r>
+      <w:r>
+        <w:t>”, then divide it by 2</w:t>
+      </w:r>
+      <w:r>
+        <w:t xml:space="preserve">, then </w:t>
+      </w:r>
+      <w:r>
+        <w:t>divide it by 12</w:t>
+      </w:r>
+      <w:r>
+        <w:t xml:space="preserve">. </w:t>
+      </w:r>
+      <w:r>
+        <w:t>After the amount</w:t>
+      </w:r>
+      <w:r>
+        <w:t xml:space="preserve"> displayed</w:t>
+      </w:r>
+      <w:r>
+        <w:t xml:space="preserve"> add “/mo”</w:t>
+      </w:r>
+      <w:r>
+        <w:t xml:space="preserve"> </w:t>
+      </w:r>
+      <w:r>
+        <w:t xml:space="preserve">and add </w:t>
+      </w:r>
+      <w:r>
+        <w:t xml:space="preserve">the amount </w:t>
+      </w:r>
+      <w:r>
+        <w:t xml:space="preserve">to the monthly amount. </w:t>
+      </w:r>
+    </w:p>
+    <w:p/>
+    <w:p>
+      <w:r>
+        <w:t>In the “</w:t>
+      </w:r>
+      <w:r>
+        <w:t>Portuguese Education System &amp; Schooling Guide</w:t>
+      </w:r>
+      <w:r>
+        <w:t xml:space="preserve">” page, centralize the text </w:t>
+      </w:r>
+      <w:r>
+        <w:t>“</w:t>
+      </w:r>
+      <w:r>
+        <w:t>Portuguese Education System &amp; Schooling Guide</w:t>
+      </w:r>
+      <w:r>
+        <w:t>, “</w:t>
+      </w:r>
+      <w:r>
+        <w:t>A complete logistical blueprint mapping school types, regional hubs (Lisbon, Porto, Algarve), curriculum models, and enrolment requirements for US expatriates</w:t>
+      </w:r>
+      <w:r>
+        <w:t>”, and “</w:t>
+      </w:r>
+      <w:r>
+        <w:t>Last Updated: August 10, 2026</w:t>
+      </w:r>
+      <w:r>
+        <w:t>”</w:t>
+      </w:r>
+    </w:p>
+    <w:p/>
+    <w:p>
+      <w:r>
+        <w:t>In the “</w:t>
+      </w:r>
+      <w:r>
+        <w:t>Portuguese Education System &amp; Schooling Guide</w:t>
+      </w:r>
+      <w:r>
+        <w:t>” page, under the heading “</w:t>
+      </w:r>
+      <w:r>
+        <w:t>Official Resources &amp; Disclaimer</w:t>
+      </w:r>
+      <w:r>
+        <w:t xml:space="preserve">” change the link </w:t>
+      </w:r>
+      <w:r>
+        <w:t>from</w:t>
+      </w:r>
+      <w:r>
+        <w:t xml:space="preserve"> the paragraph “</w:t>
+      </w:r>
+      <w:r>
+        <w:t>Portal das Matrículas (Enrolment Portal):</w:t>
+      </w:r>
+      <w:r>
+        <w:t>” from “</w:t>
+      </w:r>
+      <w:r>
+        <w:t xml:space="preserve">https://portaldasmatriculas.apambiente.pt </w:t>
+      </w:r>
+      <w:proofErr w:type="gramStart"/>
+      <w:r>
+        <w:t>“ to</w:t>
+      </w:r>
+      <w:proofErr w:type="gramEnd"/>
+      <w:r>
+        <w:t xml:space="preserve"> “</w:t>
+      </w:r>
+      <w:r>
+        <w:t>https://www.bemvindo.app/life/enrolling-child-school</w:t>
+      </w:r>
+      <w:r>
+        <w:t>”.</w:t>
+      </w:r>
+    </w:p>
+    <w:p/>
+    <w:p>
+      <w:r>
+        <w:t>On the primary page under the section “</w:t>
+      </w:r>
+      <w:r>
+        <w:t>Move Budget Breakdown</w:t>
+      </w:r>
+      <w:r>
+        <w:t>”, calculate the “</w:t>
+      </w:r>
+      <w:r>
+        <w:t>Education (1 child at a Private School)</w:t>
+      </w:r>
+      <w:r>
+        <w:t>” as follows</w:t>
+      </w:r>
+      <w:r>
+        <w:t>:</w:t>
+      </w:r>
+    </w:p>
+    <w:p>
+      <w:r>
+        <w:t>On the “</w:t>
+      </w:r>
+      <w:r>
+        <w:t>Portuguese Education System &amp; Schooling Guide</w:t>
+      </w:r>
+      <w:r>
+        <w:t xml:space="preserve">” page, under the </w:t>
+      </w:r>
+      <w:r>
+        <w:t>section “</w:t>
+      </w:r>
+      <w:r>
+        <w:t>School Directory &amp; Regional Comparisons</w:t>
+      </w:r>
+      <w:r>
+        <w:t>”, for all schools listed that do not include B</w:t>
+      </w:r>
+      <w:r>
+        <w:t>o</w:t>
+      </w:r>
+      <w:r>
+        <w:t>a</w:t>
+      </w:r>
+      <w:r>
+        <w:t>rd</w:t>
+      </w:r>
+      <w:r>
+        <w:t>ing</w:t>
+      </w:r>
+      <w:r>
+        <w:t xml:space="preserve">, add all the lower </w:t>
+      </w:r>
+      <w:r>
+        <w:t>“</w:t>
+      </w:r>
+      <w:r>
+        <w:t>Estimated Annual Fees:</w:t>
+      </w:r>
+      <w:r>
+        <w:t>” and the higher “</w:t>
+      </w:r>
+      <w:r>
+        <w:t>Estimated Annual Fees:</w:t>
+      </w:r>
+      <w:r>
+        <w:t xml:space="preserve">”, then divide </w:t>
+      </w:r>
+      <w:r>
+        <w:t>the solution by the number of amounts added together</w:t>
+      </w:r>
+      <w:r>
+        <w:t>,</w:t>
+      </w:r>
+      <w:r>
+        <w:t xml:space="preserve"> then divide that amount by 12.</w:t>
+      </w:r>
+    </w:p>
+    <w:p/>
+    <w:p>
+      <w:r>
+        <w:t>On the primary page under the section “</w:t>
+      </w:r>
+      <w:r>
+        <w:t>Move Budget Breakdown</w:t>
+      </w:r>
+      <w:r>
+        <w:t xml:space="preserve">”, from the text </w:t>
+      </w:r>
+      <w:proofErr w:type="gramStart"/>
+      <w:r>
+        <w:t>“ “</w:t>
+      </w:r>
+      <w:proofErr w:type="gramEnd"/>
+      <w:r>
+        <w:t>Education (1 child at a Private School)</w:t>
+      </w:r>
+      <w:r>
+        <w:t xml:space="preserve">” remove the text </w:t>
+      </w:r>
+      <w:proofErr w:type="gramStart"/>
+      <w:r>
+        <w:t xml:space="preserve">“ </w:t>
+      </w:r>
+      <w:r>
+        <w:t>(</w:t>
+      </w:r>
+      <w:proofErr w:type="gramEnd"/>
+      <w:r>
+        <w:t>1 child at a Private School</w:t>
+      </w:r>
+      <w:r>
+        <w:t xml:space="preserve">)” and then add below the </w:t>
+      </w:r>
+      <w:r>
+        <w:t xml:space="preserve">remaining </w:t>
+      </w:r>
+      <w:r>
+        <w:t>text</w:t>
+      </w:r>
+      <w:r>
+        <w:t xml:space="preserve"> “</w:t>
+      </w:r>
+      <w:r>
+        <w:t>Education</w:t>
+      </w:r>
+      <w:r>
+        <w:t xml:space="preserve">” the text </w:t>
+      </w:r>
+      <w:r>
+        <w:t>“One child at international school”.</w:t>
       </w:r>
     </w:p>
     <w:p/>
@@ -7587,633 +8821,107 @@
         <w:pStyle w:val="Heading1"/>
       </w:pPr>
       <w:r>
-        <w:t>Education</w:t>
-      </w:r>
-    </w:p>
-    <w:p>
-      <w:r>
-        <w:t>Under the section “</w:t>
-      </w:r>
-      <w:r>
-        <w:t>Move Budget Breakdown</w:t>
-      </w:r>
-      <w:r>
-        <w:t xml:space="preserve">” add </w:t>
-      </w:r>
-      <w:r>
-        <w:t>a category called “Education”.</w:t>
+        <w:t>Pets</w:t>
+      </w:r>
+    </w:p>
+    <w:p>
+      <w:r>
+        <w:t>In the “</w:t>
+      </w:r>
+      <w:r>
+        <w:t>Relocating to Portugal with Pets</w:t>
+      </w:r>
+      <w:r>
+        <w:t>” page,</w:t>
+      </w:r>
+      <w:r>
+        <w:t xml:space="preserve"> in the “</w:t>
+      </w:r>
+      <w:r>
+        <w:t>Essential Entry Requirements</w:t>
+      </w:r>
+      <w:r>
+        <w:t xml:space="preserve">” section, under the heading </w:t>
+      </w:r>
+      <w:r>
+        <w:t>“</w:t>
+      </w:r>
+      <w:r>
+        <w:t>1. ISO Microchip Requirement</w:t>
+      </w:r>
+      <w:r>
+        <w:t>”, move the sentence “</w:t>
+      </w:r>
+      <w:r>
+        <w:t>Critical: The microchip must be implanted before or on the same day as the qualifying rabies vaccine.</w:t>
+      </w:r>
+      <w:r>
+        <w:t xml:space="preserve">” </w:t>
+      </w:r>
+      <w:r>
+        <w:t>t</w:t>
+      </w:r>
+      <w:r>
+        <w:t xml:space="preserve">o its own paragraph. </w:t>
+      </w:r>
+      <w:r>
+        <w:t xml:space="preserve">Then </w:t>
+      </w:r>
+      <w:r>
+        <w:t>change the heading “</w:t>
+      </w:r>
+      <w:r>
+        <w:t>3. EU Health Certificate &amp; USDA Endorsement</w:t>
+      </w:r>
+      <w:r>
+        <w:t>” to “</w:t>
+      </w:r>
+      <w:r>
+        <w:t>3. EU Health Certificate &amp; U.S. Department of Agriculture</w:t>
+      </w:r>
+      <w:r>
+        <w:t xml:space="preserve"> (</w:t>
+      </w:r>
+      <w:r>
+        <w:t>USDA</w:t>
+      </w:r>
+      <w:r>
+        <w:t>)</w:t>
+      </w:r>
+      <w:r>
+        <w:t xml:space="preserve"> Endorsement</w:t>
+      </w:r>
+      <w:r>
+        <w:t xml:space="preserve">”. </w:t>
+      </w:r>
+      <w:r>
+        <w:t xml:space="preserve">Then, change the text </w:t>
+      </w:r>
+      <w:r>
+        <w:t>“</w:t>
+      </w:r>
+      <w:r>
+        <w:t>APHIS</w:t>
+      </w:r>
+      <w:r>
+        <w:t>”</w:t>
+      </w:r>
+      <w:r>
+        <w:t xml:space="preserve"> to </w:t>
+      </w:r>
+      <w:proofErr w:type="gramStart"/>
+      <w:r>
+        <w:t>“</w:t>
       </w:r>
       <w:r>
         <w:t xml:space="preserve"> </w:t>
       </w:r>
       <w:r>
-        <w:t>Then make it a link to a separate page which will contain</w:t>
-      </w:r>
-      <w:r>
-        <w:t xml:space="preserve"> </w:t>
-      </w:r>
-      <w:r>
-        <w:t>an</w:t>
-      </w:r>
-      <w:r>
-        <w:t xml:space="preserve"> introduction </w:t>
-      </w:r>
-      <w:r>
-        <w:t xml:space="preserve">to the Portuguese </w:t>
-      </w:r>
-      <w:r>
-        <w:t xml:space="preserve">education system. </w:t>
-      </w:r>
-      <w:r>
-        <w:t xml:space="preserve">Then for the three areas already covered in the site, </w:t>
-      </w:r>
-      <w:r>
-        <w:t>Lisbon, Porto, and the Algarve regions</w:t>
-      </w:r>
-      <w:r>
-        <w:t>, e</w:t>
-      </w:r>
-      <w:r>
-        <w:t>xplain school types, public, private, international, bilingual</w:t>
-      </w:r>
-      <w:r>
-        <w:t xml:space="preserve"> requirements</w:t>
-      </w:r>
-      <w:r>
-        <w:t>, and boarding including language, curriculum, fees, admissions, and pros and cons. Include education levels from kindergarten through universities, entry ages, durations, and qualifications received. Detail residency and enrollment requirements, visa considerations, registration timelines, and zoning. Provide document checklists including translations and apostilles where needed. Outline costs, tuition, uh, registration fees, uniforms, books, and estimated annual totals. Add interactive features like cost calculators and school comparison filters. And add official resources like the Portuguese Ministry of Education and an important disclaimer about rules changing.</w:t>
-      </w:r>
-    </w:p>
-    <w:p/>
-    <w:p>
-      <w:r>
-        <w:t>In the “</w:t>
-      </w:r>
-      <w:r>
-        <w:t>Portuguese Education System &amp; Schooling Guide</w:t>
-      </w:r>
-      <w:r>
-        <w:t xml:space="preserve">” page, for all text between the characters </w:t>
-      </w:r>
-      <w:r>
-        <w:t>**</w:t>
-      </w:r>
-      <w:r>
-        <w:t xml:space="preserve"> </w:t>
-      </w:r>
-      <w:r>
-        <w:t>**</w:t>
-      </w:r>
-      <w:r>
-        <w:t xml:space="preserve">, change the text to be bold and remove the </w:t>
-      </w:r>
-      <w:r>
-        <w:t>**</w:t>
-      </w:r>
-      <w:r>
-        <w:t xml:space="preserve"> </w:t>
-      </w:r>
-      <w:r>
-        <w:t>**</w:t>
-      </w:r>
-      <w:r>
-        <w:t xml:space="preserve"> characters. Then, make all website https://www references into links.</w:t>
-      </w:r>
-    </w:p>
-    <w:p/>
-    <w:p>
-      <w:r>
-        <w:t>Under the “</w:t>
-      </w:r>
-      <w:r>
-        <w:t>Move Budget Breakdown</w:t>
-      </w:r>
-      <w:r>
-        <w:t>”, add under the text “</w:t>
-      </w:r>
-      <w:r>
-        <w:t>Estimated Initial Move Budget</w:t>
-      </w:r>
-      <w:r>
-        <w:t>” the following text “(includes 1 month rent and deposit).</w:t>
-      </w:r>
-      <w:r>
-        <w:t xml:space="preserve"> Then, </w:t>
-      </w:r>
-      <w:r>
-        <w:t>Under the section “</w:t>
-      </w:r>
-      <w:r>
-        <w:t>Move Budget Breakdown</w:t>
-      </w:r>
-      <w:r>
-        <w:t xml:space="preserve">” </w:t>
-      </w:r>
-      <w:r>
-        <w:t>change the text</w:t>
-      </w:r>
-      <w:r>
-        <w:t xml:space="preserve"> “Education”</w:t>
-      </w:r>
-      <w:r>
-        <w:t xml:space="preserve">, to </w:t>
-      </w:r>
-      <w:r>
-        <w:t>“</w:t>
-      </w:r>
-      <w:r>
-        <w:t>Education (</w:t>
-      </w:r>
-      <w:r>
-        <w:t>e.g.</w:t>
-      </w:r>
-      <w:r>
-        <w:t xml:space="preserve">: 1 </w:t>
-      </w:r>
-      <w:r>
-        <w:t>child at a Private School</w:t>
-      </w:r>
-      <w:r>
-        <w:t>)</w:t>
-      </w:r>
-      <w:r>
-        <w:t>”</w:t>
-      </w:r>
-      <w:r>
-        <w:t xml:space="preserve">, then </w:t>
-      </w:r>
-      <w:r>
-        <w:t>to calculate</w:t>
-      </w:r>
-      <w:r>
-        <w:t xml:space="preserve"> the amount </w:t>
-      </w:r>
-      <w:r>
-        <w:t>to display</w:t>
-      </w:r>
-      <w:r>
-        <w:t>,</w:t>
-      </w:r>
-      <w:r>
-        <w:t xml:space="preserve"> under the heading “</w:t>
-      </w:r>
-      <w:r>
-        <w:t>2. Private Schools (Escolas Privadas)</w:t>
-      </w:r>
-      <w:r>
-        <w:t xml:space="preserve">”, </w:t>
-      </w:r>
-      <w:r>
-        <w:t>add the upper and lower</w:t>
-      </w:r>
-      <w:r>
-        <w:t xml:space="preserve"> amounts displayed in the paragraph </w:t>
-      </w:r>
-      <w:r>
-        <w:t>“</w:t>
-      </w:r>
-      <w:r>
-        <w:t>Fees &amp; Costs:</w:t>
-      </w:r>
-      <w:r>
-        <w:t>”, then divide it by 2</w:t>
-      </w:r>
-      <w:r>
-        <w:t xml:space="preserve">. For the </w:t>
-      </w:r>
-      <w:r>
-        <w:t>“</w:t>
-      </w:r>
-      <w:r>
-        <w:t>Estimated Local Monthly Expenses:</w:t>
-      </w:r>
-      <w:r>
-        <w:t>”</w:t>
-      </w:r>
-      <w:r>
-        <w:t>,</w:t>
-      </w:r>
-      <w:r>
-        <w:t xml:space="preserve"> </w:t>
-      </w:r>
-      <w:r>
-        <w:t xml:space="preserve">take the calculated amount and </w:t>
-      </w:r>
-      <w:r>
-        <w:t>divide it by 12</w:t>
-      </w:r>
-      <w:r>
-        <w:t xml:space="preserve"> and add it to the monthly amount</w:t>
-      </w:r>
-      <w:r>
-        <w:t>.</w:t>
-      </w:r>
-      <w:r>
-        <w:t xml:space="preserve"> </w:t>
-      </w:r>
-    </w:p>
-    <w:p/>
-    <w:p>
-      <w:r>
-        <w:lastRenderedPageBreak/>
-        <w:t>In the “</w:t>
-      </w:r>
-      <w:r>
-        <w:t>Portuguese Education System &amp; Schooling Guide</w:t>
-      </w:r>
-      <w:r>
-        <w:t xml:space="preserve">” page, for all text between the characters </w:t>
-      </w:r>
-      <w:r>
-        <w:t>*</w:t>
-      </w:r>
-      <w:r>
-        <w:t xml:space="preserve"> </w:t>
-      </w:r>
-      <w:r>
-        <w:t>*</w:t>
-      </w:r>
-      <w:r>
-        <w:t xml:space="preserve">, change the text to be underlined and remove the </w:t>
-      </w:r>
-      <w:r>
-        <w:t>*</w:t>
-      </w:r>
-      <w:r>
-        <w:t xml:space="preserve"> </w:t>
-      </w:r>
-      <w:r>
-        <w:t>*</w:t>
-      </w:r>
-      <w:r>
-        <w:t xml:space="preserve"> characters.</w:t>
-      </w:r>
-    </w:p>
-    <w:p>
-      <w:r>
-        <w:t>Under the “</w:t>
-      </w:r>
-      <w:r>
-        <w:t>Move Budget Breakdown</w:t>
-      </w:r>
-      <w:r>
-        <w:t xml:space="preserve">”, </w:t>
-      </w:r>
-      <w:r>
-        <w:t>change the text</w:t>
-      </w:r>
-      <w:r>
-        <w:t xml:space="preserve"> </w:t>
-      </w:r>
-      <w:r>
-        <w:t xml:space="preserve">“Education (e.g.: 1 child at a Private School)” </w:t>
-      </w:r>
-      <w:r>
-        <w:t xml:space="preserve">to </w:t>
-      </w:r>
-      <w:r>
-        <w:t>“Education (1 child at a Private School)”, then to calculate the amount to display, under the heading “</w:t>
-      </w:r>
-      <w:r>
-        <w:t>2. Private Schools (Escolas Privadas)</w:t>
-      </w:r>
-      <w:r>
-        <w:t>”, add the upper and lower amounts displayed in the paragraph “</w:t>
-      </w:r>
-      <w:r>
-        <w:t>Fees &amp; Costs:</w:t>
-      </w:r>
-      <w:r>
-        <w:t>”, then divide it by 2</w:t>
-      </w:r>
-      <w:r>
-        <w:t xml:space="preserve">, then </w:t>
-      </w:r>
-      <w:r>
-        <w:t>divide it by 12</w:t>
-      </w:r>
-      <w:r>
-        <w:t xml:space="preserve">. </w:t>
-      </w:r>
-      <w:r>
-        <w:t>After the amount</w:t>
-      </w:r>
-      <w:r>
-        <w:t xml:space="preserve"> displayed</w:t>
-      </w:r>
-      <w:r>
-        <w:t xml:space="preserve"> add “/mo”</w:t>
-      </w:r>
-      <w:r>
-        <w:t xml:space="preserve"> </w:t>
-      </w:r>
-      <w:r>
-        <w:t xml:space="preserve">and add </w:t>
-      </w:r>
-      <w:r>
-        <w:t xml:space="preserve">the amount </w:t>
-      </w:r>
-      <w:r>
-        <w:t xml:space="preserve">to the monthly amount. </w:t>
-      </w:r>
-    </w:p>
-    <w:p/>
-    <w:p>
-      <w:r>
-        <w:t>In the “</w:t>
-      </w:r>
-      <w:r>
-        <w:t>Portuguese Education System &amp; Schooling Guide</w:t>
-      </w:r>
-      <w:r>
-        <w:t xml:space="preserve">” page, centralize the text </w:t>
-      </w:r>
-      <w:r>
-        <w:t>“</w:t>
-      </w:r>
-      <w:r>
-        <w:t>Portuguese Education System &amp; Schooling Guide</w:t>
-      </w:r>
-      <w:r>
-        <w:t>, “</w:t>
-      </w:r>
-      <w:r>
-        <w:t>A complete logistical blueprint mapping school types, regional hubs (Lisbon, Porto, Algarve), curriculum models, and enrolment requirements for US expatriates</w:t>
-      </w:r>
-      <w:r>
-        <w:t>”, and “</w:t>
-      </w:r>
-      <w:r>
-        <w:t>Last Updated: August 10, 2026</w:t>
-      </w:r>
-      <w:r>
-        <w:t>”</w:t>
-      </w:r>
-    </w:p>
-    <w:p/>
-    <w:p>
-      <w:r>
-        <w:t>In the “</w:t>
-      </w:r>
-      <w:r>
-        <w:t>Portuguese Education System &amp; Schooling Guide</w:t>
-      </w:r>
-      <w:r>
-        <w:t>” page, under the heading “</w:t>
-      </w:r>
-      <w:r>
-        <w:t>Official Resources &amp; Disclaimer</w:t>
-      </w:r>
-      <w:r>
-        <w:t xml:space="preserve">” change the link </w:t>
-      </w:r>
-      <w:r>
-        <w:t>from</w:t>
-      </w:r>
-      <w:r>
-        <w:t xml:space="preserve"> the paragraph “</w:t>
-      </w:r>
-      <w:r>
-        <w:t>Portal das Matrículas (Enrolment Portal):</w:t>
-      </w:r>
-      <w:r>
-        <w:t>” from “</w:t>
-      </w:r>
-      <w:r>
-        <w:t xml:space="preserve">https://portaldasmatriculas.apambiente.pt </w:t>
-      </w:r>
-      <w:r>
-        <w:t>“ to “</w:t>
-      </w:r>
-      <w:r>
-        <w:t>https://www.bemvindo.app/life/enrolling-child-school</w:t>
-      </w:r>
-      <w:r>
-        <w:t>”.</w:t>
-      </w:r>
-    </w:p>
-    <w:p/>
-    <w:p>
-      <w:r>
-        <w:t>On the primary page under the section “</w:t>
-      </w:r>
-      <w:r>
-        <w:t>Move Budget Breakdown</w:t>
-      </w:r>
-      <w:r>
-        <w:t>”, calculate the “</w:t>
-      </w:r>
-      <w:r>
-        <w:t>Education (1 child at a Private School)</w:t>
-      </w:r>
-      <w:r>
-        <w:t>” as follows</w:t>
-      </w:r>
-      <w:r>
-        <w:t>:</w:t>
-      </w:r>
-    </w:p>
-    <w:p>
-      <w:r>
-        <w:t>On the “</w:t>
-      </w:r>
-      <w:r>
-        <w:t>Portuguese Education System &amp; Schooling Guide</w:t>
-      </w:r>
-      <w:r>
-        <w:t xml:space="preserve">” page, under the </w:t>
-      </w:r>
-      <w:r>
-        <w:t>section “</w:t>
-      </w:r>
-      <w:r>
-        <w:t>School Directory &amp; Regional Comparisons</w:t>
-      </w:r>
-      <w:r>
-        <w:t>”, for all schools listed that do not include B</w:t>
-      </w:r>
-      <w:r>
-        <w:t>o</w:t>
-      </w:r>
-      <w:r>
-        <w:t>a</w:t>
-      </w:r>
-      <w:r>
-        <w:t>rd</w:t>
-      </w:r>
-      <w:r>
-        <w:t>ing</w:t>
-      </w:r>
-      <w:r>
-        <w:t xml:space="preserve">, add all the lower </w:t>
-      </w:r>
-      <w:r>
-        <w:t>“</w:t>
-      </w:r>
-      <w:r>
-        <w:t>Estimated Annual Fees:</w:t>
-      </w:r>
-      <w:r>
-        <w:t>” and the higher “</w:t>
-      </w:r>
-      <w:r>
-        <w:t>Estimated Annual Fees:</w:t>
-      </w:r>
-      <w:r>
-        <w:t xml:space="preserve">”, then divide </w:t>
-      </w:r>
-      <w:r>
-        <w:t>the solution by the number of amounts added together</w:t>
-      </w:r>
-      <w:r>
-        <w:t>,</w:t>
-      </w:r>
-      <w:r>
-        <w:t xml:space="preserve"> then divide that amount by 12.</w:t>
-      </w:r>
-    </w:p>
-    <w:p/>
-    <w:p>
-      <w:r>
-        <w:t>On the primary page under the section “</w:t>
-      </w:r>
-      <w:r>
-        <w:t>Move Budget Breakdown</w:t>
-      </w:r>
-      <w:r>
-        <w:t>”, from the text “ “</w:t>
-      </w:r>
-      <w:r>
-        <w:t>Education (1 child at a Private School)</w:t>
-      </w:r>
-      <w:r>
-        <w:t xml:space="preserve">” remove the text “ </w:t>
-      </w:r>
-      <w:r>
-        <w:t>(1 child at a Private School</w:t>
-      </w:r>
-      <w:r>
-        <w:t xml:space="preserve">)” and then add below the </w:t>
-      </w:r>
-      <w:r>
-        <w:t xml:space="preserve">remaining </w:t>
-      </w:r>
-      <w:r>
-        <w:t>text</w:t>
-      </w:r>
-      <w:r>
-        <w:t xml:space="preserve"> “</w:t>
-      </w:r>
-      <w:r>
-        <w:t>Education</w:t>
-      </w:r>
-      <w:r>
-        <w:t xml:space="preserve">” the text </w:t>
-      </w:r>
-      <w:r>
-        <w:t>“One child at international school”.</w:t>
-      </w:r>
-    </w:p>
-    <w:p/>
-    <w:p/>
-    <w:p>
-      <w:pPr>
-        <w:pStyle w:val="Heading1"/>
-      </w:pPr>
-      <w:r>
-        <w:lastRenderedPageBreak/>
-        <w:t>Pets</w:t>
-      </w:r>
-    </w:p>
-    <w:p>
-      <w:r>
-        <w:t>In the “</w:t>
-      </w:r>
-      <w:r>
-        <w:t>Relocating to Portugal with Pets</w:t>
-      </w:r>
-      <w:r>
-        <w:t>” page,</w:t>
-      </w:r>
-      <w:r>
-        <w:t xml:space="preserve"> in the “</w:t>
-      </w:r>
-      <w:r>
-        <w:t>Essential Entry Requirements</w:t>
-      </w:r>
-      <w:r>
-        <w:t xml:space="preserve">” section, under the heading </w:t>
-      </w:r>
-      <w:r>
-        <w:t>“</w:t>
-      </w:r>
-      <w:r>
-        <w:t>1. ISO Microchip Requirement</w:t>
-      </w:r>
-      <w:r>
-        <w:t>”, move the sentence “</w:t>
-      </w:r>
-      <w:r>
-        <w:t>Critical: The microchip must be implanted before or on the same day as the qualifying rabies vaccine.</w:t>
-      </w:r>
-      <w:r>
-        <w:t xml:space="preserve">” </w:t>
-      </w:r>
-      <w:r>
-        <w:t>t</w:t>
-      </w:r>
-      <w:r>
-        <w:t xml:space="preserve">o its own paragraph. </w:t>
-      </w:r>
-      <w:r>
-        <w:t xml:space="preserve">Then </w:t>
-      </w:r>
-      <w:r>
-        <w:t>change the heading “</w:t>
-      </w:r>
-      <w:r>
-        <w:t>3. EU Health Certificate &amp; USDA Endorsement</w:t>
-      </w:r>
-      <w:r>
-        <w:t>” to “</w:t>
-      </w:r>
-      <w:r>
-        <w:t>3. EU Health Certificate &amp; U.S. Department of Agriculture</w:t>
-      </w:r>
-      <w:r>
-        <w:t xml:space="preserve"> (</w:t>
-      </w:r>
-      <w:r>
-        <w:t>USDA</w:t>
-      </w:r>
-      <w:r>
-        <w:t>)</w:t>
-      </w:r>
-      <w:r>
-        <w:t xml:space="preserve"> Endorsement</w:t>
-      </w:r>
-      <w:r>
-        <w:t xml:space="preserve">”. </w:t>
-      </w:r>
-      <w:r>
-        <w:t xml:space="preserve">Then, change the text </w:t>
-      </w:r>
-      <w:r>
-        <w:t>“</w:t>
-      </w:r>
-      <w:r>
-        <w:t>APHIS</w:t>
-      </w:r>
-      <w:r>
-        <w:t>”</w:t>
-      </w:r>
-      <w:r>
-        <w:t xml:space="preserve"> to “</w:t>
-      </w:r>
-      <w:r>
-        <w:t xml:space="preserve"> </w:t>
-      </w:r>
-      <w:r>
-        <w:t>Animal and Plant Health Inspection Service (APHIS)</w:t>
+        <w:t>Animal</w:t>
+      </w:r>
+      <w:proofErr w:type="gramEnd"/>
+      <w:r>
+        <w:t xml:space="preserve"> and Plant Health Inspection Service (APHIS)</w:t>
       </w:r>
       <w:r>
         <w:t>”</w:t>
@@ -8415,7 +9123,11 @@
         <w:t xml:space="preserve">. </w:t>
       </w:r>
       <w:r>
-        <w:t>Then, in the “</w:t>
+        <w:t xml:space="preserve">Then, in the </w:t>
+      </w:r>
+      <w:r>
+        <w:lastRenderedPageBreak/>
+        <w:t>“</w:t>
       </w:r>
       <w:r>
         <w:t>Relocation Costs: DIY vs. Pet Transport Services</w:t>
@@ -8621,90 +9333,131 @@
     <w:p/>
     <w:p>
       <w:r>
+        <w:t>In the “</w:t>
+      </w:r>
+      <w:r>
+        <w:t>Move Budget Breakdown</w:t>
+      </w:r>
+      <w:r>
+        <w:t>” section, “</w:t>
+      </w:r>
+      <w:r>
+        <w:t>Pet Relocation &amp; Compliance</w:t>
+      </w:r>
+      <w:r>
+        <w:t xml:space="preserve"> (</w:t>
+      </w:r>
+      <w:r>
+        <w:t xml:space="preserve">DIY Estimate </w:t>
+      </w:r>
+      <w:r>
+        <w:t xml:space="preserve">per pet)” line, the amount is calculated from </w:t>
+      </w:r>
+      <w:r>
+        <w:t xml:space="preserve">the </w:t>
+      </w:r>
+      <w:r>
+        <w:t>“</w:t>
+      </w:r>
+      <w:r>
+        <w:t>Relocating to Portugal with Pets</w:t>
+      </w:r>
+      <w:r>
+        <w:t>” page</w:t>
+      </w:r>
+      <w:r>
+        <w:t xml:space="preserve"> </w:t>
+      </w:r>
+      <w:r>
+        <w:t xml:space="preserve">under the “Relocation Costs: DIY vs. Pet Transport Services” section, </w:t>
+      </w:r>
+      <w:r>
+        <w:t xml:space="preserve">the </w:t>
+      </w:r>
+      <w:r>
+        <w:t xml:space="preserve">lower </w:t>
+      </w:r>
+      <w:r>
+        <w:t xml:space="preserve">amount </w:t>
+      </w:r>
+      <w:r>
+        <w:t xml:space="preserve">in the </w:t>
+      </w:r>
+      <w:r>
+        <w:t xml:space="preserve">“DIY Estimate (USD)” column added to the </w:t>
+      </w:r>
+      <w:r>
+        <w:t>upper</w:t>
+      </w:r>
+      <w:r>
+        <w:t xml:space="preserve"> amount in the “DIY Estimate (USD)” </w:t>
+      </w:r>
+      <w:r>
+        <w:t>then divided by 2.</w:t>
+      </w:r>
+    </w:p>
+    <w:p>
+      <w:r>
+        <w:t>On the “</w:t>
+      </w:r>
+      <w:r>
+        <w:t>Moving to Portugal with Pets: Complete US Expat Compliance Guide</w:t>
+      </w:r>
+      <w:r>
+        <w:t>” page, change the text “</w:t>
+      </w:r>
+      <w:r>
+        <w:t>A complete compliance guide for US citizens moving dogs and cats to Portugal, outlining microchips, veterinary certificates, timelines, and costs.</w:t>
+      </w:r>
+      <w:r>
+        <w:t>” to “</w:t>
+      </w:r>
+      <w:r>
+        <w:t>Moving to Portugal with pets</w:t>
+      </w:r>
+      <w:r>
+        <w:t xml:space="preserve">? </w:t>
+      </w:r>
+      <w:proofErr w:type="gramStart"/>
+      <w:r>
+        <w:t>A</w:t>
+      </w:r>
+      <w:proofErr w:type="gramEnd"/>
+      <w:r>
+        <w:t xml:space="preserve"> complete compliance guide for US citizens moving dogs and cats to Portugal, outlining microchips, veterinary certificates, timelines, and costs.</w:t>
+      </w:r>
+      <w:r>
+        <w:t>”</w:t>
+      </w:r>
+    </w:p>
+    <w:p/>
+    <w:p/>
+    <w:p/>
+    <w:p/>
+    <w:p>
+      <w:pPr>
+        <w:pStyle w:val="Heading1"/>
+      </w:pPr>
+      <w:r>
+        <w:t>SEO</w:t>
+      </w:r>
+    </w:p>
+    <w:p>
+      <w:r>
+        <w:t xml:space="preserve">I am </w:t>
+      </w:r>
+      <w:r>
+        <w:t>an expert SEO consultant specializing in relocation websites</w:t>
+      </w:r>
+      <w:r>
+        <w:t>, and I am looking for</w:t>
+      </w:r>
+      <w:r>
+        <w:t xml:space="preserve">. keyword research, long-tail keywords, question-based queries, and the search intent </w:t>
+      </w:r>
+      <w:r>
         <w:lastRenderedPageBreak/>
-        <w:t>In the “</w:t>
-      </w:r>
-      <w:r>
-        <w:t>Move Budget Breakdown</w:t>
-      </w:r>
-      <w:r>
-        <w:t>” section, “</w:t>
-      </w:r>
-      <w:r>
-        <w:t>Pet Relocation &amp; Compliance</w:t>
-      </w:r>
-      <w:r>
-        <w:t xml:space="preserve"> (</w:t>
-      </w:r>
-      <w:r>
-        <w:t xml:space="preserve">DIY Estimate </w:t>
-      </w:r>
-      <w:r>
-        <w:t xml:space="preserve">per pet)” line, the amount is calculated from </w:t>
-      </w:r>
-      <w:r>
-        <w:t xml:space="preserve">the </w:t>
-      </w:r>
-      <w:r>
-        <w:t>“</w:t>
-      </w:r>
-      <w:r>
-        <w:t>Relocating to Portugal with Pets</w:t>
-      </w:r>
-      <w:r>
-        <w:t>” page</w:t>
-      </w:r>
-      <w:r>
-        <w:t xml:space="preserve"> </w:t>
-      </w:r>
-      <w:r>
-        <w:t xml:space="preserve">under the “Relocation Costs: DIY vs. Pet Transport Services” section, </w:t>
-      </w:r>
-      <w:r>
-        <w:t xml:space="preserve">the </w:t>
-      </w:r>
-      <w:r>
-        <w:t xml:space="preserve">lower </w:t>
-      </w:r>
-      <w:r>
-        <w:t xml:space="preserve">amount </w:t>
-      </w:r>
-      <w:r>
-        <w:t xml:space="preserve">in the </w:t>
-      </w:r>
-      <w:r>
-        <w:t xml:space="preserve">“DIY Estimate (USD)” column added to the </w:t>
-      </w:r>
-      <w:r>
-        <w:t>upper</w:t>
-      </w:r>
-      <w:r>
-        <w:t xml:space="preserve"> amount in the “DIY Estimate (USD)” </w:t>
-      </w:r>
-      <w:r>
-        <w:t>then divided by 2.</w:t>
-      </w:r>
-    </w:p>
-    <w:p>
-      <w:pPr>
-        <w:pStyle w:val="Heading1"/>
-      </w:pPr>
-      <w:r>
-        <w:t>SEO</w:t>
-      </w:r>
-    </w:p>
-    <w:p>
-      <w:r>
-        <w:t xml:space="preserve">I am </w:t>
-      </w:r>
-      <w:r>
-        <w:t>an expert SEO consultant specializing in relocation websites</w:t>
-      </w:r>
-      <w:r>
-        <w:t>, and I am looking for</w:t>
-      </w:r>
-      <w:r>
-        <w:t xml:space="preserve">. keyword research, long-tail keywords, question-based queries, and the search intent behind them. For </w:t>
+        <w:t xml:space="preserve">behind them. For </w:t>
       </w:r>
       <w:r>
         <w:t>site</w:t>
@@ -9901,6 +10654,119 @@
         </w:tabs>
         <w:ind w:left="6480" w:hanging="360"/>
       </w:pPr>
+    </w:lvl>
+  </w:abstractNum>
+  <w:abstractNum w:abstractNumId="8" w15:restartNumberingAfterBreak="0">
+    <w:nsid w:val="7293546E"/>
+    <w:multiLevelType w:val="hybridMultilevel"/>
+    <w:tmpl w:val="8B2CC16A"/>
+    <w:lvl w:ilvl="0" w:tplc="04090001">
+      <w:start w:val="1"/>
+      <w:numFmt w:val="bullet"/>
+      <w:lvlText w:val=""/>
+      <w:lvlJc w:val="left"/>
+      <w:pPr>
+        <w:ind w:left="720" w:hanging="360"/>
+      </w:pPr>
+      <w:rPr>
+        <w:rFonts w:ascii="Symbol" w:hAnsi="Symbol" w:hint="default"/>
+      </w:rPr>
+    </w:lvl>
+    <w:lvl w:ilvl="1" w:tplc="04090003">
+      <w:start w:val="1"/>
+      <w:numFmt w:val="bullet"/>
+      <w:lvlText w:val="o"/>
+      <w:lvlJc w:val="left"/>
+      <w:pPr>
+        <w:ind w:left="1440" w:hanging="360"/>
+      </w:pPr>
+      <w:rPr>
+        <w:rFonts w:ascii="Courier New" w:hAnsi="Courier New" w:cs="Courier New" w:hint="default"/>
+      </w:rPr>
+    </w:lvl>
+    <w:lvl w:ilvl="2" w:tplc="04090005" w:tentative="1">
+      <w:start w:val="1"/>
+      <w:numFmt w:val="bullet"/>
+      <w:lvlText w:val=""/>
+      <w:lvlJc w:val="left"/>
+      <w:pPr>
+        <w:ind w:left="2160" w:hanging="360"/>
+      </w:pPr>
+      <w:rPr>
+        <w:rFonts w:ascii="Wingdings" w:hAnsi="Wingdings" w:hint="default"/>
+      </w:rPr>
+    </w:lvl>
+    <w:lvl w:ilvl="3" w:tplc="04090001" w:tentative="1">
+      <w:start w:val="1"/>
+      <w:numFmt w:val="bullet"/>
+      <w:lvlText w:val=""/>
+      <w:lvlJc w:val="left"/>
+      <w:pPr>
+        <w:ind w:left="2880" w:hanging="360"/>
+      </w:pPr>
+      <w:rPr>
+        <w:rFonts w:ascii="Symbol" w:hAnsi="Symbol" w:hint="default"/>
+      </w:rPr>
+    </w:lvl>
+    <w:lvl w:ilvl="4" w:tplc="04090003" w:tentative="1">
+      <w:start w:val="1"/>
+      <w:numFmt w:val="bullet"/>
+      <w:lvlText w:val="o"/>
+      <w:lvlJc w:val="left"/>
+      <w:pPr>
+        <w:ind w:left="3600" w:hanging="360"/>
+      </w:pPr>
+      <w:rPr>
+        <w:rFonts w:ascii="Courier New" w:hAnsi="Courier New" w:cs="Courier New" w:hint="default"/>
+      </w:rPr>
+    </w:lvl>
+    <w:lvl w:ilvl="5" w:tplc="04090005" w:tentative="1">
+      <w:start w:val="1"/>
+      <w:numFmt w:val="bullet"/>
+      <w:lvlText w:val=""/>
+      <w:lvlJc w:val="left"/>
+      <w:pPr>
+        <w:ind w:left="4320" w:hanging="360"/>
+      </w:pPr>
+      <w:rPr>
+        <w:rFonts w:ascii="Wingdings" w:hAnsi="Wingdings" w:hint="default"/>
+      </w:rPr>
+    </w:lvl>
+    <w:lvl w:ilvl="6" w:tplc="04090001" w:tentative="1">
+      <w:start w:val="1"/>
+      <w:numFmt w:val="bullet"/>
+      <w:lvlText w:val=""/>
+      <w:lvlJc w:val="left"/>
+      <w:pPr>
+        <w:ind w:left="5040" w:hanging="360"/>
+      </w:pPr>
+      <w:rPr>
+        <w:rFonts w:ascii="Symbol" w:hAnsi="Symbol" w:hint="default"/>
+      </w:rPr>
+    </w:lvl>
+    <w:lvl w:ilvl="7" w:tplc="04090003" w:tentative="1">
+      <w:start w:val="1"/>
+      <w:numFmt w:val="bullet"/>
+      <w:lvlText w:val="o"/>
+      <w:lvlJc w:val="left"/>
+      <w:pPr>
+        <w:ind w:left="5760" w:hanging="360"/>
+      </w:pPr>
+      <w:rPr>
+        <w:rFonts w:ascii="Courier New" w:hAnsi="Courier New" w:cs="Courier New" w:hint="default"/>
+      </w:rPr>
+    </w:lvl>
+    <w:lvl w:ilvl="8" w:tplc="04090005" w:tentative="1">
+      <w:start w:val="1"/>
+      <w:numFmt w:val="bullet"/>
+      <w:lvlText w:val=""/>
+      <w:lvlJc w:val="left"/>
+      <w:pPr>
+        <w:ind w:left="6480" w:hanging="360"/>
+      </w:pPr>
+      <w:rPr>
+        <w:rFonts w:ascii="Wingdings" w:hAnsi="Wingdings" w:hint="default"/>
+      </w:rPr>
     </w:lvl>
   </w:abstractNum>
   <w:num w:numId="1" w16cid:durableId="2129810132">
@@ -9926,6 +10792,9 @@
   </w:num>
   <w:num w:numId="8" w16cid:durableId="569733263">
     <w:abstractNumId w:val="0"/>
+  </w:num>
+  <w:num w:numId="9" w16cid:durableId="1084688089">
+    <w:abstractNumId w:val="8"/>
   </w:num>
 </w:numbering>
 </file>

</xml_diff>

<commit_message>
Revert website copy to previous version
</commit_message>
<xml_diff>
--- a/Site Prompts.docx
+++ b/Site Prompts.docx
@@ -967,40 +967,14 @@
       <w:r>
         <w:t>”, after the text “</w:t>
       </w:r>
-      <w:proofErr w:type="spellStart"/>
-      <w:r>
-        <w:t>Autoridade</w:t>
-      </w:r>
-      <w:proofErr w:type="spellEnd"/>
-      <w:r>
-        <w:t xml:space="preserve"> </w:t>
-      </w:r>
-      <w:proofErr w:type="spellStart"/>
-      <w:r>
-        <w:t>Tributária</w:t>
-      </w:r>
-      <w:proofErr w:type="spellEnd"/>
-      <w:r>
-        <w:t xml:space="preserve"> e </w:t>
-      </w:r>
-      <w:proofErr w:type="spellStart"/>
-      <w:r>
-        <w:t>Aduaneira</w:t>
-      </w:r>
-      <w:proofErr w:type="spellEnd"/>
+      <w:r>
+        <w:t>Autoridade Tributária e Aduaneira</w:t>
+      </w:r>
       <w:r>
         <w:t>” add “(</w:t>
       </w:r>
       <w:r>
-        <w:t xml:space="preserve">known as AT or </w:t>
-      </w:r>
-      <w:proofErr w:type="spellStart"/>
-      <w:r>
-        <w:t>Finanças</w:t>
-      </w:r>
-      <w:proofErr w:type="spellEnd"/>
-      <w:r>
-        <w:t xml:space="preserve"> is the public agency in Portugal under the Ministry of Finance responsible for managing taxes, enforcing customs rules, and collecting state revenues</w:t>
+        <w:t>known as AT or Finanças is the public agency in Portugal under the Ministry of Finance responsible for managing taxes, enforcing customs rules, and collecting state revenues</w:t>
       </w:r>
       <w:r>
         <w:t>)</w:t>
@@ -1051,47 +1025,7 @@
         <w:t>ion, under the text “</w:t>
       </w:r>
       <w:r>
-        <w:t>Drafting the Contract (</w:t>
-      </w:r>
-      <w:proofErr w:type="spellStart"/>
-      <w:r>
-        <w:t>Contrato</w:t>
-      </w:r>
-      <w:proofErr w:type="spellEnd"/>
-      <w:r>
-        <w:t xml:space="preserve"> de </w:t>
-      </w:r>
-      <w:proofErr w:type="spellStart"/>
-      <w:r>
-        <w:t>Arrendamento</w:t>
-      </w:r>
-      <w:proofErr w:type="spellEnd"/>
-      <w:r>
-        <w:t>): Leases must be in writing and contain details of the landlord, tenant, property registration (</w:t>
-      </w:r>
-      <w:proofErr w:type="spellStart"/>
-      <w:r>
-        <w:t>Caderneta</w:t>
-      </w:r>
-      <w:proofErr w:type="spellEnd"/>
-      <w:r>
-        <w:t xml:space="preserve"> Predial), and license of use (</w:t>
-      </w:r>
-      <w:proofErr w:type="spellStart"/>
-      <w:r>
-        <w:t>Licença</w:t>
-      </w:r>
-      <w:proofErr w:type="spellEnd"/>
-      <w:r>
-        <w:t xml:space="preserve"> de </w:t>
-      </w:r>
-      <w:proofErr w:type="spellStart"/>
-      <w:r>
-        <w:t>Utilização</w:t>
-      </w:r>
-      <w:proofErr w:type="spellEnd"/>
-      <w:r>
-        <w:t>).</w:t>
+        <w:t>Drafting the Contract (Contrato de Arrendamento): Leases must be in writing and contain details of the landlord, tenant, property registration (Caderneta Predial), and license of use (Licença de Utilização).</w:t>
       </w:r>
       <w:r>
         <w:t xml:space="preserve">” Add line </w:t>
@@ -1394,15 +1328,7 @@
         <w:t xml:space="preserve"> of the text “</w:t>
       </w:r>
       <w:r>
-        <w:t xml:space="preserve">Public &amp; Private Local Schools: The national enrolment window open dates are regulated by the Ministry of Education, typically starting between April and July for the subsequent school year. </w:t>
-      </w:r>
-      <w:proofErr w:type="spellStart"/>
-      <w:r>
-        <w:t>Matrículas</w:t>
-      </w:r>
-      <w:proofErr w:type="spellEnd"/>
-      <w:r>
-        <w:t xml:space="preserve"> are </w:t>
+        <w:t xml:space="preserve">Public &amp; Private Local Schools: The national enrolment window open dates are regulated by the Ministry of Education, typically starting between April and July for the subsequent school year. Matrículas are </w:t>
       </w:r>
       <w:r>
         <w:lastRenderedPageBreak/>
@@ -1412,13 +1338,8 @@
         <w:t>”, change the text “</w:t>
       </w:r>
       <w:r>
-        <w:t xml:space="preserve">Portal das </w:t>
-      </w:r>
-      <w:proofErr w:type="spellStart"/>
-      <w:r>
-        <w:t>Matrículas</w:t>
-      </w:r>
-      <w:proofErr w:type="spellEnd"/>
+        <w:t>Portal das Matrículas</w:t>
+      </w:r>
       <w:r>
         <w:t xml:space="preserve">” to bold, </w:t>
       </w:r>
@@ -1458,180 +1379,130 @@
       <w:r>
         <w:t xml:space="preserve">called the </w:t>
       </w:r>
-      <w:proofErr w:type="spellStart"/>
-      <w:r>
-        <w:t>Atestado</w:t>
-      </w:r>
-      <w:proofErr w:type="spellEnd"/>
-      <w:r>
-        <w:t xml:space="preserve"> de </w:t>
-      </w:r>
-      <w:proofErr w:type="spellStart"/>
-      <w:r>
-        <w:t>Residência</w:t>
-      </w:r>
-      <w:proofErr w:type="spellEnd"/>
+      <w:r>
+        <w:t xml:space="preserve">Atestado de Residência </w:t>
+      </w:r>
+      <w:r>
+        <w:t xml:space="preserve">issued by </w:t>
+      </w:r>
+      <w:r>
+        <w:t>the</w:t>
+      </w:r>
+      <w:r>
+        <w:t xml:space="preserve"> civil </w:t>
+      </w:r>
+      <w:r>
+        <w:t>bureaucratic</w:t>
+      </w:r>
+      <w:r>
+        <w:t xml:space="preserve"> council</w:t>
+      </w:r>
+      <w:r>
+        <w:t xml:space="preserve">, </w:t>
+      </w:r>
+      <w:r>
+        <w:t>the Junta de Freguesia</w:t>
+      </w:r>
+      <w:r>
+        <w:t>”.</w:t>
+      </w:r>
       <w:r>
         <w:t xml:space="preserve"> </w:t>
       </w:r>
       <w:r>
-        <w:t xml:space="preserve">issued by </w:t>
-      </w:r>
-      <w:r>
-        <w:t>the</w:t>
-      </w:r>
-      <w:r>
-        <w:t xml:space="preserve"> civil </w:t>
-      </w:r>
-      <w:r>
-        <w:t>bureaucratic</w:t>
-      </w:r>
-      <w:r>
-        <w:t xml:space="preserve"> council</w:t>
+        <w:t>Then under the heading “</w:t>
+      </w:r>
+      <w:r>
+        <w:t xml:space="preserve">3. Residency &amp; Visa Considerations </w:t>
+      </w:r>
+      <w:r>
+        <w:t>“, a</w:t>
+      </w:r>
+      <w:r>
+        <w:t>fter the text “</w:t>
+      </w:r>
+      <w:r>
+        <w:t>biometric booking confirmation</w:t>
+      </w:r>
+      <w:r>
+        <w:t>“</w:t>
       </w:r>
       <w:r>
         <w:t xml:space="preserve">, </w:t>
       </w:r>
       <w:r>
-        <w:t xml:space="preserve">the Junta de </w:t>
-      </w:r>
-      <w:proofErr w:type="spellStart"/>
-      <w:r>
-        <w:t>Freguesia</w:t>
-      </w:r>
-      <w:proofErr w:type="spellEnd"/>
-      <w:r>
-        <w:t>”.</w:t>
-      </w:r>
-      <w:r>
-        <w:t xml:space="preserve"> </w:t>
-      </w:r>
-      <w:r>
-        <w:t>Then under the heading “</w:t>
-      </w:r>
-      <w:r>
-        <w:t xml:space="preserve">3. Residency &amp; Visa Considerations </w:t>
-      </w:r>
-      <w:r>
-        <w:t>“, a</w:t>
-      </w:r>
-      <w:r>
-        <w:t>fter the text “</w:t>
-      </w:r>
-      <w:r>
-        <w:t>biometric booking confirmation</w:t>
+        <w:t>after the text “</w:t>
+      </w:r>
+      <w:r>
+        <w:t>For public school registration</w:t>
+      </w:r>
+      <w:r>
+        <w:t>, change the text “</w:t>
+      </w:r>
+      <w:r>
+        <w:t>the child's NIF, parent's NIF, and a valid residence card or biometric booking confirmation are mandatory.</w:t>
+      </w:r>
+      <w:r>
+        <w:t xml:space="preserve">” to “it is </w:t>
+      </w:r>
+      <w:r>
+        <w:t>mandatory</w:t>
+      </w:r>
+      <w:r>
+        <w:t xml:space="preserve"> to </w:t>
+      </w:r>
+      <w:r>
+        <w:t xml:space="preserve">a valid residence card or biometric booking confirmation </w:t>
       </w:r>
       <w:r>
         <w:t>“</w:t>
       </w:r>
       <w:r>
-        <w:t xml:space="preserve">, </w:t>
-      </w:r>
-      <w:r>
-        <w:t>after the text “</w:t>
-      </w:r>
-      <w:r>
-        <w:t>For public school registration</w:t>
-      </w:r>
-      <w:r>
-        <w:t>, change the text “</w:t>
-      </w:r>
-      <w:r>
-        <w:t>the child's NIF, parent's NIF, and a valid residence card or biometric booking confirmation are mandatory.</w:t>
-      </w:r>
-      <w:r>
-        <w:t xml:space="preserve">” to “it is </w:t>
-      </w:r>
-      <w:r>
-        <w:t>mandatory</w:t>
-      </w:r>
-      <w:r>
-        <w:t xml:space="preserve"> to </w:t>
-      </w:r>
-      <w:r>
-        <w:t xml:space="preserve">a valid residence card or biometric booking confirmation </w:t>
+        <w:t>(</w:t>
+      </w:r>
+      <w:r>
+        <w:t xml:space="preserve">After receiving a D4/D5 study visa and arriving in Portugal, students must register in person with the AIMA (Agência para a Integração, Migrações e Asilo, formerly SEF) to convert their entry visa into a formal Student Residence Permit (Título de Residência). During </w:t>
+      </w:r>
+      <w:r>
+        <w:t xml:space="preserve">a </w:t>
+      </w:r>
+      <w:r>
+        <w:t>Biometric Appointment, the student’s fingerprints, digital photograph, and digital signature are taken</w:t>
+      </w:r>
+      <w:r>
+        <w:t>.)”</w:t>
+      </w:r>
+      <w:r>
+        <w:t>.</w:t>
+      </w:r>
+    </w:p>
+    <w:p/>
+    <w:p>
+      <w:r>
+        <w:t>On the primary page, once the “</w:t>
+      </w:r>
+      <w:r>
+        <w:t>Personalized Relocation Roadmap</w:t>
+      </w:r>
+      <w:r>
+        <w:t>” section is open,</w:t>
+      </w:r>
+      <w:r>
+        <w:t xml:space="preserve"> under the step “</w:t>
+      </w:r>
+      <w:r>
+        <w:t xml:space="preserve">Lock Movers &amp; Relocation </w:t>
+      </w:r>
+      <w:proofErr w:type="gramStart"/>
+      <w:r>
+        <w:t>Logistics</w:t>
       </w:r>
       <w:r>
         <w:t>“</w:t>
       </w:r>
-      <w:r>
-        <w:t>(</w:t>
-      </w:r>
-      <w:r>
-        <w:t>After receiving a D4/D5 study visa and arriving in Portugal, students must register in person with the AIMA (</w:t>
-      </w:r>
-      <w:proofErr w:type="spellStart"/>
-      <w:r>
-        <w:t>Agência</w:t>
-      </w:r>
-      <w:proofErr w:type="spellEnd"/>
-      <w:r>
-        <w:t xml:space="preserve"> para a </w:t>
-      </w:r>
-      <w:proofErr w:type="spellStart"/>
-      <w:r>
-        <w:t>Integração</w:t>
-      </w:r>
-      <w:proofErr w:type="spellEnd"/>
-      <w:r>
-        <w:t xml:space="preserve">, </w:t>
-      </w:r>
-      <w:proofErr w:type="spellStart"/>
-      <w:r>
-        <w:t>Migrações</w:t>
-      </w:r>
-      <w:proofErr w:type="spellEnd"/>
-      <w:r>
-        <w:t xml:space="preserve"> e Asilo, formerly SEF) to convert their entry visa into a formal Student Residence Permit (</w:t>
-      </w:r>
-      <w:proofErr w:type="spellStart"/>
-      <w:r>
-        <w:t>Título</w:t>
-      </w:r>
-      <w:proofErr w:type="spellEnd"/>
-      <w:r>
-        <w:t xml:space="preserve"> de </w:t>
-      </w:r>
-      <w:proofErr w:type="spellStart"/>
-      <w:r>
-        <w:t>Residência</w:t>
-      </w:r>
-      <w:proofErr w:type="spellEnd"/>
-      <w:r>
-        <w:t xml:space="preserve">). During </w:t>
-      </w:r>
-      <w:r>
-        <w:t xml:space="preserve">a </w:t>
-      </w:r>
-      <w:r>
-        <w:t>Biometric Appointment, the student’s fingerprints, digital photograph, and digital signature are taken</w:t>
-      </w:r>
-      <w:r>
-        <w:t>.)”</w:t>
-      </w:r>
-      <w:r>
-        <w:t>.</w:t>
-      </w:r>
-    </w:p>
-    <w:p/>
-    <w:p>
-      <w:r>
-        <w:t>On the primary page, once the “</w:t>
-      </w:r>
-      <w:r>
-        <w:t>Personalized Relocation Roadmap</w:t>
-      </w:r>
-      <w:r>
-        <w:t>” section is open,</w:t>
-      </w:r>
-      <w:r>
-        <w:t xml:space="preserve"> under the step “</w:t>
-      </w:r>
-      <w:r>
-        <w:t>Lock Movers &amp; Relocation Logistics</w:t>
-      </w:r>
-      <w:r>
-        <w:t>“, remove the underlining from the following text “</w:t>
+      <w:proofErr w:type="gramEnd"/>
+      <w:r>
+        <w:t>, remove the underlining from the following text “</w:t>
       </w:r>
       <w:r>
         <w:t>Looking for more information or simply assistance in your visa applications? Bordr and Anchorless offer excellent resources, offering reliable guidance, practical advice, and up-to-date information to help you plan your move with confidence.</w:t>
@@ -2001,10 +1872,18 @@
         <w:t>” section is open, under the step “</w:t>
       </w:r>
       <w:r>
-        <w:t>Lock Movers &amp; Relocation Logistics</w:t>
-      </w:r>
-      <w:r>
-        <w:t>“, except for the text “</w:t>
+        <w:t xml:space="preserve">Lock Movers &amp; Relocation </w:t>
+      </w:r>
+      <w:proofErr w:type="gramStart"/>
+      <w:r>
+        <w:t>Logistics</w:t>
+      </w:r>
+      <w:r>
+        <w:t>“</w:t>
+      </w:r>
+      <w:proofErr w:type="gramEnd"/>
+      <w:r>
+        <w:t>, except for the text “</w:t>
       </w:r>
       <w:r>
         <w:t>Bordr</w:t>
@@ -2297,8 +2176,13 @@
         </w:numPr>
       </w:pPr>
       <w:r>
-        <w:t>Visas and residence permits</w:t>
-      </w:r>
+        <w:t xml:space="preserve">Visas and residence </w:t>
+      </w:r>
+      <w:proofErr w:type="gramStart"/>
+      <w:r>
+        <w:t>permits</w:t>
+      </w:r>
+      <w:proofErr w:type="gramEnd"/>
     </w:p>
     <w:p>
       <w:pPr>
@@ -2540,7 +2424,15 @@
     </w:p>
     <w:p>
       <w:r>
-        <w:t>Some links on the Website may be affiliate links.</w:t>
+        <w:t xml:space="preserve">Some links on the Website may be </w:t>
+      </w:r>
+      <w:proofErr w:type="gramStart"/>
+      <w:r>
+        <w:t>affiliate</w:t>
+      </w:r>
+      <w:proofErr w:type="gramEnd"/>
+      <w:r>
+        <w:t xml:space="preserve"> links.</w:t>
       </w:r>
     </w:p>
     <w:p>
@@ -3166,7 +3058,15 @@
     </w:p>
     <w:p>
       <w:r>
-        <w:t xml:space="preserve">Some links, advertisements, recommendations, or references on this Website may be affiliate links. This means that we may receive a commission or other compensation if </w:t>
+        <w:t xml:space="preserve">Some links, advertisements, recommendations, or references on this Website may be </w:t>
+      </w:r>
+      <w:proofErr w:type="gramStart"/>
+      <w:r>
+        <w:t>affiliate</w:t>
+      </w:r>
+      <w:proofErr w:type="gramEnd"/>
+      <w:r>
+        <w:t xml:space="preserve"> links. This means that we may receive a commission or other compensation if </w:t>
       </w:r>
       <w:r>
         <w:lastRenderedPageBreak/>
@@ -3678,7 +3578,15 @@
     </w:p>
     <w:p>
       <w:r>
-        <w:t xml:space="preserve">Some links on this Website may be affiliate links. If you click an affiliate link and subsequently purchase a product, sign up for a service, submit an application, or </w:t>
+        <w:t xml:space="preserve">Some links on this Website may be </w:t>
+      </w:r>
+      <w:proofErr w:type="gramStart"/>
+      <w:r>
+        <w:t>affiliate</w:t>
+      </w:r>
+      <w:proofErr w:type="gramEnd"/>
+      <w:r>
+        <w:t xml:space="preserve"> links. If you click an affiliate link and subsequently purchase a product, sign up for a service, submit an application, or </w:t>
       </w:r>
       <w:r>
         <w:lastRenderedPageBreak/>
@@ -4292,7 +4200,15 @@
     <w:p>
       <w:r>
         <w:lastRenderedPageBreak/>
-        <w:t xml:space="preserve">Ensure all secondary pages work with the browser's native back button and do not create a custom back button, and do not alter existing </w:t>
+        <w:t xml:space="preserve">Ensure all secondary </w:t>
+      </w:r>
+      <w:proofErr w:type="gramStart"/>
+      <w:r>
+        <w:t>pages</w:t>
+      </w:r>
+      <w:proofErr w:type="gramEnd"/>
+      <w:r>
+        <w:t xml:space="preserve"> work with the browser's native back button and do not create a custom back button, and do not alter existing </w:t>
       </w:r>
       <w:r>
         <w:t>“</w:t>
@@ -4513,15 +4429,7 @@
         <w:t>“</w:t>
       </w:r>
       <w:r>
-        <w:t xml:space="preserve">Portuguese Embassy, Consulates &amp; Visa Application </w:t>
-      </w:r>
-      <w:proofErr w:type="spellStart"/>
-      <w:r>
-        <w:t>Centres</w:t>
-      </w:r>
-      <w:proofErr w:type="spellEnd"/>
-      <w:r>
-        <w:t xml:space="preserve"> in the USA</w:t>
+        <w:t>Portuguese Embassy, Consulates &amp; Visa Application Centres in the USA</w:t>
       </w:r>
       <w:r>
         <w:t>” and a state has been selected in the “</w:t>
@@ -4583,7 +4491,10 @@
         <w:t>shipping, rentals, school costs, and healthcare in one transparent dashboard, and generate your custom D7/Digital Nomad visa roadmap.</w:t>
       </w:r>
       <w:r>
-        <w:t>” to ““</w:t>
+        <w:t>” to “</w:t>
+      </w:r>
+      <w:r>
+        <w:t>“</w:t>
       </w:r>
       <w:r>
         <w:t>Bypass the chaos of fifty tabs. Estimate your shipping, rentals, school costs, and healthcare in one transparent dashboard, and generate your custom D7/Digital Nomad visa roadmap</w:t>
@@ -4592,13 +4503,22 @@
         <w:t xml:space="preserve">, providing you with a </w:t>
       </w:r>
       <w:r>
-        <w:t xml:space="preserve">complete guide </w:t>
+        <w:t>complete guide</w:t>
+      </w:r>
+      <w:r>
+        <w:t xml:space="preserve"> </w:t>
       </w:r>
       <w:r>
         <w:t>for m</w:t>
       </w:r>
       <w:r>
-        <w:t>oving from the USA to Portugal</w:t>
+        <w:t>oving from the USA</w:t>
+      </w:r>
+      <w:r>
+        <w:t xml:space="preserve"> </w:t>
+      </w:r>
+      <w:r>
+        <w:t>to Portugal</w:t>
       </w:r>
       <w:r>
         <w:t>.</w:t>
@@ -4647,764 +4567,149 @@
       </w:r>
       <w:r>
         <w:t>” by reducing the font size accordingly.</w:t>
-      </w:r>
-    </w:p>
-    <w:p/>
-    <w:p>
-      <w:r>
-        <w:t>On the primary page,</w:t>
-      </w:r>
-      <w:r>
-        <w:t xml:space="preserve"> change the text “</w:t>
-      </w:r>
-      <w:r>
-        <w:t>Move to Portugal from the US:</w:t>
-      </w:r>
-      <w:r>
-        <w:t>” to “</w:t>
-      </w:r>
-      <w:r>
-        <w:t>Moving to Portugal from the USA</w:t>
-      </w:r>
-      <w:r>
-        <w:t>”</w:t>
-      </w:r>
-      <w:r>
-        <w:t>, then change the text “</w:t>
-      </w:r>
-      <w:r>
-        <w:t>Bypass the chaos of fifty tabs. Estimate your shipping, rentals, school costs, and healthcare in one transparent dashboard, and generate your custom D7/Digital Nomad visa roadmap, providing you with a complete guide for moving from the USA to Portugal.</w:t>
-      </w:r>
-      <w:r>
-        <w:t>” to “</w:t>
-      </w:r>
-      <w:r>
-        <w:t>Moving to Portugal from the US</w:t>
-      </w:r>
-      <w:r>
-        <w:t xml:space="preserve">? </w:t>
-      </w:r>
-      <w:r>
-        <w:t xml:space="preserve">Bypass the chaos of fifty tabs. Estimate your </w:t>
-      </w:r>
-      <w:r>
-        <w:t>c</w:t>
-      </w:r>
-      <w:r>
-        <w:t>ost of moving to Portugal</w:t>
-      </w:r>
-      <w:r>
-        <w:t xml:space="preserve">, </w:t>
-      </w:r>
-      <w:r>
-        <w:t xml:space="preserve">including </w:t>
-      </w:r>
-      <w:r>
-        <w:t>shipping</w:t>
-      </w:r>
-      <w:r>
-        <w:t xml:space="preserve">, visas, pet transfers, </w:t>
-      </w:r>
-      <w:r>
-        <w:t>as well as the c</w:t>
-      </w:r>
-      <w:r>
-        <w:t>ost of living in Portugal for Americans</w:t>
-      </w:r>
-      <w:r>
-        <w:t xml:space="preserve">, including </w:t>
-      </w:r>
-      <w:r>
-        <w:t xml:space="preserve">rentals, school costs, </w:t>
-      </w:r>
-      <w:r>
-        <w:t xml:space="preserve">living expenses, </w:t>
-      </w:r>
-      <w:r>
-        <w:t>and healthcare</w:t>
-      </w:r>
-      <w:r>
-        <w:t>,</w:t>
-      </w:r>
-      <w:r>
-        <w:t xml:space="preserve"> in one transparent dashboard</w:t>
-      </w:r>
-      <w:r>
-        <w:t xml:space="preserve">, </w:t>
-      </w:r>
-      <w:r>
-        <w:lastRenderedPageBreak/>
-        <w:t>g</w:t>
-      </w:r>
-      <w:r>
-        <w:t>enerat</w:t>
-      </w:r>
-      <w:r>
-        <w:t>ing</w:t>
-      </w:r>
-      <w:r>
-        <w:t xml:space="preserve"> your custom D7/Digital Nomad visa roadmap, providing you with a complete guide for moving from the USA to Portugal.</w:t>
-      </w:r>
-      <w:r>
-        <w:t>”</w:t>
-      </w:r>
-      <w:r>
-        <w:t xml:space="preserve"> t</w:t>
-      </w:r>
-      <w:r>
-        <w:t xml:space="preserve">hen </w:t>
-      </w:r>
-      <w:r>
-        <w:t>change the text “</w:t>
-      </w:r>
-      <w:r>
-        <w:t>Toggle your household parameters below. Our formulas fetch localized rent metrics, private school fees, moving costs, and visa filing expenses.</w:t>
-      </w:r>
-      <w:r>
-        <w:t>” to “</w:t>
-      </w:r>
-      <w:r>
-        <w:t>B</w:t>
-      </w:r>
-      <w:r>
-        <w:t>ased on your selected parameters</w:t>
-      </w:r>
-      <w:r>
-        <w:t>, c</w:t>
-      </w:r>
-      <w:r>
-        <w:t xml:space="preserve">alculate your </w:t>
-      </w:r>
-      <w:r>
-        <w:t xml:space="preserve">estimated </w:t>
-      </w:r>
-      <w:r>
-        <w:t>Portugal relocation costs</w:t>
-      </w:r>
-      <w:r>
-        <w:t xml:space="preserve"> </w:t>
-      </w:r>
-      <w:r>
-        <w:t xml:space="preserve">with our </w:t>
-      </w:r>
-      <w:r>
-        <w:t>Portugal moving cost calculator</w:t>
-      </w:r>
-      <w:r>
-        <w:t xml:space="preserve">, </w:t>
-      </w:r>
-      <w:r>
-        <w:t xml:space="preserve">which includes </w:t>
-      </w:r>
-      <w:r>
-        <w:t>moving costs and visa filing expenses</w:t>
-      </w:r>
-      <w:r>
-        <w:t xml:space="preserve">, </w:t>
-      </w:r>
-      <w:r>
-        <w:t>and</w:t>
-      </w:r>
-      <w:r>
-        <w:t xml:space="preserve"> </w:t>
-      </w:r>
-      <w:r>
-        <w:t xml:space="preserve">with our </w:t>
-      </w:r>
-      <w:r>
-        <w:t>Portugal relocation calculator</w:t>
-      </w:r>
-      <w:r>
-        <w:t xml:space="preserve"> </w:t>
-      </w:r>
-      <w:r>
-        <w:t xml:space="preserve">your estimated living costs </w:t>
-      </w:r>
-      <w:r>
-        <w:t xml:space="preserve">including </w:t>
-      </w:r>
-      <w:r>
-        <w:t xml:space="preserve">localized rent metrics, </w:t>
-      </w:r>
-      <w:r>
-        <w:t xml:space="preserve">and </w:t>
-      </w:r>
-      <w:r>
-        <w:t>private school fees</w:t>
-      </w:r>
-      <w:r>
-        <w:t>.”</w:t>
-      </w:r>
-      <w:r>
-        <w:t xml:space="preserve"> t</w:t>
-      </w:r>
-      <w:r>
-        <w:t>hen</w:t>
-      </w:r>
-      <w:r>
-        <w:t>,</w:t>
-      </w:r>
-      <w:r>
-        <w:t xml:space="preserve"> </w:t>
-      </w:r>
-      <w:r>
-        <w:t xml:space="preserve">in the section containing the parameters, above the heading </w:t>
-      </w:r>
-      <w:r>
-        <w:t>“</w:t>
-      </w:r>
-      <w:r>
-        <w:t>1. Current Origin Hub (US)</w:t>
-      </w:r>
-      <w:r>
-        <w:t>”</w:t>
-      </w:r>
-      <w:r>
-        <w:t xml:space="preserve"> </w:t>
-      </w:r>
-      <w:r>
-        <w:t>add the text</w:t>
-      </w:r>
-      <w:r>
-        <w:t xml:space="preserve"> “</w:t>
-      </w:r>
-      <w:r>
-        <w:t>Toggle your household parameters below</w:t>
-      </w:r>
-      <w:r>
-        <w:t>”</w:t>
-      </w:r>
-      <w:r>
-        <w:t>.</w:t>
-      </w:r>
-      <w:r>
-        <w:t xml:space="preserve"> t</w:t>
-      </w:r>
-      <w:r>
-        <w:t xml:space="preserve">hen </w:t>
-      </w:r>
-      <w:r>
-        <w:t>in the “</w:t>
-      </w:r>
-      <w:r>
-        <w:t>Move Budget Breakdown</w:t>
-      </w:r>
-      <w:r>
-        <w:t xml:space="preserve">” section </w:t>
-      </w:r>
-      <w:r>
-        <w:t>under “</w:t>
-      </w:r>
-      <w:r>
-        <w:t>Visa Processing &amp; NIF Setups</w:t>
-      </w:r>
-      <w:r>
-        <w:t>” add the following text “</w:t>
-      </w:r>
-      <w:r>
-        <w:t xml:space="preserve">D7 visa costs </w:t>
-      </w:r>
-      <w:r>
-        <w:t xml:space="preserve">or </w:t>
-      </w:r>
-      <w:r>
-        <w:t>D8 Digital Nomad visa costs</w:t>
-      </w:r>
-      <w:r>
-        <w:t>”</w:t>
-      </w:r>
-      <w:r>
-        <w:t>, t</w:t>
-      </w:r>
-      <w:r>
-        <w:t xml:space="preserve">hen under the heading </w:t>
-      </w:r>
-      <w:r>
-        <w:t>“</w:t>
-      </w:r>
-      <w:r>
-        <w:t>Cost of Relocation Calculator</w:t>
-      </w:r>
-      <w:r>
-        <w:t>” add the text</w:t>
-      </w:r>
-      <w:r>
-        <w:t xml:space="preserve"> “</w:t>
-      </w:r>
-      <w:r>
-        <w:t>Moving to Portugal from the USA? Calculate What Your Move Could Really Cost</w:t>
-      </w:r>
-      <w:r>
-        <w:t>” the same size as the text “</w:t>
-      </w:r>
-      <w:r>
-        <w:t>Move Budget Breakdown</w:t>
-      </w:r>
-      <w:r>
-        <w:t>”</w:t>
-      </w:r>
-      <w:r>
-        <w:t>.</w:t>
-      </w:r>
-    </w:p>
-    <w:p/>
-    <w:p>
-      <w:r>
-        <w:t>Change the text “</w:t>
-      </w:r>
-      <w:r>
-        <w:t>Based on your selected parameters, calculate your estimated Portugal relocation costs with our Portugal moving cost calculator, which includes moving costs and visa filing expenses, and with our Portugal relocation calculator your estimated living costs including localized rent metrics, and private school fees.</w:t>
-      </w:r>
-      <w:r>
-        <w:t>” to “</w:t>
-      </w:r>
-      <w:r>
-        <w:t xml:space="preserve">Based on your selected parameters, use our </w:t>
-      </w:r>
-      <w:r>
-        <w:rPr>
-          <w:b/>
-          <w:bCs/>
-        </w:rPr>
-        <w:t>Portugal moving cost calculator</w:t>
-      </w:r>
-      <w:r>
-        <w:t xml:space="preserve"> to estimate your relocation expenses, including moving costs and visa application fees. Then, use our </w:t>
-      </w:r>
-      <w:r>
-        <w:rPr>
-          <w:b/>
-          <w:bCs/>
-        </w:rPr>
-        <w:t>Portugal relocation calculator</w:t>
-      </w:r>
-      <w:r>
-        <w:t xml:space="preserve"> to estimate your ongoing living expenses, including local rental costs and private school tuition fees.</w:t>
-      </w:r>
-      <w:r>
-        <w:t>”</w:t>
-      </w:r>
-      <w:r>
-        <w:t>, t</w:t>
-      </w:r>
-      <w:r>
-        <w:t>hen change the text “</w:t>
-      </w:r>
-      <w:r>
-        <w:t xml:space="preserve">Estimate your </w:t>
-      </w:r>
-      <w:r>
-        <w:rPr>
-          <w:b/>
-          <w:bCs/>
-        </w:rPr>
-        <w:t>C</w:t>
-      </w:r>
-      <w:r>
-        <w:rPr>
-          <w:b/>
-          <w:bCs/>
-        </w:rPr>
-        <w:t>ost of moving to Portugal</w:t>
-      </w:r>
-      <w:r>
-        <w:t xml:space="preserve">, including shipping, visas, pet transfers, as well as the </w:t>
-      </w:r>
-      <w:r>
-        <w:rPr>
-          <w:b/>
-          <w:bCs/>
-        </w:rPr>
-        <w:t>C</w:t>
-      </w:r>
-      <w:r>
-        <w:rPr>
-          <w:b/>
-          <w:bCs/>
-        </w:rPr>
-        <w:t>ost of living in Portugal for Americans</w:t>
-      </w:r>
-      <w:r>
-        <w:t>, including rentals, school costs, living expenses, and healthcare, in one transparent dashboard, generating your custom D7/Digital Nomad visa roadmap, providing you with a complete guide for moving from the USA to Portugal.</w:t>
-      </w:r>
-      <w:r>
-        <w:t>” to “</w:t>
-      </w:r>
-      <w:r>
-        <w:t xml:space="preserve">Estimate your </w:t>
-      </w:r>
-      <w:r>
-        <w:rPr>
-          <w:b/>
-          <w:bCs/>
-        </w:rPr>
-        <w:t>Cost of moving to Portugal</w:t>
-      </w:r>
-      <w:r>
-        <w:t xml:space="preserve">, including shipping, visa fees, and pet relocation expenses, alongside your </w:t>
-      </w:r>
-      <w:r>
-        <w:rPr>
-          <w:b/>
-          <w:bCs/>
-        </w:rPr>
-        <w:t>Cost of living in Portugal for Americans</w:t>
-      </w:r>
-      <w:r>
-        <w:t>, covering rental housing, education, daily living expenses, and healthcare. View everything in one transparent dashboard, complete with a personalized D7 or Digital Nomad visa roadmap and a comprehensive guide to relocating from the USA to Portugal.</w:t>
-      </w:r>
-      <w:r>
-        <w:t>”</w:t>
-      </w:r>
-    </w:p>
-    <w:p/>
-    <w:p>
-      <w:r>
-        <w:t>On the primary page,</w:t>
-      </w:r>
-      <w:r>
-        <w:t xml:space="preserve"> change the text “</w:t>
-      </w:r>
-      <w:r>
-        <w:t>Toggle your household parameters below</w:t>
-      </w:r>
-      <w:r>
-        <w:t xml:space="preserve">” to “Select your </w:t>
-      </w:r>
-      <w:r>
-        <w:t xml:space="preserve">relocation </w:t>
-      </w:r>
-      <w:r>
-        <w:t>considerations</w:t>
-      </w:r>
-      <w:r>
-        <w:t>"</w:t>
-      </w:r>
-      <w:r>
-        <w:t>,</w:t>
-      </w:r>
-      <w:r>
-        <w:t xml:space="preserve"> t</w:t>
-      </w:r>
-      <w:r>
-        <w:t xml:space="preserve">hen, </w:t>
-      </w:r>
-      <w:r>
-        <w:t xml:space="preserve">in the parameter section, </w:t>
-      </w:r>
-      <w:r>
-        <w:t>under the heading “</w:t>
-      </w:r>
-      <w:r>
-        <w:t>5. Schooling &amp; Moving Cargo</w:t>
-      </w:r>
-      <w:r>
-        <w:t xml:space="preserve">” </w:t>
-      </w:r>
-      <w:r>
-        <w:t xml:space="preserve">change </w:t>
-      </w:r>
-      <w:r>
-        <w:t>the text “International Schooling to “</w:t>
-      </w:r>
-      <w:r>
-        <w:t xml:space="preserve">International </w:t>
-      </w:r>
-      <w:r>
-        <w:t>S</w:t>
-      </w:r>
-      <w:r>
-        <w:t>chools in</w:t>
-      </w:r>
-      <w:r>
-        <w:t xml:space="preserve"> Portugal</w:t>
-      </w:r>
-      <w:r>
-        <w:t>”</w:t>
-      </w:r>
-      <w:r>
-        <w:t>, then change the text “</w:t>
-      </w:r>
-      <w:r>
-        <w:t>Relocating large household furniture by sea” to “</w:t>
-      </w:r>
-      <w:r>
-        <w:t>Moving household goods from USA to Portugal</w:t>
-      </w:r>
-      <w:r>
-        <w:t xml:space="preserve"> by sea”, </w:t>
-      </w:r>
-      <w:r>
-        <w:t xml:space="preserve">in the </w:t>
-      </w:r>
-      <w:r>
-        <w:lastRenderedPageBreak/>
-        <w:t>section “</w:t>
-      </w:r>
-      <w:r>
-        <w:t>Move Budget Breakdown</w:t>
-      </w:r>
-      <w:r>
-        <w:t>”, under the text “</w:t>
-      </w:r>
-      <w:r>
-        <w:t>Estimated Target Monthly Rent</w:t>
-      </w:r>
-      <w:r>
-        <w:t>” add the text “</w:t>
-      </w:r>
-      <w:r>
-        <w:t>Portugal housing costs</w:t>
-      </w:r>
-      <w:r>
-        <w:t>”</w:t>
-      </w:r>
-      <w:r>
-        <w:t xml:space="preserve">, then </w:t>
-      </w:r>
-      <w:r>
-        <w:t>under the heading “</w:t>
-      </w:r>
-      <w:r>
-        <w:t>Cost of Relocation Calculator</w:t>
-      </w:r>
-      <w:r>
-        <w:t>”, change the text “</w:t>
-      </w:r>
-      <w:r>
-        <w:t>Based on your selected parameters, use our Portugal moving cost calculator to estimate your relocation expenses, including moving costs and visa application fees. Then, use our Portugal relocation calculator to estimate your ongoing living expenses, including local rental costs and private school tuition fees.</w:t>
-      </w:r>
-      <w:r>
-        <w:t>” to “</w:t>
-      </w:r>
-      <w:r>
-        <w:t>Based on your selected parameters, use our Portugal moving cost calculator to estimate your relocation expenses, including moving costs and visa application fees. Then, use our Portugal relocation calculator to estimate your ongoing living expenses, including local rental costs</w:t>
-      </w:r>
-      <w:r>
-        <w:t>,</w:t>
-      </w:r>
-      <w:r>
-        <w:t xml:space="preserve"> </w:t>
-      </w:r>
-      <w:r>
-        <w:t>h</w:t>
-      </w:r>
-      <w:r>
-        <w:t>ealthcare costs in Portugal</w:t>
-      </w:r>
-      <w:r>
-        <w:t>,</w:t>
-      </w:r>
-      <w:r>
-        <w:t xml:space="preserve"> </w:t>
-      </w:r>
-      <w:r>
-        <w:t xml:space="preserve">and </w:t>
-      </w:r>
-      <w:r>
-        <w:t xml:space="preserve">education, including </w:t>
-      </w:r>
-      <w:r>
-        <w:t>private school tuition fees.</w:t>
-      </w:r>
-      <w:r>
-        <w:t>”</w:t>
-      </w:r>
-    </w:p>
-    <w:p/>
-    <w:p>
-      <w:r>
-        <w:t>On the primary page,</w:t>
-      </w:r>
-      <w:r>
-        <w:t xml:space="preserve"> </w:t>
       </w:r>
     </w:p>
     <w:p/>
     <w:p/>
+    <w:p>
+      <w:pPr>
+        <w:pStyle w:val="Heading1"/>
+      </w:pPr>
+      <w:r>
+        <w:t>Private Expat Health Insurance</w:t>
+      </w:r>
+    </w:p>
+    <w:p>
+      <w:r>
+        <w:t xml:space="preserve">When calculating the </w:t>
+      </w:r>
+      <w:r>
+        <w:t xml:space="preserve">Private Expat Health Insurance </w:t>
+      </w:r>
+      <w:r>
+        <w:t xml:space="preserve">amount, display the average of the analysis </w:t>
+      </w:r>
+      <w:r>
+        <w:t xml:space="preserve">of </w:t>
+      </w:r>
+      <w:r>
+        <w:t xml:space="preserve">comprehensive internet research </w:t>
+      </w:r>
+      <w:r>
+        <w:t xml:space="preserve">you have conducted as though you are </w:t>
+      </w:r>
+      <w:r>
+        <w:t>a world-class Portuguese private health insurance consultant and market analyst</w:t>
+      </w:r>
+      <w:r>
+        <w:t xml:space="preserve"> </w:t>
+      </w:r>
+      <w:r>
+        <w:t xml:space="preserve">using live publicly available sources. Start with official insurer websites, then reputable </w:t>
+      </w:r>
+      <w:r>
+        <w:lastRenderedPageBreak/>
+        <w:t>brokers, comparison platforms, regulators, and trusted industry publications. Do not invent, estimate, or assume any details. For every data point, provide source name, page title, direct URL, access date, and publication date. Cross check pricing and coverage against multiple reputable sources, clearly showing conflicts if they exist. Research major insurers such as Medis, Multicare, Fidelidade, Allianz Portugal, Generali Tranquilidade, Lusitania Seguros, and others. For each plan, collect plan name, insurer, official website, monthly premium, annual premium, deductible, co-pay, age eligibility, waiting periods, exclusions, coverage limits, English support, claims process, mobile app availability, renewal terms, and customer or financial ratings. Provide pricing for individuals and families where available. Then produce a comparative analysis with tables, detail strengths and weaknesses, note policy differences, and rank insurers for best budget plans, best value (with explained weighting), best premium plans, and best plans for Americans moving to Portugal. Finally, deliver a professional report including executive summary, methodology, comparison tables, detailed insurer analyses, market insights, rankings, and a full bibliography with direct links. And verify all figures, remove duplicates, flag conflicts, and distinguish verified facts from analysis.</w:t>
+      </w:r>
+      <w:r>
+        <w:t xml:space="preserve"> Then make the </w:t>
+      </w:r>
+      <w:r>
+        <w:t>Private Expat Health Insurance</w:t>
+      </w:r>
+      <w:r>
+        <w:t xml:space="preserve"> heading a link to a new internet tab which contains a report of the analysis conducted.</w:t>
+      </w:r>
+    </w:p>
     <w:p/>
+    <w:p>
+      <w:r>
+        <w:t>In the “</w:t>
+      </w:r>
+      <w:r>
+        <w:t>Portuguese Private Expat Health Insurance</w:t>
+      </w:r>
+      <w:r>
+        <w:t xml:space="preserve">” page, for all text between the characters </w:t>
+      </w:r>
+      <w:r>
+        <w:t>**</w:t>
+      </w:r>
+      <w:r>
+        <w:t xml:space="preserve"> </w:t>
+      </w:r>
+      <w:r>
+        <w:t>**</w:t>
+      </w:r>
+      <w:r>
+        <w:t xml:space="preserve">, change the text to be bold and remove the </w:t>
+      </w:r>
+      <w:r>
+        <w:t>**</w:t>
+      </w:r>
+      <w:r>
+        <w:t xml:space="preserve"> </w:t>
+      </w:r>
+      <w:r>
+        <w:t>**</w:t>
+      </w:r>
+      <w:r>
+        <w:t xml:space="preserve"> characters.</w:t>
+      </w:r>
+    </w:p>
     <w:p/>
-    <w:p/>
-    <w:p/>
-    <w:p/>
-    <w:p/>
-    <w:p/>
-    <w:p>
-      <w:pPr>
-        <w:pStyle w:val="Heading1"/>
-      </w:pPr>
-      <w:r>
-        <w:t>Private Expat Health Insurance</w:t>
-      </w:r>
-    </w:p>
-    <w:p>
-      <w:r>
-        <w:t xml:space="preserve">When calculating the </w:t>
-      </w:r>
-      <w:r>
-        <w:t xml:space="preserve">Private Expat Health Insurance </w:t>
-      </w:r>
-      <w:r>
-        <w:t xml:space="preserve">amount, display the average of the analysis </w:t>
-      </w:r>
-      <w:r>
-        <w:t xml:space="preserve">of </w:t>
-      </w:r>
-      <w:r>
-        <w:t xml:space="preserve">comprehensive internet research </w:t>
-      </w:r>
-      <w:r>
-        <w:t xml:space="preserve">you have conducted as though you are </w:t>
-      </w:r>
-      <w:r>
-        <w:t>a world-class Portuguese private health insurance consultant and market analyst</w:t>
+    <w:p>
+      <w:r>
+        <w:t>In the page “</w:t>
+      </w:r>
+      <w:r>
+        <w:t>Portuguese Private Expat Health Insurance</w:t>
+      </w:r>
+      <w:r>
+        <w:t xml:space="preserve">”, </w:t>
+      </w:r>
+      <w:r>
+        <w:t>under the section “</w:t>
+      </w:r>
+      <w:r>
+        <w:t>Detailed Insurer Profiles</w:t>
+      </w:r>
+      <w:r>
+        <w:t>”, under the heading “</w:t>
+      </w:r>
+      <w:r>
+        <w:t>1. Médis</w:t>
+      </w:r>
+      <w:r>
+        <w:t>”</w:t>
       </w:r>
       <w:r>
         <w:t xml:space="preserve"> </w:t>
       </w:r>
       <w:r>
-        <w:t xml:space="preserve">using live publicly available sources. Start with official insurer websites, then reputable brokers, comparison platforms, regulators, and trusted industry publications. Do not invent, estimate, or assume any details. For every data point, provide source name, page title, direct URL, access date, and publication date. Cross check pricing and coverage against multiple reputable sources, clearly showing conflicts if they exist. Research major insurers such as </w:t>
-      </w:r>
-      <w:proofErr w:type="spellStart"/>
-      <w:r>
-        <w:t>Medis</w:t>
-      </w:r>
-      <w:proofErr w:type="spellEnd"/>
-      <w:r>
-        <w:t xml:space="preserve">, </w:t>
-      </w:r>
-      <w:proofErr w:type="spellStart"/>
-      <w:r>
-        <w:t>Multicare</w:t>
-      </w:r>
-      <w:proofErr w:type="spellEnd"/>
-      <w:r>
-        <w:t xml:space="preserve">, </w:t>
-      </w:r>
-      <w:proofErr w:type="spellStart"/>
-      <w:r>
-        <w:t>Fidelidade</w:t>
-      </w:r>
-      <w:proofErr w:type="spellEnd"/>
-      <w:r>
-        <w:t xml:space="preserve">, Allianz Portugal, Generali </w:t>
-      </w:r>
-      <w:proofErr w:type="spellStart"/>
-      <w:r>
-        <w:t>Tranquilidade</w:t>
-      </w:r>
-      <w:proofErr w:type="spellEnd"/>
-      <w:r>
-        <w:t xml:space="preserve">, Lusitania </w:t>
-      </w:r>
-      <w:proofErr w:type="spellStart"/>
-      <w:r>
-        <w:t>Seguros</w:t>
-      </w:r>
-      <w:proofErr w:type="spellEnd"/>
-      <w:r>
-        <w:t xml:space="preserve">, and others. For each plan, collect plan name, insurer, official website, monthly premium, annual premium, deductible, co-pay, age eligibility, </w:t>
-      </w:r>
-      <w:r>
-        <w:lastRenderedPageBreak/>
-        <w:t>waiting periods, exclusions, coverage limits, English support, claims process, mobile app availability, renewal terms, and customer or financial ratings. Provide pricing for individuals and families where available. Then produce a comparative analysis with tables, detail strengths and weaknesses, note policy differences, and rank insurers for best budget plans, best value (with explained weighting), best premium plans, and best plans for Americans moving to Portugal. Finally, deliver a professional report including executive summary, methodology, comparison tables, detailed insurer analyses, market insights, rankings, and a full bibliography with direct links. And verify all figures, remove duplicates, flag conflicts, and distinguish verified facts from analysis.</w:t>
-      </w:r>
-      <w:r>
-        <w:t xml:space="preserve"> Then make the </w:t>
-      </w:r>
-      <w:r>
-        <w:t>Private Expat Health Insurance</w:t>
-      </w:r>
-      <w:r>
-        <w:t xml:space="preserve"> heading a link to a new internet tab which contains a report of the analysis conducted.</w:t>
-      </w:r>
-    </w:p>
-    <w:p/>
-    <w:p>
-      <w:r>
-        <w:t>In the “</w:t>
-      </w:r>
-      <w:r>
-        <w:t>Portuguese Private Expat Health Insurance</w:t>
-      </w:r>
-      <w:r>
-        <w:t xml:space="preserve">” page, for all text between the characters </w:t>
-      </w:r>
-      <w:r>
-        <w:t>**</w:t>
-      </w:r>
-      <w:r>
-        <w:t xml:space="preserve"> </w:t>
-      </w:r>
-      <w:r>
-        <w:t>**</w:t>
-      </w:r>
-      <w:r>
-        <w:t xml:space="preserve">, change the text to be bold and remove the </w:t>
-      </w:r>
-      <w:r>
-        <w:t>**</w:t>
-      </w:r>
-      <w:r>
-        <w:t xml:space="preserve"> </w:t>
-      </w:r>
-      <w:r>
-        <w:t>**</w:t>
-      </w:r>
-      <w:r>
-        <w:t xml:space="preserve"> characters.</w:t>
-      </w:r>
-    </w:p>
-    <w:p/>
-    <w:p>
-      <w:r>
-        <w:t>In the page “</w:t>
-      </w:r>
-      <w:r>
-        <w:t>Portuguese Private Expat Health Insurance</w:t>
-      </w:r>
-      <w:r>
-        <w:t xml:space="preserve">”, </w:t>
-      </w:r>
-      <w:r>
-        <w:t>under the section “</w:t>
-      </w:r>
-      <w:r>
-        <w:t>Detailed Insurer Profiles</w:t>
-      </w:r>
-      <w:r>
-        <w:t>”, under the heading “</w:t>
-      </w:r>
-      <w:r>
-        <w:t xml:space="preserve">1. </w:t>
-      </w:r>
-      <w:proofErr w:type="spellStart"/>
-      <w:r>
-        <w:t>Médis</w:t>
-      </w:r>
-      <w:proofErr w:type="spellEnd"/>
+        <w:t>after the text “</w:t>
+      </w:r>
+      <w:r>
+        <w:t>Médis (operated by the Ageas Group)</w:t>
+      </w:r>
+      <w:proofErr w:type="gramStart"/>
       <w:r>
         <w:t>”</w:t>
       </w:r>
       <w:r>
-        <w:t xml:space="preserve"> </w:t>
-      </w:r>
-      <w:r>
-        <w:t>after the text “</w:t>
-      </w:r>
-      <w:proofErr w:type="spellStart"/>
-      <w:r>
-        <w:t>Médis</w:t>
-      </w:r>
-      <w:proofErr w:type="spellEnd"/>
-      <w:r>
-        <w:t xml:space="preserve"> (operated by the Ageas Group)</w:t>
-      </w:r>
-      <w:r>
-        <w:t>”</w:t>
-      </w:r>
-      <w:r>
-        <w:t xml:space="preserve"> ”, add the text “ (“ then add the link </w:t>
+        <w:t xml:space="preserve"> ”</w:t>
+      </w:r>
+      <w:proofErr w:type="gramEnd"/>
+      <w:r>
+        <w:t xml:space="preserve">, add the text </w:t>
+      </w:r>
+      <w:proofErr w:type="gramStart"/>
+      <w:r>
+        <w:t>“ (“ then</w:t>
+      </w:r>
+      <w:proofErr w:type="gramEnd"/>
+      <w:r>
+        <w:t xml:space="preserve"> add the link </w:t>
       </w:r>
       <w:hyperlink r:id="rId9" w:history="1">
         <w:r>
@@ -5415,7 +4720,11 @@
         </w:r>
       </w:hyperlink>
       <w:r>
-        <w:t xml:space="preserve"> and then add the text “)</w:t>
+        <w:t xml:space="preserve"> and then add the text “</w:t>
+      </w:r>
+      <w:proofErr w:type="gramStart"/>
+      <w:r>
+        <w:t>)</w:t>
       </w:r>
       <w:r>
         <w:t xml:space="preserve"> </w:t>
@@ -5423,6 +4732,7 @@
       <w:r>
         <w:t>”</w:t>
       </w:r>
+      <w:proofErr w:type="gramEnd"/>
       <w:r>
         <w:t>. Then</w:t>
       </w:r>
@@ -5430,29 +4740,21 @@
         <w:t xml:space="preserve"> </w:t>
       </w:r>
       <w:r>
-        <w:t>under the heading “</w:t>
+        <w:t xml:space="preserve">under the heading </w:t>
+      </w:r>
+      <w:proofErr w:type="gramStart"/>
+      <w:r>
+        <w:t>“</w:t>
       </w:r>
       <w:r>
         <w:t xml:space="preserve"> </w:t>
       </w:r>
       <w:r>
-        <w:t xml:space="preserve">2. </w:t>
-      </w:r>
-      <w:proofErr w:type="spellStart"/>
-      <w:r>
-        <w:t>Multicare</w:t>
-      </w:r>
-      <w:proofErr w:type="spellEnd"/>
-      <w:r>
-        <w:t xml:space="preserve"> (</w:t>
-      </w:r>
-      <w:proofErr w:type="spellStart"/>
-      <w:r>
-        <w:t>Fidelidade</w:t>
-      </w:r>
-      <w:proofErr w:type="spellEnd"/>
-      <w:r>
-        <w:t>)</w:t>
+        <w:t>2</w:t>
+      </w:r>
+      <w:proofErr w:type="gramEnd"/>
+      <w:r>
+        <w:t>. Multicare (Fidelidade)</w:t>
       </w:r>
       <w:r>
         <w:t>”</w:t>
@@ -5461,13 +4763,8 @@
         <w:t xml:space="preserve"> after the text “</w:t>
       </w:r>
       <w:r>
-        <w:t xml:space="preserve">brand of </w:t>
-      </w:r>
-      <w:proofErr w:type="spellStart"/>
-      <w:r>
-        <w:t>Fidelidade</w:t>
-      </w:r>
-      <w:proofErr w:type="spellEnd"/>
+        <w:t>brand of Fidelidade</w:t>
+      </w:r>
       <w:r>
         <w:t>”</w:t>
       </w:r>
@@ -5475,19 +4772,43 @@
         <w:t xml:space="preserve"> </w:t>
       </w:r>
       <w:r>
-        <w:t xml:space="preserve">add the text “ (“ then add the link </w:t>
+        <w:t xml:space="preserve">add the text </w:t>
+      </w:r>
+      <w:proofErr w:type="gramStart"/>
+      <w:r>
+        <w:t>“ (“ then</w:t>
+      </w:r>
+      <w:proofErr w:type="gramEnd"/>
+      <w:r>
+        <w:t xml:space="preserve"> add the link </w:t>
       </w:r>
       <w:r>
         <w:t>https://www.fidelidade.pt/EN/fidelidade/Paginas/Homepage.aspx</w:t>
       </w:r>
       <w:r>
-        <w:t xml:space="preserve"> and then add the text “) ”. Then </w:t>
-      </w:r>
-      <w:r>
-        <w:t xml:space="preserve">under the heading “ </w:t>
-      </w:r>
-      <w:r>
-        <w:t>3. Allianz Portugal</w:t>
+        <w:t xml:space="preserve"> and then add the text “</w:t>
+      </w:r>
+      <w:proofErr w:type="gramStart"/>
+      <w:r>
+        <w:t>) ”</w:t>
+      </w:r>
+      <w:proofErr w:type="gramEnd"/>
+      <w:r>
+        <w:t xml:space="preserve">. Then </w:t>
+      </w:r>
+      <w:r>
+        <w:t xml:space="preserve">under the heading </w:t>
+      </w:r>
+      <w:proofErr w:type="gramStart"/>
+      <w:r>
+        <w:t xml:space="preserve">“ </w:t>
+      </w:r>
+      <w:r>
+        <w:t>3</w:t>
+      </w:r>
+      <w:proofErr w:type="gramEnd"/>
+      <w:r>
+        <w:t>. Allianz Portugal</w:t>
       </w:r>
       <w:r>
         <w:t xml:space="preserve">” </w:t>
@@ -5502,7 +4823,15 @@
         <w:t>offers high-value plans</w:t>
       </w:r>
       <w:r>
-        <w:t xml:space="preserve">” add the text “ (“ then add the link </w:t>
+        <w:t xml:space="preserve">” add the text </w:t>
+      </w:r>
+      <w:proofErr w:type="gramStart"/>
+      <w:r>
+        <w:t>“ (“ then</w:t>
+      </w:r>
+      <w:proofErr w:type="gramEnd"/>
+      <w:r>
+        <w:t xml:space="preserve"> add the link </w:t>
       </w:r>
       <w:hyperlink r:id="rId10" w:history="1">
         <w:r>
@@ -5516,55 +4845,96 @@
         <w:t xml:space="preserve"> </w:t>
       </w:r>
       <w:r>
-        <w:t>and then add the text “) ”</w:t>
-      </w:r>
+        <w:t>and then add the text “</w:t>
+      </w:r>
+      <w:proofErr w:type="gramStart"/>
+      <w:r>
+        <w:t>) ”</w:t>
+      </w:r>
+      <w:proofErr w:type="gramEnd"/>
       <w:r>
         <w:t>.</w:t>
       </w:r>
     </w:p>
     <w:p>
       <w:r>
-        <w:t xml:space="preserve"> the heading “1. </w:t>
-      </w:r>
-      <w:proofErr w:type="spellStart"/>
-      <w:r>
-        <w:t>Médis</w:t>
-      </w:r>
-      <w:proofErr w:type="spellEnd"/>
-      <w:r>
-        <w:t>” after the text “</w:t>
-      </w:r>
-      <w:proofErr w:type="spellStart"/>
-      <w:r>
-        <w:t>Médis</w:t>
-      </w:r>
-      <w:proofErr w:type="spellEnd"/>
-      <w:r>
-        <w:t xml:space="preserve"> (operated by the Ageas Group)” ”, add the text “ (“ then add the link https://www.medis.pt/english/ and then add the text “) ”. Then under the heading “ 2. </w:t>
-      </w:r>
-      <w:proofErr w:type="spellStart"/>
-      <w:r>
-        <w:t>Multicare</w:t>
-      </w:r>
-      <w:proofErr w:type="spellEnd"/>
-      <w:r>
-        <w:t xml:space="preserve"> (</w:t>
-      </w:r>
-      <w:proofErr w:type="spellStart"/>
-      <w:r>
-        <w:t>Fidelidade</w:t>
-      </w:r>
-      <w:proofErr w:type="spellEnd"/>
-      <w:r>
-        <w:t xml:space="preserve">)” after the text “brand of </w:t>
-      </w:r>
-      <w:proofErr w:type="spellStart"/>
-      <w:r>
-        <w:t>Fidelidade</w:t>
-      </w:r>
-      <w:proofErr w:type="spellEnd"/>
-      <w:r>
-        <w:t>” add the text “ (“ then add the link https://www.fidelidade.pt/EN/fidelidade/Paginas/Homepage.aspx and then add the text “) ”. Then under the heading “ 3. Allianz Portugal” before the text “offers high-value plans” add the text “ (“ then add the link https://www.allianz.pt/ and then add the text “) ”.</w:t>
+        <w:t xml:space="preserve"> the heading “1. Médis” after the text “Médis (operated by the Ageas Group)</w:t>
+      </w:r>
+      <w:proofErr w:type="gramStart"/>
+      <w:r>
+        <w:t>” ”</w:t>
+      </w:r>
+      <w:proofErr w:type="gramEnd"/>
+      <w:r>
+        <w:t xml:space="preserve">, add the text </w:t>
+      </w:r>
+      <w:proofErr w:type="gramStart"/>
+      <w:r>
+        <w:t>“ (“ then</w:t>
+      </w:r>
+      <w:proofErr w:type="gramEnd"/>
+      <w:r>
+        <w:t xml:space="preserve"> add the link https://www.medis.pt/english/ and then add the text “</w:t>
+      </w:r>
+      <w:proofErr w:type="gramStart"/>
+      <w:r>
+        <w:t>) ”</w:t>
+      </w:r>
+      <w:proofErr w:type="gramEnd"/>
+      <w:r>
+        <w:t xml:space="preserve">. Then under the heading </w:t>
+      </w:r>
+      <w:proofErr w:type="gramStart"/>
+      <w:r>
+        <w:t>“ 2</w:t>
+      </w:r>
+      <w:proofErr w:type="gramEnd"/>
+      <w:r>
+        <w:t xml:space="preserve">. Multicare (Fidelidade)” after the text “brand of Fidelidade” add the text </w:t>
+      </w:r>
+      <w:proofErr w:type="gramStart"/>
+      <w:r>
+        <w:t>“ (“ then</w:t>
+      </w:r>
+      <w:proofErr w:type="gramEnd"/>
+      <w:r>
+        <w:t xml:space="preserve"> add the link https://www.fidelidade.pt/EN/fidelidade/Paginas/Homepage.aspx and then add the text “</w:t>
+      </w:r>
+      <w:proofErr w:type="gramStart"/>
+      <w:r>
+        <w:t>) ”</w:t>
+      </w:r>
+      <w:proofErr w:type="gramEnd"/>
+      <w:r>
+        <w:t xml:space="preserve">. Then under the heading </w:t>
+      </w:r>
+      <w:proofErr w:type="gramStart"/>
+      <w:r>
+        <w:t>“ 3</w:t>
+      </w:r>
+      <w:proofErr w:type="gramEnd"/>
+      <w:r>
+        <w:t xml:space="preserve">. Allianz Portugal” before the text “offers high-value </w:t>
+      </w:r>
+      <w:r>
+        <w:lastRenderedPageBreak/>
+        <w:t xml:space="preserve">plans” add the text </w:t>
+      </w:r>
+      <w:proofErr w:type="gramStart"/>
+      <w:r>
+        <w:t>“ (“ then</w:t>
+      </w:r>
+      <w:proofErr w:type="gramEnd"/>
+      <w:r>
+        <w:t xml:space="preserve"> add the link https://www.allianz.pt/ and then add the text “</w:t>
+      </w:r>
+      <w:proofErr w:type="gramStart"/>
+      <w:r>
+        <w:t>) ”</w:t>
+      </w:r>
+      <w:proofErr w:type="gramEnd"/>
+      <w:r>
+        <w:t>.</w:t>
       </w:r>
     </w:p>
     <w:p>
@@ -5633,11 +5003,7 @@
         </w:r>
       </w:hyperlink>
       <w:r>
-        <w:t xml:space="preserve"> </w:t>
-      </w:r>
-      <w:r>
-        <w:lastRenderedPageBreak/>
-        <w:t xml:space="preserve">to </w:t>
+        <w:t xml:space="preserve"> to </w:t>
       </w:r>
       <w:hyperlink r:id="rId16" w:history="1">
         <w:r>
@@ -5729,37 +5095,11 @@
       <w:r>
         <w:t xml:space="preserve">replace the companies </w:t>
       </w:r>
-      <w:proofErr w:type="spellStart"/>
-      <w:r>
-        <w:t>Médis</w:t>
-      </w:r>
-      <w:proofErr w:type="spellEnd"/>
-      <w:r>
-        <w:t xml:space="preserve">, </w:t>
-      </w:r>
-      <w:proofErr w:type="spellStart"/>
-      <w:r>
-        <w:t>Multicare</w:t>
-      </w:r>
-      <w:proofErr w:type="spellEnd"/>
-      <w:r>
-        <w:t xml:space="preserve">, Allianz Portugal, and Generali </w:t>
-      </w:r>
-      <w:proofErr w:type="spellStart"/>
-      <w:r>
-        <w:t>Tranquilidade</w:t>
-      </w:r>
-      <w:proofErr w:type="spellEnd"/>
-      <w:r>
-        <w:t xml:space="preserve"> with </w:t>
-      </w:r>
-      <w:proofErr w:type="spellStart"/>
-      <w:r>
-        <w:t>SafetyWing</w:t>
-      </w:r>
-      <w:proofErr w:type="spellEnd"/>
-      <w:r>
-        <w:t xml:space="preserve">, Cigna Global, and IMG. Do </w:t>
+      <w:r>
+        <w:t>Médis, Multicare, Allianz Portugal, and Generali Tranquilidade</w:t>
+      </w:r>
+      <w:r>
+        <w:t xml:space="preserve"> with SafetyWing, Cigna Global, and IMG. Do </w:t>
       </w:r>
       <w:r>
         <w:t>the</w:t>
@@ -5780,11 +5120,16 @@
         <w:t>text “</w:t>
       </w:r>
       <w:r>
-        <w:t>Last Updated:</w:t>
+        <w:t>Last Updated</w:t>
+      </w:r>
+      <w:proofErr w:type="gramStart"/>
+      <w:r>
+        <w:t>:</w:t>
       </w:r>
       <w:r>
         <w:t xml:space="preserve"> ”</w:t>
       </w:r>
+      <w:proofErr w:type="gramEnd"/>
       <w:r>
         <w:t xml:space="preserve"> followed by the last date the page was verified and updated.</w:t>
       </w:r>
@@ -5798,10 +5143,18 @@
         <w:t>“</w:t>
       </w:r>
       <w:r>
-        <w:t>Last Updated:</w:t>
-      </w:r>
-      <w:r>
-        <w:t xml:space="preserve"> ” and date </w:t>
+        <w:t>Last Updated</w:t>
+      </w:r>
+      <w:proofErr w:type="gramStart"/>
+      <w:r>
+        <w:t>:</w:t>
+      </w:r>
+      <w:r>
+        <w:t xml:space="preserve"> ”</w:t>
+      </w:r>
+      <w:proofErr w:type="gramEnd"/>
+      <w:r>
+        <w:t xml:space="preserve"> and date </w:t>
       </w:r>
       <w:r>
         <w:t xml:space="preserve">text font color to the same as the font color </w:t>
@@ -5962,6 +5315,7 @@
           <w:b/>
           <w:bCs/>
         </w:rPr>
+        <w:lastRenderedPageBreak/>
         <w:t>Family (3-4)</w:t>
       </w:r>
       <w:r>
@@ -6017,7 +5371,15 @@
         <w:t xml:space="preserve"> add the text “Basic services </w:t>
       </w:r>
       <w:r>
-        <w:t>for “ then add the “</w:t>
+        <w:t xml:space="preserve">for </w:t>
+      </w:r>
+      <w:proofErr w:type="gramStart"/>
+      <w:r>
+        <w:t>“ then</w:t>
+      </w:r>
+      <w:proofErr w:type="gramEnd"/>
+      <w:r>
+        <w:t xml:space="preserve"> add the “</w:t>
       </w:r>
       <w:r>
         <w:t>3. Relocating Household Size</w:t>
@@ -6031,78 +5393,278 @@
     </w:p>
     <w:p>
       <w:r>
+        <w:t>On the “</w:t>
+      </w:r>
+      <w:r>
+        <w:t>Portugal Private Health Insurance Guide for US Expats &amp; Visa Applicants</w:t>
+      </w:r>
+      <w:r>
+        <w:t xml:space="preserve">” page, change the text </w:t>
+      </w:r>
+      <w:r>
+        <w:t>“</w:t>
+      </w:r>
+      <w:r>
+        <w:t>A comprehensive comparative market study and consulting analysis mapping the leading international expat health insurance providers for residents in Portugal.</w:t>
+      </w:r>
+      <w:r>
+        <w:t>” to “</w:t>
+      </w:r>
+      <w:r>
+        <w:t xml:space="preserve">A comprehensive comparative market study and consulting analysis mapping the leading international expat health insurance providers for </w:t>
+      </w:r>
+      <w:r>
+        <w:t>h</w:t>
+      </w:r>
+      <w:r>
+        <w:t xml:space="preserve">ealthcare in Portugal for </w:t>
+      </w:r>
+      <w:r>
+        <w:t>American residents</w:t>
+      </w:r>
+      <w:r>
+        <w:t>.</w:t>
+      </w:r>
+      <w:r>
+        <w:t>”</w:t>
+      </w:r>
+    </w:p>
+    <w:p/>
+    <w:p>
+      <w:pPr>
+        <w:pStyle w:val="Heading1"/>
+      </w:pPr>
+      <w:r>
+        <w:t>Shipping &amp; Relocation</w:t>
+      </w:r>
+    </w:p>
+    <w:p>
+      <w:r>
+        <w:t xml:space="preserve">When calculating the </w:t>
+      </w:r>
+      <w:r>
+        <w:t>Shipping &amp; Relocation Setup</w:t>
+      </w:r>
+      <w:r>
+        <w:t>, c</w:t>
+      </w:r>
+      <w:r>
+        <w:t>reate a comprehensive relocation guide that includes current, accurate, and well-sourced information. Please cover the complete process of moving household belongings from the US to Portugal. The five leading international shipping and relocation companies that specialize in US to Portugal moves. For each company, provide services offered, areas served, customer ratings, advantages, disadvantages, and contact info. Shipping cost estimates for a 1-bedroom apartment, a 2 to 3-bedroom home, full 20-foot container, full 40-foot container, and less than container load shipments. Compare sea freight versus air freight, including typical transit times, costs, and when each option is recommended. Explain marine cargo insurance coverage types, typical cost percentage, common exclusions, and whether it's recommended. Describe customs requirements for importing household goods into Portugal, required documentation, duty-free eligibility, restricted or prohibited items, and any taxes or import duties that may apply. Now, list additional relocation expenses. Packing services, storage, customs broker fees, port charges, delivery charges, and visa-related expenses. Give practical tips for reducing costs and avoiding common mistakes, and include a comparison table showing shipping company, services, estimated cost, transit time, insurance options, customer ratings, and website. And, include links to official Portuguese government resources covering customs and importing household goods.</w:t>
+      </w:r>
+      <w:r>
+        <w:t xml:space="preserve"> Then make the </w:t>
+      </w:r>
+      <w:r>
+        <w:t>Shipping &amp; Relocation Setup</w:t>
+      </w:r>
+      <w:r>
+        <w:t xml:space="preserve"> heading a link to a new internet tab which contains a report of the analysis conducted.</w:t>
+      </w:r>
+    </w:p>
+    <w:p>
+      <w:r>
         <w:lastRenderedPageBreak/>
-        <w:t>On the “Portugal Private Health Insurance Guide for US Expats &amp; Visa Applicants</w:t>
-      </w:r>
-      <w:r>
-        <w:t xml:space="preserve">” page, change the text </w:t>
+        <w:t>Change the wording “</w:t>
+      </w:r>
+      <w:r>
+        <w:t>Shipping &amp; Relocation Setup</w:t>
+      </w:r>
+      <w:r>
+        <w:t xml:space="preserve">” to </w:t>
       </w:r>
       <w:r>
         <w:t>“</w:t>
       </w:r>
       <w:r>
-        <w:t>A comprehensive comparative market study and consulting analysis mapping the leading international expat health insurance providers for residents in Portugal.</w:t>
-      </w:r>
-      <w:r>
-        <w:t>” to “</w:t>
-      </w:r>
-      <w:r>
-        <w:t xml:space="preserve">A comprehensive comparative market study and consulting analysis mapping the leading international expat health insurance providers for </w:t>
-      </w:r>
-      <w:r>
-        <w:t>h</w:t>
-      </w:r>
-      <w:r>
-        <w:t xml:space="preserve">ealthcare in Portugal for </w:t>
-      </w:r>
-      <w:r>
-        <w:t>American residents</w:t>
-      </w:r>
-      <w:r>
-        <w:t>.</w:t>
-      </w:r>
-      <w:r>
-        <w:t>”</w:t>
+        <w:t>Shipping &amp; Relocation Setup</w:t>
+      </w:r>
+      <w:r>
+        <w:t xml:space="preserve"> (Average)”, then</w:t>
+      </w:r>
+      <w:r>
+        <w:t>,</w:t>
+      </w:r>
+      <w:r>
+        <w:t xml:space="preserve"> for the </w:t>
+      </w:r>
+      <w:r>
+        <w:t xml:space="preserve">displayed </w:t>
+      </w:r>
+      <w:r>
+        <w:t xml:space="preserve">amount, </w:t>
+      </w:r>
+      <w:r>
+        <w:t xml:space="preserve">calculate an </w:t>
+      </w:r>
+      <w:r>
+        <w:t>average cost across all price metrics.</w:t>
       </w:r>
     </w:p>
     <w:p/>
     <w:p>
-      <w:pPr>
-        <w:pStyle w:val="Heading1"/>
-      </w:pPr>
-      <w:r>
-        <w:t>Shipping &amp; Relocation</w:t>
-      </w:r>
-    </w:p>
-    <w:p>
-      <w:r>
-        <w:t xml:space="preserve">When calculating the </w:t>
+      <w:r>
+        <w:t>To calculate the “</w:t>
       </w:r>
       <w:r>
         <w:t>Shipping &amp; Relocation Setup</w:t>
       </w:r>
       <w:r>
-        <w:t>, c</w:t>
-      </w:r>
-      <w:r>
-        <w:t>reate a comprehensive relocation guide that includes current, accurate, and well-sourced information. Please cover the complete process of moving household belongings from the US to Portugal. The five leading international shipping and relocation companies that specialize in US to Portugal moves. For each company, provide services offered, areas served, customer ratings, advantages, disadvantages, and contact info. Shipping cost estimates for a 1-bedroom apartment, a 2 to 3-bedroom home, full 20-foot container, full 40-foot container, and less than container load shipments. Compare sea freight versus air freight, including typical transit times, costs, and when each option is recommended. Explain marine cargo insurance coverage types, typical cost percentage, common exclusions, and whether it's recommended. Describe customs requirements for importing household goods into Portugal, required documentation, duty-free eligibility, restricted or prohibited items, and any taxes or import duties that may apply. Now, list additional relocation expenses. Packing services, storage, customs broker fees, port charges, delivery charges, and visa-related expenses. Give practical tips for reducing costs and avoiding common mistakes, and include a comparison table showing shipping company, services, estimated cost, transit time, insurance options, customer ratings, and website. And, include links to official Portuguese government resources covering customs and importing household goods.</w:t>
-      </w:r>
-      <w:r>
-        <w:t xml:space="preserve"> Then make the </w:t>
+        <w:t xml:space="preserve"> (Average)” amount, add the </w:t>
+      </w:r>
+      <w:r>
+        <w:t xml:space="preserve">5 lowest “Estimated Cost (USD)” amount </w:t>
+      </w:r>
+      <w:r>
+        <w:t xml:space="preserve">from the 5 ranges, </w:t>
+      </w:r>
+      <w:r>
+        <w:t xml:space="preserve">and divide by 5, and </w:t>
+      </w:r>
+      <w:r>
+        <w:t xml:space="preserve">then </w:t>
+      </w:r>
+      <w:r>
+        <w:t xml:space="preserve">use the </w:t>
+      </w:r>
+      <w:r>
+        <w:t xml:space="preserve">calculated </w:t>
+      </w:r>
+      <w:r>
+        <w:t xml:space="preserve">amount as the </w:t>
+      </w:r>
+      <w:r>
+        <w:t>Average Lowest amount. Then</w:t>
+      </w:r>
+      <w:r>
+        <w:t xml:space="preserve"> </w:t>
+      </w:r>
+      <w:r>
+        <w:t xml:space="preserve">add the 5 </w:t>
+      </w:r>
+      <w:r>
+        <w:t xml:space="preserve">highest “Estimated Cost (USD)” amounts from the 5 ranges, </w:t>
+      </w:r>
+      <w:r>
+        <w:t>divide by 5</w:t>
+      </w:r>
+      <w:r>
+        <w:t xml:space="preserve">, and use the amount as the Average </w:t>
+      </w:r>
+      <w:r>
+        <w:t>Highest</w:t>
+      </w:r>
+      <w:r>
+        <w:t xml:space="preserve"> amount</w:t>
+      </w:r>
+      <w:r>
+        <w:t xml:space="preserve">. Then add together the calculated Average Lowest amount and the calculated Average </w:t>
+      </w:r>
+      <w:r>
+        <w:t>Highest amount and divide</w:t>
+      </w:r>
+      <w:r>
+        <w:t xml:space="preserve"> the </w:t>
+      </w:r>
+      <w:r>
+        <w:t>combined</w:t>
+      </w:r>
+      <w:r>
+        <w:t xml:space="preserve"> amount by 2. Then this calculated amount is displayed </w:t>
+      </w:r>
+      <w:r>
+        <w:t>as the “</w:t>
       </w:r>
       <w:r>
         <w:t>Shipping &amp; Relocation Setup</w:t>
       </w:r>
       <w:r>
-        <w:t xml:space="preserve"> heading a link to a new internet tab which contains a report of the analysis conducted.</w:t>
-      </w:r>
-    </w:p>
-    <w:p>
-      <w:r>
-        <w:t>Change the wording “</w:t>
-      </w:r>
-      <w:r>
-        <w:t>Shipping &amp; Relocation Setup</w:t>
+        <w:t xml:space="preserve"> (Average)” amount.</w:t>
+      </w:r>
+    </w:p>
+    <w:p/>
+    <w:p>
+      <w:r>
+        <w:t>In the “</w:t>
+      </w:r>
+      <w:r>
+        <w:t>US to Portugal Shipping &amp; Relocation Guide</w:t>
+      </w:r>
+      <w:r>
+        <w:t xml:space="preserve">” page, for all text between the characters </w:t>
+      </w:r>
+      <w:r>
+        <w:t>*</w:t>
+      </w:r>
+      <w:r>
+        <w:t xml:space="preserve"> </w:t>
+      </w:r>
+      <w:r>
+        <w:t>*</w:t>
+      </w:r>
+      <w:r>
+        <w:t xml:space="preserve">, change the text to be bold and remove the </w:t>
+      </w:r>
+      <w:r>
+        <w:t>*</w:t>
+      </w:r>
+      <w:r>
+        <w:t xml:space="preserve"> </w:t>
+      </w:r>
+      <w:r>
+        <w:t>*</w:t>
+      </w:r>
+      <w:r>
+        <w:t xml:space="preserve"> characters. Then, make all website https://www references into links.</w:t>
+      </w:r>
+    </w:p>
+    <w:p/>
+    <w:p>
+      <w:r>
+        <w:t>In the “</w:t>
+      </w:r>
+      <w:r>
+        <w:t>US to Portugal Shipping &amp; Relocation Guide</w:t>
+      </w:r>
+      <w:r>
+        <w:t xml:space="preserve">” page, </w:t>
+      </w:r>
+      <w:r>
+        <w:t xml:space="preserve">centralize the text </w:t>
+      </w:r>
+      <w:r>
+        <w:t>“← Return to Budget Dashboard”</w:t>
+      </w:r>
+      <w:r>
+        <w:t xml:space="preserve"> on the page.</w:t>
+      </w:r>
+    </w:p>
+    <w:p>
+      <w:r>
+        <w:t>In the “</w:t>
+      </w:r>
+      <w:r>
+        <w:t>US to Portugal Shipping &amp; Relocation Guide</w:t>
+      </w:r>
+      <w:r>
+        <w:t>” page, change the te</w:t>
+      </w:r>
+      <w:r>
+        <w:t>x</w:t>
+      </w:r>
+      <w:r>
+        <w:t xml:space="preserve">t </w:t>
+      </w:r>
+      <w:r>
+        <w:t>“</w:t>
+      </w:r>
+      <w:r>
+        <w:t>FCL</w:t>
+      </w:r>
+      <w:r>
+        <w:t>” to Full Container Load (FCL), and “</w:t>
+      </w:r>
+      <w:r>
+        <w:t>LCL</w:t>
       </w:r>
       <w:r>
         <w:t xml:space="preserve">” to </w:t>
@@ -6111,204 +5673,6 @@
         <w:t>“</w:t>
       </w:r>
       <w:r>
-        <w:t>Shipping &amp; Relocation Setup</w:t>
-      </w:r>
-      <w:r>
-        <w:t xml:space="preserve"> (Average)”, then</w:t>
-      </w:r>
-      <w:r>
-        <w:t>,</w:t>
-      </w:r>
-      <w:r>
-        <w:t xml:space="preserve"> for the </w:t>
-      </w:r>
-      <w:r>
-        <w:t xml:space="preserve">displayed </w:t>
-      </w:r>
-      <w:r>
-        <w:t xml:space="preserve">amount, </w:t>
-      </w:r>
-      <w:r>
-        <w:t xml:space="preserve">calculate an </w:t>
-      </w:r>
-      <w:r>
-        <w:t>average cost across all price metrics.</w:t>
-      </w:r>
-    </w:p>
-    <w:p/>
-    <w:p>
-      <w:r>
-        <w:t>To calculate the “</w:t>
-      </w:r>
-      <w:r>
-        <w:t>Shipping &amp; Relocation Setup</w:t>
-      </w:r>
-      <w:r>
-        <w:t xml:space="preserve"> (Average)” amount, add the </w:t>
-      </w:r>
-      <w:r>
-        <w:t xml:space="preserve">5 lowest “Estimated Cost (USD)” amount </w:t>
-      </w:r>
-      <w:r>
-        <w:t xml:space="preserve">from the 5 ranges, </w:t>
-      </w:r>
-      <w:r>
-        <w:t xml:space="preserve">and divide by 5, and </w:t>
-      </w:r>
-      <w:r>
-        <w:t xml:space="preserve">then </w:t>
-      </w:r>
-      <w:r>
-        <w:t xml:space="preserve">use the </w:t>
-      </w:r>
-      <w:r>
-        <w:t xml:space="preserve">calculated </w:t>
-      </w:r>
-      <w:r>
-        <w:t xml:space="preserve">amount as the </w:t>
-      </w:r>
-      <w:r>
-        <w:t>Average Lowest amount. Then</w:t>
-      </w:r>
-      <w:r>
-        <w:t xml:space="preserve"> </w:t>
-      </w:r>
-      <w:r>
-        <w:t xml:space="preserve">add the 5 </w:t>
-      </w:r>
-      <w:r>
-        <w:t xml:space="preserve">highest “Estimated Cost (USD)” amounts from the 5 ranges, </w:t>
-      </w:r>
-      <w:r>
-        <w:t>divide by 5</w:t>
-      </w:r>
-      <w:r>
-        <w:t xml:space="preserve">, and use the amount as the Average </w:t>
-      </w:r>
-      <w:r>
-        <w:lastRenderedPageBreak/>
-        <w:t>Highest</w:t>
-      </w:r>
-      <w:r>
-        <w:t xml:space="preserve"> amount</w:t>
-      </w:r>
-      <w:r>
-        <w:t xml:space="preserve">. Then add together the calculated Average Lowest amount and the calculated Average </w:t>
-      </w:r>
-      <w:r>
-        <w:t>Highest amount and divide</w:t>
-      </w:r>
-      <w:r>
-        <w:t xml:space="preserve"> the </w:t>
-      </w:r>
-      <w:r>
-        <w:t>combined</w:t>
-      </w:r>
-      <w:r>
-        <w:t xml:space="preserve"> amount by 2. Then this calculated amount is displayed </w:t>
-      </w:r>
-      <w:r>
-        <w:t>as the “</w:t>
-      </w:r>
-      <w:r>
-        <w:t>Shipping &amp; Relocation Setup</w:t>
-      </w:r>
-      <w:r>
-        <w:t xml:space="preserve"> (Average)” amount.</w:t>
-      </w:r>
-    </w:p>
-    <w:p/>
-    <w:p>
-      <w:r>
-        <w:t>In the “</w:t>
-      </w:r>
-      <w:r>
-        <w:t>US to Portugal Shipping &amp; Relocation Guide</w:t>
-      </w:r>
-      <w:r>
-        <w:t xml:space="preserve">” page, for all text between the characters </w:t>
-      </w:r>
-      <w:r>
-        <w:t>*</w:t>
-      </w:r>
-      <w:r>
-        <w:t xml:space="preserve"> </w:t>
-      </w:r>
-      <w:r>
-        <w:t>*</w:t>
-      </w:r>
-      <w:r>
-        <w:t xml:space="preserve">, change the text to be bold and remove the </w:t>
-      </w:r>
-      <w:r>
-        <w:t>*</w:t>
-      </w:r>
-      <w:r>
-        <w:t xml:space="preserve"> </w:t>
-      </w:r>
-      <w:r>
-        <w:t>*</w:t>
-      </w:r>
-      <w:r>
-        <w:t xml:space="preserve"> characters. Then, make all website https://www references into links.</w:t>
-      </w:r>
-    </w:p>
-    <w:p/>
-    <w:p>
-      <w:r>
-        <w:t>In the “</w:t>
-      </w:r>
-      <w:r>
-        <w:t>US to Portugal Shipping &amp; Relocation Guide</w:t>
-      </w:r>
-      <w:r>
-        <w:t xml:space="preserve">” page, </w:t>
-      </w:r>
-      <w:r>
-        <w:t xml:space="preserve">centralize the text </w:t>
-      </w:r>
-      <w:r>
-        <w:t>“← Return to Budget Dashboard”</w:t>
-      </w:r>
-      <w:r>
-        <w:t xml:space="preserve"> on the page.</w:t>
-      </w:r>
-    </w:p>
-    <w:p>
-      <w:r>
-        <w:t>In the “</w:t>
-      </w:r>
-      <w:r>
-        <w:t>US to Portugal Shipping &amp; Relocation Guide</w:t>
-      </w:r>
-      <w:r>
-        <w:t>” page, change the te</w:t>
-      </w:r>
-      <w:r>
-        <w:t>x</w:t>
-      </w:r>
-      <w:r>
-        <w:t xml:space="preserve">t </w:t>
-      </w:r>
-      <w:r>
-        <w:t>“</w:t>
-      </w:r>
-      <w:r>
-        <w:t>FCL</w:t>
-      </w:r>
-      <w:r>
-        <w:t>” to Full Container Load (FCL), and “</w:t>
-      </w:r>
-      <w:r>
-        <w:t>LCL</w:t>
-      </w:r>
-      <w:r>
-        <w:t xml:space="preserve">” to </w:t>
-      </w:r>
-      <w:r>
-        <w:t>“</w:t>
-      </w:r>
-      <w:r>
         <w:t>Less than Container Load</w:t>
       </w:r>
       <w:r>
@@ -6316,11 +5680,9 @@
       </w:r>
     </w:p>
     <w:p>
-      <w:proofErr w:type="spellStart"/>
       <w:r>
         <w:t>ReloAdvisor</w:t>
       </w:r>
-      <w:proofErr w:type="spellEnd"/>
       <w:r>
         <w:t xml:space="preserve"> - </w:t>
       </w:r>
@@ -6335,11 +5697,9 @@
     </w:p>
     <w:p/>
     <w:p>
-      <w:proofErr w:type="spellStart"/>
       <w:r>
         <w:t>Sirelo</w:t>
       </w:r>
-      <w:proofErr w:type="spellEnd"/>
       <w:r>
         <w:t xml:space="preserve"> </w:t>
       </w:r>
@@ -6356,13 +5716,8 @@
       </w:hyperlink>
     </w:p>
     <w:p>
-      <w:proofErr w:type="spellStart"/>
-      <w:r>
-        <w:t>Moovik</w:t>
-      </w:r>
-      <w:proofErr w:type="spellEnd"/>
-      <w:r>
-        <w:t xml:space="preserve"> - </w:t>
+      <w:r>
+        <w:t xml:space="preserve">Moovik - </w:t>
       </w:r>
       <w:hyperlink r:id="rId23" w:history="1">
         <w:r>
@@ -6424,6 +5779,7 @@
           <w:b/>
           <w:bCs/>
         </w:rPr>
+        <w:lastRenderedPageBreak/>
         <w:t>International Van Lines (IVL)</w:t>
       </w:r>
       <w:r>
@@ -6449,40 +5805,15 @@
       </w:hyperlink>
     </w:p>
     <w:p>
-      <w:proofErr w:type="spellStart"/>
-      <w:r>
-        <w:rPr>
-          <w:b/>
-          <w:bCs/>
-        </w:rPr>
-        <w:t>Sirelo</w:t>
-      </w:r>
-      <w:proofErr w:type="spellEnd"/>
-      <w:r>
-        <w:rPr>
-          <w:b/>
-          <w:bCs/>
-        </w:rPr>
-        <w:t xml:space="preserve"> –</w:t>
-      </w:r>
-      <w:r>
-        <w:t xml:space="preserve"> Earn up to 50% revenue share on every valid moving lead. </w:t>
-      </w:r>
-      <w:proofErr w:type="spellStart"/>
-      <w:r>
-        <w:t>Sirelo</w:t>
-      </w:r>
-      <w:proofErr w:type="spellEnd"/>
-      <w:r>
-        <w:t xml:space="preserve"> provides high-converting </w:t>
-      </w:r>
-      <w:proofErr w:type="spellStart"/>
-      <w:r>
-        <w:t>iframes</w:t>
-      </w:r>
-      <w:proofErr w:type="spellEnd"/>
-      <w:r>
-        <w:t>, search widgets, API integrations, and banner assets.</w:t>
+      <w:r>
+        <w:rPr>
+          <w:b/>
+          <w:bCs/>
+        </w:rPr>
+        <w:t>Sirelo –</w:t>
+      </w:r>
+      <w:r>
+        <w:t xml:space="preserve"> Earn up to 50% revenue share on every valid moving lead. Sirelo provides high-converting iframes, search widgets, API integrations, and banner assets.</w:t>
       </w:r>
       <w:r>
         <w:t xml:space="preserve"> </w:t>
@@ -6492,21 +5823,7 @@
           <w:rPr>
             <w:rStyle w:val="Hyperlink"/>
           </w:rPr>
-          <w:t xml:space="preserve">Visit </w:t>
-        </w:r>
-        <w:proofErr w:type="spellStart"/>
-        <w:r>
-          <w:rPr>
-            <w:rStyle w:val="Hyperlink"/>
-          </w:rPr>
-          <w:t>Sirelo</w:t>
-        </w:r>
-        <w:proofErr w:type="spellEnd"/>
-        <w:r>
-          <w:rPr>
-            <w:rStyle w:val="Hyperlink"/>
-          </w:rPr>
-          <w:t xml:space="preserve"> Platform</w:t>
+          <w:t>Visit Sirelo Platform</w:t>
         </w:r>
       </w:hyperlink>
     </w:p>
@@ -6517,22 +5834,12 @@
           <w:bCs/>
         </w:rPr>
       </w:pPr>
-      <w:proofErr w:type="spellStart"/>
-      <w:r>
-        <w:rPr>
-          <w:b/>
-          <w:bCs/>
-        </w:rPr>
-        <w:lastRenderedPageBreak/>
-        <w:t>UPakWeShip</w:t>
-      </w:r>
-      <w:proofErr w:type="spellEnd"/>
-      <w:r>
-        <w:rPr>
-          <w:b/>
-          <w:bCs/>
-        </w:rPr>
-        <w:t xml:space="preserve"> -</w:t>
+      <w:r>
+        <w:rPr>
+          <w:b/>
+          <w:bCs/>
+        </w:rPr>
+        <w:t>UPakWeShip -</w:t>
       </w:r>
       <w:r>
         <w:t xml:space="preserve"> </w:t>
@@ -6548,34 +5855,17 @@
           <w:rPr>
             <w:rStyle w:val="Hyperlink"/>
           </w:rPr>
-          <w:t xml:space="preserve">Visit </w:t>
+          <w:t>Visit UPakWeShip</w:t>
         </w:r>
-        <w:proofErr w:type="spellStart"/>
-        <w:r>
-          <w:rPr>
-            <w:rStyle w:val="Hyperlink"/>
-          </w:rPr>
-          <w:t>UPakWeShip</w:t>
-        </w:r>
-        <w:proofErr w:type="spellEnd"/>
       </w:hyperlink>
     </w:p>
     <w:p>
-      <w:proofErr w:type="spellStart"/>
-      <w:r>
-        <w:rPr>
-          <w:b/>
-          <w:bCs/>
-        </w:rPr>
-        <w:t>ReloAdvisor</w:t>
-      </w:r>
-      <w:proofErr w:type="spellEnd"/>
-      <w:r>
-        <w:rPr>
-          <w:b/>
-          <w:bCs/>
-        </w:rPr>
-        <w:t xml:space="preserve"> -</w:t>
+      <w:r>
+        <w:rPr>
+          <w:b/>
+          <w:bCs/>
+        </w:rPr>
+        <w:t>ReloAdvisor -</w:t>
       </w:r>
       <w:r>
         <w:t xml:space="preserve"> </w:t>
@@ -6591,16 +5881,8 @@
           <w:rPr>
             <w:rStyle w:val="Hyperlink"/>
           </w:rPr>
-          <w:t xml:space="preserve">Visit </w:t>
+          <w:t>Visit ReloAdvisor</w:t>
         </w:r>
-        <w:proofErr w:type="spellStart"/>
-        <w:r>
-          <w:rPr>
-            <w:rStyle w:val="Hyperlink"/>
-          </w:rPr>
-          <w:t>ReloAdvisor</w:t>
-        </w:r>
-        <w:proofErr w:type="spellEnd"/>
       </w:hyperlink>
     </w:p>
     <w:p>
@@ -6701,11 +5983,7 @@
         <w:t>with the same details for the com</w:t>
       </w:r>
       <w:r>
-        <w:t xml:space="preserve">pany </w:t>
-      </w:r>
-      <w:proofErr w:type="spellStart"/>
-      <w:r>
-        <w:t>R</w:t>
+        <w:t>pany R</w:t>
       </w:r>
       <w:r>
         <w:t>e</w:t>
@@ -6713,7 +5991,6 @@
       <w:r>
         <w:t>locately</w:t>
       </w:r>
-      <w:proofErr w:type="spellEnd"/>
       <w:r>
         <w:t>.</w:t>
       </w:r>
@@ -6757,15 +6034,7 @@
         <w:t xml:space="preserve"> and the option “</w:t>
       </w:r>
       <w:r>
-        <w:t xml:space="preserve">5. </w:t>
-      </w:r>
-      <w:proofErr w:type="spellStart"/>
-      <w:r>
-        <w:t>UPakWeShip</w:t>
-      </w:r>
-      <w:proofErr w:type="spellEnd"/>
-      <w:r>
-        <w:t xml:space="preserve"> - Best for Budget-Conscious Expatriates</w:t>
+        <w:t>5. UPakWeShip - Best for Budget-Conscious Expatriates</w:t>
       </w:r>
       <w:r>
         <w:t xml:space="preserve">”, then </w:t>
@@ -6816,6 +6085,7 @@
     <w:p/>
     <w:p>
       <w:r>
+        <w:lastRenderedPageBreak/>
         <w:t>In the “</w:t>
       </w:r>
       <w:r>
@@ -6870,7 +6140,6 @@
     <w:p/>
     <w:p>
       <w:r>
-        <w:lastRenderedPageBreak/>
         <w:t>In the primary page under the section “</w:t>
       </w:r>
       <w:r>
@@ -7093,11 +6362,16 @@
         <w:t>US to Portugal Shipping &amp; Relocation Guide</w:t>
       </w:r>
       <w:r>
-        <w:t xml:space="preserve">” page under the section </w:t>
+        <w:t xml:space="preserve">” page under the </w:t>
+      </w:r>
+      <w:proofErr w:type="gramStart"/>
+      <w:r>
+        <w:t xml:space="preserve">section </w:t>
       </w:r>
       <w:r>
         <w:t>.</w:t>
       </w:r>
+      <w:proofErr w:type="gramEnd"/>
       <w:r>
         <w:t xml:space="preserve"> </w:t>
       </w:r>
@@ -7149,6 +6423,7 @@
     </w:p>
     <w:p>
       <w:r>
+        <w:lastRenderedPageBreak/>
         <w:t>For example:</w:t>
       </w:r>
     </w:p>
@@ -7192,7 +6467,6 @@
           <w:b/>
           <w:bCs/>
         </w:rPr>
-        <w:lastRenderedPageBreak/>
         <w:t>Display the Result</w:t>
       </w:r>
     </w:p>
@@ -7216,8 +6490,17 @@
           <w:b/>
           <w:bCs/>
         </w:rPr>
-        <w:t>$X,XXX</w:t>
-      </w:r>
+        <w:t>$</w:t>
+      </w:r>
+      <w:proofErr w:type="gramStart"/>
+      <w:r>
+        <w:rPr>
+          <w:b/>
+          <w:bCs/>
+        </w:rPr>
+        <w:t>X,XXX</w:t>
+      </w:r>
+      <w:proofErr w:type="gramEnd"/>
     </w:p>
     <w:p>
       <w:r>
@@ -7373,6 +6656,7 @@
     </w:p>
     <w:p>
       <w:r>
+        <w:lastRenderedPageBreak/>
         <w:t>Do not average the costs of different family sizes.</w:t>
       </w:r>
     </w:p>
@@ -7413,7 +6697,6 @@
     </w:p>
     <w:p>
       <w:r>
-        <w:lastRenderedPageBreak/>
         <w:t>Display the final result prominently and format the amount as U.S. dollars with commas and no unnecessary decimal places.</w:t>
       </w:r>
     </w:p>
@@ -7567,7 +6850,11 @@
         <w:t>costs are</w:t>
       </w:r>
       <w:r>
-        <w:t xml:space="preserve"> estimated averages. Actual international moving costs will vary and should be confirmed with a professional moving company.”</w:t>
+        <w:t xml:space="preserve"> estimated averages. Actual </w:t>
+      </w:r>
+      <w:r>
+        <w:lastRenderedPageBreak/>
+        <w:t>international moving costs will vary and should be confirmed with a professional moving company.”</w:t>
       </w:r>
     </w:p>
     <w:p/>
@@ -7576,8 +6863,225 @@
         <w:pStyle w:val="Heading1"/>
       </w:pPr>
       <w:r>
+        <w:t>Apartments</w:t>
+      </w:r>
+    </w:p>
+    <w:p>
+      <w:r>
+        <w:t xml:space="preserve">When calculating the </w:t>
+      </w:r>
+      <w:r>
+        <w:t>“</w:t>
+      </w:r>
+      <w:r>
+        <w:t>Estimated Target Monthly Rent</w:t>
+      </w:r>
+      <w:r>
+        <w:t>”</w:t>
+      </w:r>
+      <w:r>
+        <w:t>, create a</w:t>
+      </w:r>
+      <w:r>
+        <w:t>n</w:t>
+      </w:r>
+      <w:r>
+        <w:t xml:space="preserve"> </w:t>
+      </w:r>
+      <w:r>
+        <w:t>e</w:t>
+      </w:r>
+      <w:r>
+        <w:t>stimated Target Monthly Rent</w:t>
+      </w:r>
+      <w:r>
+        <w:t xml:space="preserve">al </w:t>
+      </w:r>
+      <w:r>
+        <w:t xml:space="preserve">page </w:t>
+      </w:r>
+      <w:r>
+        <w:t>estimat</w:t>
+      </w:r>
+      <w:r>
+        <w:t>ing</w:t>
+      </w:r>
+      <w:r>
+        <w:t xml:space="preserve"> monthly rental prices in Portugal for Lisbon, Porto (North), and the Algarve Coast. Include property types T1/T2</w:t>
+      </w:r>
+      <w:r>
+        <w:t xml:space="preserve"> </w:t>
+      </w:r>
+      <w:r>
+        <w:t xml:space="preserve">apartments (one to two bedrooms), T3 family apartments (three bedrooms), and detached villas. Show low, medium, and high estimated monthly rents in </w:t>
+      </w:r>
+      <w:r>
+        <w:t>dollars</w:t>
+      </w:r>
+      <w:r>
+        <w:t>, presented in a clean comparison table. Note that the figures are estimates and can vary by micro-location, property condition, size, amenities, and seasonality. Allow easy updating of rental data via a JSON file or database, not hard-coded. Design the code to be modular, documented, and easy to maintain. Use a modern tech stack (e.g., HTML, CSS, JavaScript or React). Include a last updated date. Optionally support filters like furnished or unfurnished, new build versus older property, city centre versus suburbs, number of bathrooms, balcony or terrace, swimming pool, sea view, parking, and short-term versus long-term rental.</w:t>
+      </w:r>
+      <w:r>
+        <w:t xml:space="preserve"> Then </w:t>
+      </w:r>
+      <w:r>
+        <w:t xml:space="preserve">add a section titled 'Rental Requirements and Legal Information' for each region. For Lisbon, Porto, and the Algarve, display typical security deposit amounts (for example, one or two months' rent if that's customary. Note whether advance rent is commonly required and whether a guarantor (fiador) is typically required and what alternatives are accepted (for example, extra deposit, bank guarantee, proof of income). Include the typical legal or administrative costs involved in preparing a residential tenancy agreement, and indicate who usually pays. Add a brief overview of the standard lease process in Portugal and a disclaimer that requirements can vary with landlord or agency and may change with Portuguese law. Present this information in a clear, easy-to-read format </w:t>
+      </w:r>
+      <w:r>
+        <w:t>with</w:t>
+      </w:r>
+      <w:r>
+        <w:t xml:space="preserve"> the rent estimates.</w:t>
+      </w:r>
+      <w:r>
+        <w:t xml:space="preserve"> </w:t>
+      </w:r>
+      <w:r>
+        <w:t>“</w:t>
+      </w:r>
+      <w:r>
+        <w:t xml:space="preserve">Then make the </w:t>
+      </w:r>
+      <w:r>
+        <w:t>Estimated Target Monthly Rent</w:t>
+      </w:r>
+      <w:r>
+        <w:t>”</w:t>
+      </w:r>
+      <w:r>
+        <w:t xml:space="preserve"> </w:t>
+      </w:r>
+      <w:r>
+        <w:t>heading a link to a new internet tab which contains a report of the analysis conducted.</w:t>
+      </w:r>
+    </w:p>
+    <w:p/>
+    <w:p>
+      <w:r>
+        <w:t>To calculate the displayed “</w:t>
+      </w:r>
+      <w:r>
+        <w:t>Estimated Target Monthly Rent</w:t>
+      </w:r>
+      <w:r>
+        <w:t>” amount, add the 9 lowest “Low Estimate” amount from the 9 ranges, and divide by 9, and then use the calculated amount as the Average Lowest amount. Then</w:t>
+      </w:r>
+      <w:r>
+        <w:t xml:space="preserve"> </w:t>
+      </w:r>
+      <w:r>
+        <w:t>add the 9 high “</w:t>
+      </w:r>
+      <w:r>
+        <w:t xml:space="preserve">High Estimate” </w:t>
+      </w:r>
+      <w:r>
+        <w:t>amount from the 9 ranges, and divide by 9, and use the amount as the Average Highest amount. Then add together the calculated Average Lowest amount and the calculated Average Highest amount and divide the combined amount by 2. Then this calculated amount is displayed as the “</w:t>
+      </w:r>
+      <w:r>
+        <w:t>Shipping &amp; Relocation Setup</w:t>
+      </w:r>
+      <w:r>
+        <w:t xml:space="preserve"> (Average)” amount.</w:t>
+      </w:r>
+    </w:p>
+    <w:p/>
+    <w:p>
+      <w:r>
         <w:lastRenderedPageBreak/>
-        <w:t>Apartments</w:t>
+        <w:t>In the “</w:t>
+      </w:r>
+      <w:r>
+        <w:t>Portugal Monthly Rental Estimates</w:t>
+      </w:r>
+      <w:r>
+        <w:t xml:space="preserve">” page, for all text between the characters </w:t>
+      </w:r>
+      <w:r>
+        <w:t>**</w:t>
+      </w:r>
+      <w:r>
+        <w:t xml:space="preserve"> </w:t>
+      </w:r>
+      <w:r>
+        <w:t>**</w:t>
+      </w:r>
+      <w:r>
+        <w:t xml:space="preserve">, change the text to be bold and remove the </w:t>
+      </w:r>
+      <w:r>
+        <w:t>**</w:t>
+      </w:r>
+      <w:r>
+        <w:t xml:space="preserve"> </w:t>
+      </w:r>
+      <w:r>
+        <w:t>**</w:t>
+      </w:r>
+      <w:r>
+        <w:t xml:space="preserve"> characters.</w:t>
+      </w:r>
+    </w:p>
+    <w:p>
+      <w:r>
+        <w:t>In the “</w:t>
+      </w:r>
+      <w:r>
+        <w:t>Portugal Monthly Rental Estimates</w:t>
+      </w:r>
+      <w:r>
+        <w:t xml:space="preserve">” page, make all website </w:t>
+      </w:r>
+      <w:r>
+        <w:t>h</w:t>
+      </w:r>
+      <w:r>
+        <w:t>t</w:t>
+      </w:r>
+      <w:r>
+        <w:t>tps</w:t>
+      </w:r>
+      <w:r>
+        <w:t>:</w:t>
+      </w:r>
+      <w:r>
+        <w:t>//</w:t>
+      </w:r>
+      <w:r>
+        <w:t xml:space="preserve">www </w:t>
+      </w:r>
+      <w:r>
+        <w:t xml:space="preserve">references </w:t>
+      </w:r>
+      <w:r>
+        <w:t>into links.</w:t>
+      </w:r>
+      <w:r>
+        <w:t xml:space="preserve"> Then for all text between the characters </w:t>
+      </w:r>
+      <w:r>
+        <w:t>*</w:t>
+      </w:r>
+      <w:r>
+        <w:t xml:space="preserve"> </w:t>
+      </w:r>
+      <w:r>
+        <w:t>*</w:t>
+      </w:r>
+      <w:r>
+        <w:t xml:space="preserve">, change the text to be bold and remove the </w:t>
+      </w:r>
+      <w:r>
+        <w:t>*</w:t>
+      </w:r>
+      <w:r>
+        <w:t xml:space="preserve"> </w:t>
+      </w:r>
+      <w:r>
+        <w:t>*</w:t>
+      </w:r>
+      <w:r>
+        <w:t xml:space="preserve"> characters.</w:t>
       </w:r>
     </w:p>
     <w:p>
@@ -7591,292 +7095,66 @@
         <w:t>Estimated Target Monthly Rent</w:t>
       </w:r>
       <w:r>
+        <w:t>”, display th</w:t>
+      </w:r>
+      <w:r>
+        <w:t>e “</w:t>
+      </w:r>
+      <w:r>
+        <w:t>Medium Estimate</w:t>
+      </w:r>
+      <w:r>
+        <w:t xml:space="preserve">” on the </w:t>
+      </w:r>
+      <w:r>
+        <w:t>“</w:t>
+      </w:r>
+      <w:r>
+        <w:t>Portugal Monthly Rental Estimates</w:t>
+      </w:r>
+      <w:r>
+        <w:t xml:space="preserve">” page for the area selected </w:t>
+      </w:r>
+      <w:r>
+        <w:t xml:space="preserve">option under the heading </w:t>
+      </w:r>
+      <w:r>
+        <w:t>“</w:t>
+      </w:r>
+      <w:r>
+        <w:t>2. Target Destination Region (Portugal)</w:t>
+      </w:r>
+      <w:r>
         <w:t>”</w:t>
       </w:r>
       <w:r>
-        <w:t>, create a</w:t>
-      </w:r>
-      <w:r>
-        <w:t>n</w:t>
-      </w:r>
-      <w:r>
-        <w:t xml:space="preserve"> </w:t>
-      </w:r>
-      <w:r>
-        <w:t>e</w:t>
-      </w:r>
-      <w:r>
-        <w:t>stimated Target Monthly Rent</w:t>
-      </w:r>
-      <w:r>
-        <w:t xml:space="preserve">al </w:t>
-      </w:r>
-      <w:r>
-        <w:t xml:space="preserve">page </w:t>
-      </w:r>
-      <w:r>
-        <w:t>estimat</w:t>
-      </w:r>
-      <w:r>
-        <w:t>ing</w:t>
-      </w:r>
-      <w:r>
-        <w:t xml:space="preserve"> monthly rental prices in Portugal for Lisbon, Porto (North), and the Algarve Coast. Include property types T1/T2</w:t>
-      </w:r>
-      <w:r>
-        <w:t xml:space="preserve"> </w:t>
-      </w:r>
-      <w:r>
-        <w:t xml:space="preserve">apartments (one to two bedrooms), T3 family apartments (three bedrooms), and detached villas. Show low, medium, and high estimated monthly rents in </w:t>
-      </w:r>
-      <w:r>
-        <w:t>dollars</w:t>
-      </w:r>
-      <w:r>
-        <w:t xml:space="preserve">, presented in a clean comparison table. Note that the figures are estimates and can vary by micro-location, property condition, size, amenities, and seasonality. Allow easy updating of rental data via a JSON file or database, not hard-coded. Design the code to be modular, documented, and easy to maintain. Use a modern tech stack (e.g., HTML, CSS, JavaScript or React). Include a last updated date. Optionally support filters like furnished or unfurnished, new build versus older property, city </w:t>
-      </w:r>
-      <w:proofErr w:type="spellStart"/>
-      <w:r>
-        <w:t>centre</w:t>
-      </w:r>
-      <w:proofErr w:type="spellEnd"/>
-      <w:r>
-        <w:t xml:space="preserve"> versus suburbs, number of bathrooms, balcony or terrace, swimming pool, sea view, parking, and short-term versus long-term rental.</w:t>
-      </w:r>
-      <w:r>
-        <w:t xml:space="preserve"> Then </w:t>
-      </w:r>
-      <w:r>
-        <w:t xml:space="preserve">add a section titled 'Rental Requirements and Legal Information' for each region. For Lisbon, Porto, and the Algarve, display typical security deposit amounts (for example, one or two months' rent if that's customary. Note whether advance rent is commonly required and whether a guarantor (fiador) is typically required and what alternatives are accepted (for example, extra deposit, bank guarantee, proof of income). Include the typical legal or administrative costs involved in preparing a residential tenancy agreement, and indicate who usually pays. Add a brief overview of the standard lease process in Portugal and a disclaimer that requirements can vary with landlord or agency and may change with Portuguese law. Present this information in a clear, easy-to-read format </w:t>
-      </w:r>
-      <w:r>
-        <w:t>with</w:t>
-      </w:r>
-      <w:r>
-        <w:t xml:space="preserve"> the rent estimates.</w:t>
-      </w:r>
-      <w:r>
-        <w:t xml:space="preserve"> </w:t>
+        <w:t>, and “</w:t>
+      </w:r>
+      <w:r>
+        <w:t>4. Desired Housing Standard</w:t>
+      </w:r>
+      <w:r>
+        <w:t>”</w:t>
+      </w:r>
+      <w:r>
+        <w:t>.</w:t>
+      </w:r>
+    </w:p>
+    <w:p/>
+    <w:p>
+      <w:r>
+        <w:t>Change the text “</w:t>
+      </w:r>
+      <w:r>
+        <w:t>(includes 1 month rent and deposit)</w:t>
+      </w:r>
+      <w:r>
+        <w:t xml:space="preserve">” to </w:t>
       </w:r>
       <w:r>
         <w:t>“</w:t>
       </w:r>
       <w:r>
-        <w:t xml:space="preserve">Then make the </w:t>
-      </w:r>
-      <w:r>
-        <w:t>Estimated Target Monthly Rent</w:t>
-      </w:r>
-      <w:r>
-        <w:t>”</w:t>
-      </w:r>
-      <w:r>
-        <w:t xml:space="preserve"> </w:t>
-      </w:r>
-      <w:r>
-        <w:t>heading a link to a new internet tab which contains a report of the analysis conducted.</w:t>
-      </w:r>
-    </w:p>
-    <w:p/>
-    <w:p>
-      <w:r>
-        <w:t>To calculate the displayed “</w:t>
-      </w:r>
-      <w:r>
-        <w:t>Estimated Target Monthly Rent</w:t>
-      </w:r>
-      <w:r>
-        <w:t>” amount, add the 9 lowest “Low Estimate” amount from the 9 ranges, and divide by 9, and then use the calculated amount as the Average Lowest amount. Then</w:t>
-      </w:r>
-      <w:r>
-        <w:t xml:space="preserve"> </w:t>
-      </w:r>
-      <w:r>
-        <w:t>add the 9 high “</w:t>
-      </w:r>
-      <w:r>
-        <w:t xml:space="preserve">High Estimate” </w:t>
-      </w:r>
-      <w:r>
-        <w:t>amount from the 9 ranges, and divide by 9, and use the amount as the Average Highest amount. Then add together the calculated Average Lowest amount and the calculated Average Highest amount and divide the combined amount by 2. Then this calculated amount is displayed as the “</w:t>
-      </w:r>
-      <w:r>
-        <w:t>Shipping &amp; Relocation Setup</w:t>
-      </w:r>
-      <w:r>
-        <w:t xml:space="preserve"> (Average)” amount.</w:t>
-      </w:r>
-    </w:p>
-    <w:p/>
-    <w:p>
-      <w:r>
-        <w:t>In the “</w:t>
-      </w:r>
-      <w:r>
-        <w:t>Portugal Monthly Rental Estimates</w:t>
-      </w:r>
-      <w:r>
-        <w:t xml:space="preserve">” page, for all text between the characters </w:t>
-      </w:r>
-      <w:r>
-        <w:t>**</w:t>
-      </w:r>
-      <w:r>
-        <w:t xml:space="preserve"> </w:t>
-      </w:r>
-      <w:r>
-        <w:t>**</w:t>
-      </w:r>
-      <w:r>
-        <w:t xml:space="preserve">, change the text to be bold and remove the </w:t>
-      </w:r>
-      <w:r>
-        <w:t>**</w:t>
-      </w:r>
-      <w:r>
-        <w:t xml:space="preserve"> </w:t>
-      </w:r>
-      <w:r>
-        <w:t>**</w:t>
-      </w:r>
-      <w:r>
-        <w:t xml:space="preserve"> characters.</w:t>
-      </w:r>
-    </w:p>
-    <w:p>
-      <w:r>
-        <w:t>In the “</w:t>
-      </w:r>
-      <w:r>
-        <w:t>Portugal Monthly Rental Estimates</w:t>
-      </w:r>
-      <w:r>
-        <w:t xml:space="preserve">” page, make all website </w:t>
-      </w:r>
-      <w:r>
-        <w:t>h</w:t>
-      </w:r>
-      <w:r>
-        <w:t>t</w:t>
-      </w:r>
-      <w:r>
-        <w:t>tps</w:t>
-      </w:r>
-      <w:r>
-        <w:t>:</w:t>
-      </w:r>
-      <w:r>
-        <w:t>//</w:t>
-      </w:r>
-      <w:r>
-        <w:t xml:space="preserve">www </w:t>
-      </w:r>
-      <w:r>
-        <w:t xml:space="preserve">references </w:t>
-      </w:r>
-      <w:r>
-        <w:t>into links.</w:t>
-      </w:r>
-      <w:r>
-        <w:t xml:space="preserve"> Then for all text between the characters </w:t>
-      </w:r>
-      <w:r>
-        <w:t>*</w:t>
-      </w:r>
-      <w:r>
-        <w:t xml:space="preserve"> </w:t>
-      </w:r>
-      <w:r>
-        <w:t>*</w:t>
-      </w:r>
-      <w:r>
-        <w:t xml:space="preserve">, change the text to be bold and remove the </w:t>
-      </w:r>
-      <w:r>
-        <w:t>*</w:t>
-      </w:r>
-      <w:r>
-        <w:t xml:space="preserve"> </w:t>
-      </w:r>
-      <w:r>
-        <w:t>*</w:t>
-      </w:r>
-      <w:r>
-        <w:t xml:space="preserve"> characters.</w:t>
-      </w:r>
-    </w:p>
-    <w:p>
-      <w:r>
-        <w:lastRenderedPageBreak/>
-        <w:t xml:space="preserve">When calculating the </w:t>
-      </w:r>
-      <w:r>
-        <w:t>“</w:t>
-      </w:r>
-      <w:r>
-        <w:t>Estimated Target Monthly Rent</w:t>
-      </w:r>
-      <w:r>
-        <w:t>”, display th</w:t>
-      </w:r>
-      <w:r>
-        <w:t>e “</w:t>
-      </w:r>
-      <w:r>
-        <w:t>Medium Estimate</w:t>
-      </w:r>
-      <w:r>
-        <w:t xml:space="preserve">” on the </w:t>
-      </w:r>
-      <w:r>
-        <w:t>“</w:t>
-      </w:r>
-      <w:r>
-        <w:t>Portugal Monthly Rental Estimates</w:t>
-      </w:r>
-      <w:r>
-        <w:t xml:space="preserve">” page for the area selected </w:t>
-      </w:r>
-      <w:r>
-        <w:t xml:space="preserve">option under the heading </w:t>
-      </w:r>
-      <w:r>
-        <w:t>“</w:t>
-      </w:r>
-      <w:r>
-        <w:t>2. Target Destination Region (Portugal)</w:t>
-      </w:r>
-      <w:r>
-        <w:t>”</w:t>
-      </w:r>
-      <w:r>
-        <w:t>, and “</w:t>
-      </w:r>
-      <w:r>
-        <w:t>4. Desired Housing Standard</w:t>
-      </w:r>
-      <w:r>
-        <w:t>”</w:t>
-      </w:r>
-      <w:r>
-        <w:t>.</w:t>
-      </w:r>
-    </w:p>
-    <w:p/>
-    <w:p>
-      <w:r>
-        <w:t>Change the text “</w:t>
-      </w:r>
-      <w:r>
-        <w:t>(includes 1 month rent and deposit)</w:t>
-      </w:r>
-      <w:r>
-        <w:t xml:space="preserve">” to </w:t>
-      </w:r>
-      <w:r>
-        <w:t>“</w:t>
-      </w:r>
-      <w:r>
         <w:t>(</w:t>
       </w:r>
       <w:r>
@@ -7885,7 +7163,10 @@
     </w:p>
     <w:p>
       <w:r>
-        <w:t>On the “Renting in Portugal: Long-Term Rental Prices &amp; Expat Tenancy Guide</w:t>
+        <w:t>On the “</w:t>
+      </w:r>
+      <w:r>
+        <w:t>Renting in Portugal: Long-Term Rental Prices &amp; Expat Tenancy Guide</w:t>
       </w:r>
       <w:r>
         <w:t>” page</w:t>
@@ -7977,6 +7258,7 @@
     </w:p>
     <w:p>
       <w:r>
+        <w:lastRenderedPageBreak/>
         <w:t>In the “</w:t>
       </w:r>
       <w:r>
@@ -8033,312 +7315,250 @@
         <w:t>“</w:t>
       </w:r>
       <w:r>
+        <w:t>*Atestado de Residência*</w:t>
+      </w:r>
+      <w:r>
+        <w:t>”</w:t>
+      </w:r>
+      <w:r>
+        <w:t xml:space="preserve"> to </w:t>
+      </w:r>
+      <w:r>
+        <w:t>“</w:t>
+      </w:r>
+      <w:r>
+        <w:t>Atestado de Residência</w:t>
+      </w:r>
+      <w:r>
+        <w:t>” and make the font bold</w:t>
+      </w:r>
+      <w:r>
+        <w:t>, then change the text “</w:t>
+      </w:r>
+      <w:r>
         <w:t>*</w:t>
       </w:r>
-      <w:proofErr w:type="spellStart"/>
-      <w:r>
-        <w:t>Atestado</w:t>
-      </w:r>
-      <w:proofErr w:type="spellEnd"/>
-      <w:r>
-        <w:t xml:space="preserve"> de </w:t>
-      </w:r>
-      <w:proofErr w:type="spellStart"/>
-      <w:r>
-        <w:t>Residência</w:t>
-      </w:r>
-      <w:proofErr w:type="spellEnd"/>
+      <w:r>
+        <w:t xml:space="preserve">AIMA </w:t>
+      </w:r>
       <w:r>
         <w:t>*</w:t>
       </w:r>
       <w:r>
-        <w:t>”</w:t>
-      </w:r>
-      <w:r>
-        <w:t xml:space="preserve"> to </w:t>
+        <w:t>” to “</w:t>
+      </w:r>
+      <w:r>
+        <w:t>AIMA</w:t>
+      </w:r>
+      <w:r>
+        <w:t>” and make the font bold</w:t>
+      </w:r>
+      <w:r>
+        <w:t>. Then under the heading “</w:t>
+      </w:r>
+      <w:r>
+        <w:t>Visa &amp; NIF Requirements Details</w:t>
+      </w:r>
+      <w:r>
+        <w:t xml:space="preserve">”, </w:t>
+      </w:r>
+      <w:r>
+        <w:t>under “</w:t>
+      </w:r>
+      <w:r>
+        <w:t>1. Visa Eligibility &amp; Paths</w:t>
+      </w:r>
+      <w:r>
+        <w:t>”, the sentence “</w:t>
+      </w:r>
+      <w:r>
+        <w:t>* D8 Digital Nomad Visa: Intended for active remote workers, freelancers, or business owners. Requires proof of monthly remote wages equal to at least 4x the current Portuguese minimum wage.</w:t>
+      </w:r>
+      <w:r>
+        <w:t xml:space="preserve">” </w:t>
+      </w:r>
+      <w:r>
+        <w:t xml:space="preserve">must be </w:t>
+      </w:r>
+      <w:proofErr w:type="gramStart"/>
+      <w:r>
+        <w:t>it’s</w:t>
+      </w:r>
+      <w:proofErr w:type="gramEnd"/>
+      <w:r>
+        <w:t xml:space="preserve"> own paragra</w:t>
+      </w:r>
+      <w:r>
+        <w:t xml:space="preserve">ph, not part of the paragraph </w:t>
       </w:r>
       <w:r>
         <w:t>“</w:t>
       </w:r>
-      <w:proofErr w:type="spellStart"/>
-      <w:r>
-        <w:t>Atestado</w:t>
-      </w:r>
-      <w:proofErr w:type="spellEnd"/>
-      <w:r>
-        <w:t xml:space="preserve"> de </w:t>
-      </w:r>
-      <w:proofErr w:type="spellStart"/>
-      <w:r>
-        <w:t>Residência</w:t>
-      </w:r>
-      <w:proofErr w:type="spellEnd"/>
-      <w:r>
-        <w:t>” and make the font bold</w:t>
-      </w:r>
-      <w:r>
-        <w:t>, then change the text “</w:t>
+      <w:r>
+        <w:t xml:space="preserve">* D7 Visa: Intended for retirees, passive income earners, and self-sufficient individuals. Income must be passive (e.g. social security, rental income, investments). </w:t>
+      </w:r>
+      <w:r>
+        <w:t>*.</w:t>
+      </w:r>
+      <w:r>
+        <w:t xml:space="preserve"> </w:t>
+      </w:r>
+      <w:r>
+        <w:t>Then under the heading “</w:t>
+      </w:r>
+      <w:r>
+        <w:t>Visa &amp; NIF Requirements Details</w:t>
+      </w:r>
+      <w:r>
+        <w:t xml:space="preserve">”, under </w:t>
+      </w:r>
+      <w:r>
+        <w:t xml:space="preserve">the </w:t>
+      </w:r>
+      <w:r>
+        <w:t>heading “</w:t>
+      </w:r>
+      <w:r>
+        <w:t>2. Obtaining a NIF (Tax Number) &amp; Bank Account</w:t>
+      </w:r>
+      <w:r>
+        <w:t xml:space="preserve">”, </w:t>
+      </w:r>
+      <w:r>
+        <w:t>“</w:t>
+      </w:r>
+      <w:r>
+        <w:t xml:space="preserve">* </w:t>
+      </w:r>
+      <w:r>
+        <w:t>the sentence</w:t>
+      </w:r>
+      <w:r>
+        <w:t xml:space="preserve"> </w:t>
+      </w:r>
+      <w:r>
+        <w:t>“</w:t>
+      </w:r>
+      <w:r>
+        <w:t>* Bank Account: You must open a Portuguese bank account (such as Millennium BCP, Novo Banco, or ActivoBank) to deposit visa qualification savings. This requires a NIF, proof of US employment, and physical identification.</w:t>
+      </w:r>
+      <w:r>
+        <w:t xml:space="preserve">” must be </w:t>
+      </w:r>
+      <w:proofErr w:type="gramStart"/>
+      <w:r>
+        <w:t>it’s</w:t>
+      </w:r>
+      <w:proofErr w:type="gramEnd"/>
+      <w:r>
+        <w:t xml:space="preserve"> own paragraph, not part of the paragraph </w:t>
+      </w:r>
+      <w:r>
+        <w:t xml:space="preserve">* NIF: Your *Número de Identificação Fiscal* is required for all legal actions. US citizens can obtain it online using virtual legal proxy services (like Bordr or ReloPlan legal partners) for approx. $80–$150. </w:t>
       </w:r>
       <w:r>
         <w:t>*</w:t>
       </w:r>
       <w:r>
-        <w:t xml:space="preserve">AIMA </w:t>
+        <w:t>.</w:t>
+      </w:r>
+      <w:r>
+        <w:t xml:space="preserve"> </w:t>
+      </w:r>
+      <w:r>
+        <w:t>Then under the heading “</w:t>
+      </w:r>
+      <w:r>
+        <w:t>Visa &amp; NIF Requirements Details</w:t>
+      </w:r>
+      <w:r>
+        <w:t>”, under the heading “</w:t>
+      </w:r>
+      <w:r>
+        <w:t>3. Accommodation &amp; Insurance Requirements</w:t>
+      </w:r>
+      <w:r>
+        <w:t>”, “</w:t>
+      </w:r>
+      <w:r>
+        <w:t xml:space="preserve">* </w:t>
+      </w:r>
+      <w:r>
+        <w:t xml:space="preserve">the sentence </w:t>
+      </w:r>
+      <w:r>
+        <w:t>* Health Insurance: Must cover repatriation, emergency care, and have €0 deductibles. Coverage must begin before consulate filing</w:t>
+      </w:r>
+      <w:r>
+        <w:t>.</w:t>
+      </w:r>
+      <w:r>
+        <w:t xml:space="preserve">” must be </w:t>
+      </w:r>
+      <w:proofErr w:type="gramStart"/>
+      <w:r>
+        <w:t>it’s</w:t>
+      </w:r>
+      <w:proofErr w:type="gramEnd"/>
+      <w:r>
+        <w:t xml:space="preserve"> own paragraph, not part of the paragraph </w:t>
       </w:r>
       <w:r>
         <w:t>*</w:t>
       </w:r>
       <w:r>
-        <w:t>” to “</w:t>
-      </w:r>
-      <w:r>
-        <w:t>AIMA</w:t>
-      </w:r>
-      <w:r>
-        <w:t>” and make the font bold</w:t>
-      </w:r>
-      <w:r>
-        <w:t>. Then under the heading “</w:t>
-      </w:r>
-      <w:r>
-        <w:t xml:space="preserve">Visa &amp; NIF </w:t>
-      </w:r>
-      <w:r>
-        <w:lastRenderedPageBreak/>
-        <w:t>Requirements Details</w:t>
-      </w:r>
-      <w:r>
-        <w:t xml:space="preserve">”, </w:t>
-      </w:r>
-      <w:r>
-        <w:t>under “</w:t>
-      </w:r>
-      <w:r>
-        <w:t>1. Visa Eligibility &amp; Paths</w:t>
-      </w:r>
-      <w:r>
-        <w:t>”, the sentence “</w:t>
-      </w:r>
-      <w:r>
-        <w:t>* D8 Digital Nomad Visa: Intended for active remote workers, freelancers, or business owners. Requires proof of monthly remote wages equal to at least 4x the current Portuguese minimum wage.</w:t>
-      </w:r>
-      <w:r>
-        <w:t xml:space="preserve">” </w:t>
-      </w:r>
-      <w:r>
-        <w:t xml:space="preserve">must be </w:t>
-      </w:r>
-      <w:proofErr w:type="spellStart"/>
+        <w:t xml:space="preserve"> </w:t>
+      </w:r>
+      <w:r>
+        <w:t xml:space="preserve">Lease Length: Portuguese consulates in the US require a registered lease contract of at least 12 months or a deed showing home ownership. Shared apartments or short-term sublets are generally rejected. </w:t>
+      </w:r>
+      <w:r>
+        <w:t>*</w:t>
+      </w:r>
+      <w:r>
+        <w:t>.</w:t>
+      </w:r>
+      <w:r>
+        <w:t xml:space="preserve"> </w:t>
+      </w:r>
+      <w:r>
+        <w:t>Then under the heading “</w:t>
+      </w:r>
+      <w:r>
+        <w:t>Visa &amp; NIF Requirements Details</w:t>
+      </w:r>
+      <w:r>
+        <w:t>”, under the heading “</w:t>
+      </w:r>
+      <w:r>
+        <w:t>4. Legal Counsel &amp; Processing Costs</w:t>
+      </w:r>
+      <w:r>
+        <w:t>”, “</w:t>
+      </w:r>
+      <w:r>
+        <w:t xml:space="preserve">* </w:t>
+      </w:r>
+      <w:r>
+        <w:t xml:space="preserve">the sentence </w:t>
+      </w:r>
+      <w:r>
+        <w:t xml:space="preserve">* </w:t>
+      </w:r>
+      <w:r>
+        <w:t>* Processing Times: Consulate phase: 60 to 90 days. Biometrics bi-annual scheduling phase: 60 to 120 days</w:t>
+      </w:r>
+      <w:r>
+        <w:t>.</w:t>
+      </w:r>
+      <w:r>
+        <w:t xml:space="preserve">” must be </w:t>
+      </w:r>
+      <w:proofErr w:type="gramStart"/>
       <w:r>
         <w:t>it’s</w:t>
       </w:r>
-      <w:proofErr w:type="spellEnd"/>
-      <w:r>
-        <w:t xml:space="preserve"> own paragra</w:t>
-      </w:r>
-      <w:r>
-        <w:t xml:space="preserve">ph, not part of the paragraph </w:t>
-      </w:r>
-      <w:r>
-        <w:t>“</w:t>
-      </w:r>
-      <w:r>
-        <w:t xml:space="preserve">* D7 Visa: Intended for retirees, passive income earners, and self-sufficient individuals. Income must be passive (e.g. social security, rental income, investments). </w:t>
-      </w:r>
-      <w:r>
-        <w:t>*.</w:t>
-      </w:r>
-      <w:r>
-        <w:t xml:space="preserve"> </w:t>
-      </w:r>
-      <w:r>
-        <w:t>Then under the heading “</w:t>
-      </w:r>
-      <w:r>
-        <w:t>Visa &amp; NIF Requirements Details</w:t>
-      </w:r>
-      <w:r>
-        <w:t xml:space="preserve">”, under </w:t>
-      </w:r>
-      <w:r>
-        <w:t xml:space="preserve">the </w:t>
-      </w:r>
-      <w:r>
-        <w:t>heading “</w:t>
-      </w:r>
-      <w:r>
-        <w:t>2. Obtaining a NIF (Tax Number) &amp; Bank Account</w:t>
-      </w:r>
-      <w:r>
-        <w:t xml:space="preserve">”, </w:t>
-      </w:r>
-      <w:r>
-        <w:t>“</w:t>
-      </w:r>
-      <w:r>
-        <w:t xml:space="preserve">* </w:t>
-      </w:r>
-      <w:r>
-        <w:t>the sentence</w:t>
-      </w:r>
-      <w:r>
-        <w:t xml:space="preserve"> </w:t>
-      </w:r>
-      <w:r>
-        <w:t>“</w:t>
-      </w:r>
-      <w:r>
-        <w:t xml:space="preserve">* Bank Account: You must open a Portuguese bank account (such as Millennium BCP, Novo Banco, or </w:t>
-      </w:r>
-      <w:proofErr w:type="spellStart"/>
-      <w:r>
-        <w:t>ActivoBank</w:t>
-      </w:r>
-      <w:proofErr w:type="spellEnd"/>
-      <w:r>
-        <w:t>) to deposit visa qualification savings. This requires a NIF, proof of US employment, and physical identification.</w:t>
-      </w:r>
-      <w:r>
-        <w:t xml:space="preserve">” must be </w:t>
-      </w:r>
-      <w:proofErr w:type="spellStart"/>
-      <w:r>
-        <w:t>it’s</w:t>
-      </w:r>
-      <w:proofErr w:type="spellEnd"/>
-      <w:r>
-        <w:t xml:space="preserve"> own paragraph, not part of the paragraph </w:t>
-      </w:r>
-      <w:r>
-        <w:t>* NIF: Your *</w:t>
-      </w:r>
-      <w:proofErr w:type="spellStart"/>
-      <w:r>
-        <w:t>Número</w:t>
-      </w:r>
-      <w:proofErr w:type="spellEnd"/>
-      <w:r>
-        <w:t xml:space="preserve"> de </w:t>
-      </w:r>
-      <w:proofErr w:type="spellStart"/>
-      <w:r>
-        <w:t>Identificação</w:t>
-      </w:r>
-      <w:proofErr w:type="spellEnd"/>
-      <w:r>
-        <w:t xml:space="preserve"> Fiscal* is required for all legal actions. US citizens can obtain it online using virtual legal proxy services (like Bordr or </w:t>
-      </w:r>
-      <w:proofErr w:type="spellStart"/>
-      <w:r>
-        <w:t>ReloPlan</w:t>
-      </w:r>
-      <w:proofErr w:type="spellEnd"/>
-      <w:r>
-        <w:t xml:space="preserve"> legal partners) for approx. $80–$150. </w:t>
-      </w:r>
-      <w:r>
-        <w:t>*</w:t>
-      </w:r>
-      <w:r>
-        <w:t>.</w:t>
-      </w:r>
-      <w:r>
-        <w:t xml:space="preserve"> </w:t>
-      </w:r>
-      <w:r>
-        <w:t>Then under the heading “</w:t>
-      </w:r>
-      <w:r>
-        <w:t>Visa &amp; NIF Requirements Details</w:t>
-      </w:r>
-      <w:r>
-        <w:t>”, under the heading “</w:t>
-      </w:r>
-      <w:r>
-        <w:t>3. Accommodation &amp; Insurance Requirements</w:t>
-      </w:r>
-      <w:r>
-        <w:t>”, “</w:t>
-      </w:r>
-      <w:r>
-        <w:t xml:space="preserve">* </w:t>
-      </w:r>
-      <w:r>
-        <w:t xml:space="preserve">the sentence </w:t>
-      </w:r>
-      <w:r>
-        <w:t>* Health Insurance: Must cover repatriation, emergency care, and have €0 deductibles. Coverage must begin before consulate filing</w:t>
-      </w:r>
-      <w:r>
-        <w:t>.</w:t>
-      </w:r>
-      <w:r>
-        <w:t xml:space="preserve">” must be </w:t>
-      </w:r>
-      <w:proofErr w:type="spellStart"/>
-      <w:r>
-        <w:t>it’s</w:t>
-      </w:r>
-      <w:proofErr w:type="spellEnd"/>
-      <w:r>
-        <w:t xml:space="preserve"> own paragraph, not part of the paragraph </w:t>
-      </w:r>
-      <w:r>
-        <w:t>*</w:t>
-      </w:r>
-      <w:r>
-        <w:t xml:space="preserve"> </w:t>
-      </w:r>
-      <w:r>
-        <w:t xml:space="preserve">Lease Length: Portuguese consulates in the US require a registered lease contract of at least 12 months or a deed showing home ownership. Shared apartments or short-term sublets are generally rejected. </w:t>
-      </w:r>
-      <w:r>
-        <w:t>*</w:t>
-      </w:r>
-      <w:r>
-        <w:t>.</w:t>
-      </w:r>
-      <w:r>
-        <w:t xml:space="preserve"> </w:t>
-      </w:r>
-      <w:r>
-        <w:t>Then under the heading “</w:t>
-      </w:r>
-      <w:r>
-        <w:t>Visa &amp; NIF Requirements Details</w:t>
-      </w:r>
-      <w:r>
-        <w:t>”, under the heading “</w:t>
-      </w:r>
-      <w:r>
-        <w:t>4. Legal Counsel &amp; Processing Costs</w:t>
-      </w:r>
-      <w:r>
-        <w:t>”, “</w:t>
-      </w:r>
-      <w:r>
-        <w:t xml:space="preserve">* </w:t>
-      </w:r>
-      <w:r>
-        <w:t xml:space="preserve">the sentence </w:t>
-      </w:r>
-      <w:r>
-        <w:t xml:space="preserve">* </w:t>
-      </w:r>
-      <w:r>
-        <w:t>* Processing Times: Consulate phase: 60 to 90 days. Biometrics bi-annual scheduling phase: 60 to 120 days</w:t>
-      </w:r>
-      <w:r>
-        <w:t>.</w:t>
-      </w:r>
-      <w:r>
-        <w:t xml:space="preserve">” must be </w:t>
-      </w:r>
-      <w:proofErr w:type="spellStart"/>
-      <w:r>
-        <w:t>it’s</w:t>
-      </w:r>
-      <w:proofErr w:type="spellEnd"/>
+      <w:proofErr w:type="gramEnd"/>
       <w:r>
         <w:t xml:space="preserve"> own paragraph, not part of the paragraph </w:t>
       </w:r>
@@ -8438,15 +7658,7 @@
         <w:t>*</w:t>
       </w:r>
       <w:r>
-        <w:t xml:space="preserve">Junta de </w:t>
-      </w:r>
-      <w:proofErr w:type="spellStart"/>
-      <w:r>
-        <w:t>Freguesia</w:t>
-      </w:r>
-      <w:proofErr w:type="spellEnd"/>
-      <w:r>
-        <w:t xml:space="preserve"> </w:t>
+        <w:t xml:space="preserve">Junta de Freguesia </w:t>
       </w:r>
       <w:r>
         <w:t>*</w:t>
@@ -8455,13 +7667,8 @@
         <w:t>” to “</w:t>
       </w:r>
       <w:r>
-        <w:t xml:space="preserve">Junta de </w:t>
-      </w:r>
-      <w:proofErr w:type="spellStart"/>
-      <w:r>
-        <w:t>Freguesia</w:t>
-      </w:r>
-      <w:proofErr w:type="spellEnd"/>
+        <w:t>Junta de Freguesia</w:t>
+      </w:r>
       <w:r>
         <w:t>” and make the font bold</w:t>
       </w:r>
@@ -8480,21 +7687,8 @@
       <w:r>
         <w:t>*</w:t>
       </w:r>
-      <w:proofErr w:type="spellStart"/>
-      <w:r>
-        <w:t>Número</w:t>
-      </w:r>
-      <w:proofErr w:type="spellEnd"/>
-      <w:r>
-        <w:t xml:space="preserve"> de </w:t>
-      </w:r>
-      <w:proofErr w:type="spellStart"/>
-      <w:r>
-        <w:t>Identificação</w:t>
-      </w:r>
-      <w:proofErr w:type="spellEnd"/>
-      <w:r>
-        <w:t xml:space="preserve"> Fiscal</w:t>
+      <w:r>
+        <w:t>Número de Identificação Fiscal</w:t>
       </w:r>
       <w:r>
         <w:t>*</w:t>
@@ -8502,21 +7696,8 @@
       <w:r>
         <w:t>” to “</w:t>
       </w:r>
-      <w:proofErr w:type="spellStart"/>
-      <w:r>
-        <w:t>Número</w:t>
-      </w:r>
-      <w:proofErr w:type="spellEnd"/>
-      <w:r>
-        <w:t xml:space="preserve"> de </w:t>
-      </w:r>
-      <w:proofErr w:type="spellStart"/>
-      <w:r>
-        <w:t>Identificação</w:t>
-      </w:r>
-      <w:proofErr w:type="spellEnd"/>
-      <w:r>
-        <w:t xml:space="preserve"> Fiscal</w:t>
+      <w:r>
+        <w:t>Número de Identificação Fiscal</w:t>
       </w:r>
       <w:r>
         <w:t>” and make the font bold.</w:t>
@@ -8537,7 +7718,11 @@
         <w:t>”, and “</w:t>
       </w:r>
       <w:r>
-        <w:t>3. Accommodation &amp; Insurance Requirements</w:t>
+        <w:t xml:space="preserve">3. </w:t>
+      </w:r>
+      <w:r>
+        <w:lastRenderedPageBreak/>
+        <w:t>Accommodation &amp; Insurance Requirements</w:t>
       </w:r>
       <w:r>
         <w:t>”, and “</w:t>
@@ -8829,7 +8014,13 @@
     <w:p/>
     <w:p>
       <w:r>
-        <w:t>Then, in the section “Visa &amp; NIF Requirements Details”</w:t>
+        <w:t>Then, in the section “</w:t>
+      </w:r>
+      <w:r>
+        <w:t>Visa &amp; NIF Requirements Details</w:t>
+      </w:r>
+      <w:r>
+        <w:t>”</w:t>
       </w:r>
       <w:r>
         <w:t>, under the heading “</w:t>
@@ -8854,6 +8045,7 @@
         <w:ind w:left="360"/>
       </w:pPr>
       <w:r>
+        <w:lastRenderedPageBreak/>
         <w:t xml:space="preserve">D2 Visa (Entrepreneur &amp; Freelancer): </w:t>
       </w:r>
       <w:r>
@@ -8908,7 +8100,6 @@
         <w:ind w:left="720"/>
       </w:pPr>
       <w:r>
-        <w:lastRenderedPageBreak/>
         <w:t>D3: Highly qualified professional visa for specialized roles</w:t>
       </w:r>
       <w:r>
@@ -8981,7 +8172,13 @@
         <w:t>, t</w:t>
       </w:r>
       <w:r>
-        <w:t xml:space="preserve">hen, in the section “Document Dossier Checklist”, </w:t>
+        <w:t>hen, in the section “</w:t>
+      </w:r>
+      <w:r>
+        <w:t>Document Dossier Checklist</w:t>
+      </w:r>
+      <w:r>
+        <w:t xml:space="preserve">”, </w:t>
       </w:r>
       <w:r>
         <w:t xml:space="preserve">the </w:t>
@@ -9123,13 +8320,16 @@
         <w:t xml:space="preserve"> requirements</w:t>
       </w:r>
       <w:r>
-        <w:t>, and boarding including language, curriculum, fees, admissions, and pros and cons. Include education levels from kindergarten through universities, entry ages, durations, and qualifications received. Detail residency and enrollment requirements, visa considerations, registration timelines, and zoning. Provide document checklists including translations and apostilles where needed. Outline costs, tuition, uh, registration fees, uniforms, books, and estimated annual totals. Add interactive features like cost calculators and school comparison filters. And add official resources like the Portuguese Ministry of Education and an important disclaimer about rules changing.</w:t>
+        <w:t xml:space="preserve">, and boarding including language, curriculum, fees, admissions, and pros and cons. Include education levels from kindergarten through universities, entry ages, durations, and qualifications received. Detail residency and enrollment requirements, visa considerations, registration timelines, and zoning. Provide document checklists including translations and apostilles where needed. Outline costs, tuition, uh, </w:t>
+      </w:r>
+      <w:r>
+        <w:lastRenderedPageBreak/>
+        <w:t>registration fees, uniforms, books, and estimated annual totals. Add interactive features like cost calculators and school comparison filters. And add official resources like the Portuguese Ministry of Education and an important disclaimer about rules changing.</w:t>
       </w:r>
     </w:p>
     <w:p/>
     <w:p>
       <w:r>
-        <w:lastRenderedPageBreak/>
         <w:t>In the “</w:t>
       </w:r>
       <w:r>
@@ -9241,15 +8441,7 @@
         <w:t xml:space="preserve"> under the heading “</w:t>
       </w:r>
       <w:r>
-        <w:t>2. Private Schools (</w:t>
-      </w:r>
-      <w:proofErr w:type="spellStart"/>
-      <w:r>
-        <w:t>Escolas</w:t>
-      </w:r>
-      <w:proofErr w:type="spellEnd"/>
-      <w:r>
-        <w:t xml:space="preserve"> Privadas)</w:t>
+        <w:t>2. Private Schools (Escolas Privadas)</w:t>
       </w:r>
       <w:r>
         <w:t xml:space="preserve">”, </w:t>
@@ -9365,15 +8557,7 @@
         <w:t>“Education (1 child at a Private School)”, then to calculate the amount to display, under the heading “</w:t>
       </w:r>
       <w:r>
-        <w:t>2. Private Schools (</w:t>
-      </w:r>
-      <w:proofErr w:type="spellStart"/>
-      <w:r>
-        <w:t>Escolas</w:t>
-      </w:r>
-      <w:proofErr w:type="spellEnd"/>
-      <w:r>
-        <w:t xml:space="preserve"> Privadas)</w:t>
+        <w:t>2. Private Schools (Escolas Privadas)</w:t>
       </w:r>
       <w:r>
         <w:t>”, add the upper and lower amounts displayed in the paragraph “</w:t>
@@ -9400,28 +8584,53 @@
         <w:t xml:space="preserve"> displayed</w:t>
       </w:r>
       <w:r>
-        <w:t xml:space="preserve"> add “/</w:t>
-      </w:r>
-      <w:proofErr w:type="spellStart"/>
-      <w:r>
-        <w:t>mo</w:t>
-      </w:r>
-      <w:proofErr w:type="spellEnd"/>
+        <w:t xml:space="preserve"> add “/mo”</w:t>
+      </w:r>
+      <w:r>
+        <w:t xml:space="preserve"> </w:t>
+      </w:r>
+      <w:r>
+        <w:t xml:space="preserve">and add </w:t>
+      </w:r>
+      <w:r>
+        <w:t xml:space="preserve">the amount </w:t>
+      </w:r>
+      <w:r>
+        <w:t xml:space="preserve">to the monthly amount. </w:t>
+      </w:r>
+    </w:p>
+    <w:p/>
+    <w:p>
+      <w:r>
+        <w:t>In the “</w:t>
+      </w:r>
+      <w:r>
+        <w:t>Portuguese Education System &amp; Schooling Guide</w:t>
+      </w:r>
+      <w:r>
+        <w:t xml:space="preserve">” page, centralize the text </w:t>
+      </w:r>
+      <w:r>
+        <w:t>“</w:t>
+      </w:r>
+      <w:r>
+        <w:t>Portuguese Education System &amp; Schooling Guide</w:t>
+      </w:r>
+      <w:r>
+        <w:t>, “</w:t>
+      </w:r>
+      <w:r>
+        <w:t>A complete logistical blueprint mapping school types, regional hubs (Lisbon, Porto, Algarve), curriculum models, and enrolment requirements for US expatriates</w:t>
+      </w:r>
+      <w:r>
+        <w:t>”, and “</w:t>
+      </w:r>
+      <w:r>
+        <w:t>Last Updated: August 10, 2026</w:t>
+      </w:r>
       <w:r>
         <w:t>”</w:t>
       </w:r>
-      <w:r>
-        <w:t xml:space="preserve"> </w:t>
-      </w:r>
-      <w:r>
-        <w:t xml:space="preserve">and add </w:t>
-      </w:r>
-      <w:r>
-        <w:t xml:space="preserve">the amount </w:t>
-      </w:r>
-      <w:r>
-        <w:t xml:space="preserve">to the monthly amount. </w:t>
-      </w:r>
     </w:p>
     <w:p/>
     <w:p>
@@ -9432,180 +8641,156 @@
         <w:t>Portuguese Education System &amp; Schooling Guide</w:t>
       </w:r>
       <w:r>
-        <w:t xml:space="preserve">” page, centralize the text </w:t>
+        <w:t>” page, under the heading “</w:t>
+      </w:r>
+      <w:r>
+        <w:t>Official Resources &amp; Disclaimer</w:t>
+      </w:r>
+      <w:r>
+        <w:t xml:space="preserve">” change the link </w:t>
+      </w:r>
+      <w:r>
+        <w:t>from</w:t>
+      </w:r>
+      <w:r>
+        <w:t xml:space="preserve"> the paragraph “</w:t>
+      </w:r>
+      <w:r>
+        <w:t>Portal das Matrículas (Enrolment Portal):</w:t>
+      </w:r>
+      <w:r>
+        <w:t>” from “</w:t>
+      </w:r>
+      <w:r>
+        <w:t xml:space="preserve">https://portaldasmatriculas.apambiente.pt </w:t>
+      </w:r>
+      <w:proofErr w:type="gramStart"/>
+      <w:r>
+        <w:t>“ to</w:t>
+      </w:r>
+      <w:proofErr w:type="gramEnd"/>
+      <w:r>
+        <w:t xml:space="preserve"> “</w:t>
+      </w:r>
+      <w:r>
+        <w:t>https://www.bemvindo.app/life/enrolling-child-school</w:t>
+      </w:r>
+      <w:r>
+        <w:t>”.</w:t>
+      </w:r>
+    </w:p>
+    <w:p/>
+    <w:p>
+      <w:r>
+        <w:t>On the primary page under the section “</w:t>
+      </w:r>
+      <w:r>
+        <w:t>Move Budget Breakdown</w:t>
+      </w:r>
+      <w:r>
+        <w:t>”, calculate the “</w:t>
+      </w:r>
+      <w:r>
+        <w:t>Education (1 child at a Private School)</w:t>
+      </w:r>
+      <w:r>
+        <w:t>” as follows</w:t>
+      </w:r>
+      <w:r>
+        <w:t>:</w:t>
+      </w:r>
+    </w:p>
+    <w:p>
+      <w:r>
+        <w:t>On the “</w:t>
+      </w:r>
+      <w:r>
+        <w:t>Portuguese Education System &amp; Schooling Guide</w:t>
+      </w:r>
+      <w:r>
+        <w:t xml:space="preserve">” page, under the </w:t>
+      </w:r>
+      <w:r>
+        <w:t>section “</w:t>
+      </w:r>
+      <w:r>
+        <w:t>School Directory &amp; Regional Comparisons</w:t>
+      </w:r>
+      <w:r>
+        <w:t>”, for all schools listed that do not include B</w:t>
+      </w:r>
+      <w:r>
+        <w:t>o</w:t>
+      </w:r>
+      <w:r>
+        <w:t>a</w:t>
+      </w:r>
+      <w:r>
+        <w:t>rd</w:t>
+      </w:r>
+      <w:r>
+        <w:t>ing</w:t>
+      </w:r>
+      <w:r>
+        <w:t xml:space="preserve">, add all the lower </w:t>
       </w:r>
       <w:r>
         <w:t>“</w:t>
       </w:r>
       <w:r>
-        <w:t>Portuguese Education System &amp; Schooling Guide</w:t>
-      </w:r>
-      <w:r>
-        <w:t>, “</w:t>
-      </w:r>
-      <w:r>
-        <w:t>A complete logistical blueprint mapping school types, regional hubs (Lisbon, Porto, Algarve), curriculum models, and enrolment requirements for US expatriates</w:t>
-      </w:r>
-      <w:r>
-        <w:t>”, and “</w:t>
-      </w:r>
-      <w:r>
-        <w:t>Last Updated: August 10, 2026</w:t>
-      </w:r>
-      <w:r>
-        <w:t>”</w:t>
+        <w:t>Estimated Annual Fees:</w:t>
+      </w:r>
+      <w:r>
+        <w:t>” and the higher “</w:t>
+      </w:r>
+      <w:r>
+        <w:t>Estimated Annual Fees:</w:t>
+      </w:r>
+      <w:r>
+        <w:t xml:space="preserve">”, then divide </w:t>
+      </w:r>
+      <w:r>
+        <w:t>the solution by the number of amounts added together</w:t>
+      </w:r>
+      <w:r>
+        <w:t>,</w:t>
+      </w:r>
+      <w:r>
+        <w:t xml:space="preserve"> then divide that amount by 12.</w:t>
       </w:r>
     </w:p>
     <w:p/>
     <w:p>
       <w:r>
-        <w:t>In the “</w:t>
-      </w:r>
-      <w:r>
-        <w:t>Portuguese Education System &amp; Schooling Guide</w:t>
-      </w:r>
-      <w:r>
-        <w:t>” page, under the heading “</w:t>
-      </w:r>
-      <w:r>
-        <w:t>Official Resources &amp; Disclaimer</w:t>
-      </w:r>
-      <w:r>
-        <w:t xml:space="preserve">” change the link </w:t>
-      </w:r>
-      <w:r>
-        <w:t>from</w:t>
-      </w:r>
-      <w:r>
-        <w:t xml:space="preserve"> the paragraph “</w:t>
-      </w:r>
-      <w:r>
-        <w:t xml:space="preserve">Portal das </w:t>
-      </w:r>
-      <w:proofErr w:type="spellStart"/>
-      <w:r>
-        <w:t>Matrículas</w:t>
-      </w:r>
-      <w:proofErr w:type="spellEnd"/>
-      <w:r>
-        <w:t xml:space="preserve"> (Enrolment Portal):</w:t>
-      </w:r>
-      <w:r>
-        <w:t>” from “</w:t>
-      </w:r>
-      <w:r>
-        <w:t xml:space="preserve">https://portaldasmatriculas.apambiente.pt </w:t>
-      </w:r>
-      <w:r>
-        <w:t>“ to “</w:t>
-      </w:r>
-      <w:r>
-        <w:t>https://www.bemvindo.app/life/enrolling-child-school</w:t>
-      </w:r>
-      <w:r>
-        <w:t>”.</w:t>
-      </w:r>
-    </w:p>
-    <w:p/>
-    <w:p>
-      <w:r>
         <w:t>On the primary page under the section “</w:t>
       </w:r>
       <w:r>
         <w:t>Move Budget Breakdown</w:t>
       </w:r>
       <w:r>
-        <w:t>”, calculate the “</w:t>
-      </w:r>
+        <w:t xml:space="preserve">”, from the text </w:t>
+      </w:r>
+      <w:proofErr w:type="gramStart"/>
+      <w:r>
+        <w:t>“ “</w:t>
+      </w:r>
+      <w:proofErr w:type="gramEnd"/>
       <w:r>
         <w:t>Education (1 child at a Private School)</w:t>
       </w:r>
       <w:r>
-        <w:t>” as follows</w:t>
-      </w:r>
-      <w:r>
-        <w:t>:</w:t>
-      </w:r>
-    </w:p>
-    <w:p>
-      <w:r>
-        <w:lastRenderedPageBreak/>
-        <w:t>On the “</w:t>
-      </w:r>
-      <w:r>
-        <w:t>Portuguese Education System &amp; Schooling Guide</w:t>
-      </w:r>
-      <w:r>
-        <w:t xml:space="preserve">” page, under the </w:t>
-      </w:r>
-      <w:r>
-        <w:t>section “</w:t>
-      </w:r>
-      <w:r>
-        <w:t>School Directory &amp; Regional Comparisons</w:t>
-      </w:r>
-      <w:r>
-        <w:t>”, for all schools listed that do not include B</w:t>
-      </w:r>
-      <w:r>
-        <w:t>o</w:t>
-      </w:r>
-      <w:r>
-        <w:t>a</w:t>
-      </w:r>
-      <w:r>
-        <w:t>rd</w:t>
-      </w:r>
-      <w:r>
-        <w:t>ing</w:t>
-      </w:r>
-      <w:r>
-        <w:t xml:space="preserve">, add all the lower </w:t>
-      </w:r>
-      <w:r>
-        <w:t>“</w:t>
-      </w:r>
-      <w:r>
-        <w:t>Estimated Annual Fees:</w:t>
-      </w:r>
-      <w:r>
-        <w:t>” and the higher “</w:t>
-      </w:r>
-      <w:r>
-        <w:t>Estimated Annual Fees:</w:t>
-      </w:r>
-      <w:r>
-        <w:t xml:space="preserve">”, then divide </w:t>
-      </w:r>
-      <w:r>
-        <w:t>the solution by the number of amounts added together</w:t>
-      </w:r>
-      <w:r>
-        <w:t>,</w:t>
-      </w:r>
-      <w:r>
-        <w:t xml:space="preserve"> then divide that amount by 12.</w:t>
-      </w:r>
-    </w:p>
-    <w:p/>
-    <w:p>
-      <w:r>
-        <w:t>On the primary page under the section “</w:t>
-      </w:r>
-      <w:r>
-        <w:t>Move Budget Breakdown</w:t>
-      </w:r>
-      <w:r>
-        <w:t>”, from the text “ “</w:t>
-      </w:r>
-      <w:r>
-        <w:t>Education (1 child at a Private School)</w:t>
-      </w:r>
-      <w:r>
-        <w:t xml:space="preserve">” remove the text “ </w:t>
-      </w:r>
-      <w:r>
-        <w:t>(1 child at a Private School</w:t>
+        <w:t xml:space="preserve">” remove the text </w:t>
+      </w:r>
+      <w:proofErr w:type="gramStart"/>
+      <w:r>
+        <w:t xml:space="preserve">“ </w:t>
+      </w:r>
+      <w:r>
+        <w:t>(</w:t>
+      </w:r>
+      <w:proofErr w:type="gramEnd"/>
+      <w:r>
+        <w:t>1 child at a Private School</w:t>
       </w:r>
       <w:r>
         <w:t xml:space="preserve">)” and then add below the </w:t>
@@ -9722,13 +8907,21 @@
         <w:t>”</w:t>
       </w:r>
       <w:r>
-        <w:t xml:space="preserve"> to “</w:t>
+        <w:t xml:space="preserve"> to </w:t>
+      </w:r>
+      <w:proofErr w:type="gramStart"/>
+      <w:r>
+        <w:t>“</w:t>
       </w:r>
       <w:r>
         <w:t xml:space="preserve"> </w:t>
       </w:r>
       <w:r>
-        <w:t>Animal and Plant Health Inspection Service (APHIS)</w:t>
+        <w:t>Animal</w:t>
+      </w:r>
+      <w:proofErr w:type="gramEnd"/>
+      <w:r>
+        <w:t xml:space="preserve"> and Plant Health Inspection Service (APHIS)</w:t>
       </w:r>
       <w:r>
         <w:t>”</w:t>
@@ -9930,7 +9123,11 @@
         <w:t xml:space="preserve">. </w:t>
       </w:r>
       <w:r>
-        <w:t>Then, in the “</w:t>
+        <w:t xml:space="preserve">Then, in the </w:t>
+      </w:r>
+      <w:r>
+        <w:lastRenderedPageBreak/>
+        <w:t>“</w:t>
       </w:r>
       <w:r>
         <w:t>Relocation Costs: DIY vs. Pet Transport Services</w:t>
@@ -9959,7 +9156,6 @@
     <w:p/>
     <w:p>
       <w:r>
-        <w:lastRenderedPageBreak/>
         <w:t>In the “</w:t>
       </w:r>
       <w:r>
@@ -10222,8 +9418,13 @@
       <w:r>
         <w:t xml:space="preserve">? </w:t>
       </w:r>
-      <w:r>
-        <w:t>A complete compliance guide for US citizens moving dogs and cats to Portugal, outlining microchips, veterinary certificates, timelines, and costs.</w:t>
+      <w:proofErr w:type="gramStart"/>
+      <w:r>
+        <w:t>A</w:t>
+      </w:r>
+      <w:proofErr w:type="gramEnd"/>
+      <w:r>
+        <w:t xml:space="preserve"> complete compliance guide for US citizens moving dogs and cats to Portugal, outlining microchips, veterinary certificates, timelines, and costs.</w:t>
       </w:r>
       <w:r>
         <w:t>”</w:t>
@@ -10252,21 +9453,17 @@
         <w:t>, and I am looking for</w:t>
       </w:r>
       <w:r>
-        <w:t xml:space="preserve">. keyword research, long-tail keywords, question-based queries, and the search intent behind them. For </w:t>
+        <w:t xml:space="preserve">. keyword research, long-tail keywords, question-based queries, and the search intent </w:t>
+      </w:r>
+      <w:r>
+        <w:lastRenderedPageBreak/>
+        <w:t xml:space="preserve">behind them. For </w:t>
       </w:r>
       <w:r>
         <w:t>site</w:t>
       </w:r>
       <w:r>
-        <w:t xml:space="preserve"> </w:t>
-      </w:r>
-      <w:proofErr w:type="spellStart"/>
-      <w:r>
-        <w:t>site</w:t>
-      </w:r>
-      <w:proofErr w:type="spellEnd"/>
-      <w:r>
-        <w:t xml:space="preserve">, focus on high-intent terms like "moving from USA to Portugal", "Portugal D7 visa", "international movers USA to Portugal", "pet relocation to Portugal", or "health insurance for Portugal visa". </w:t>
+        <w:t xml:space="preserve"> site, focus on high-intent terms like "moving from USA to Portugal", "Portugal D7 visa", "international movers USA to Portugal", "pet relocation to Portugal", or "health insurance for Portugal visa". </w:t>
       </w:r>
       <w:r>
         <w:t>Can you al</w:t>
@@ -10275,11 +9472,7 @@
         <w:t>so look at</w:t>
       </w:r>
       <w:r>
-        <w:t xml:space="preserve"> on-page SEO items too, such as meta titles under 60 characters, meta descriptions under 160, H1 to </w:t>
-      </w:r>
-      <w:r>
-        <w:lastRenderedPageBreak/>
-        <w:t>H3 heading ideas, internal linking suggestions, and content ideas that are likely to rank</w:t>
+        <w:t xml:space="preserve"> on-page SEO items too, such as meta titles under 60 characters, meta descriptions under 160, H1 to H3 heading ideas, internal linking suggestions, and content ideas that are likely to rank</w:t>
       </w:r>
       <w:r>
         <w:t xml:space="preserve">, as well as </w:t>

</xml_diff>